<commit_message>
JS - Arrays and Problems
</commit_message>
<xml_diff>
--- a/Java Scripts.docx
+++ b/Java Scripts.docx
@@ -11960,6 +11960,12 @@
         <w:rPr>
           <w:lang w:val="en-US"/>
         </w:rPr>
+        <w:br/>
+      </w:r>
+      <w:r>
+        <w:rPr>
+          <w:lang w:val="en-US"/>
+        </w:rPr>
         <w:drawing>
           <wp:inline distT="0" distB="0" distL="0" distR="0" wp14:anchorId="070F3A73" wp14:editId="19021B2D">
             <wp:extent cx="5793424" cy="7795695"/>
@@ -12005,6 +12011,35 @@
           </wp:inline>
         </w:drawing>
       </w:r>
+    </w:p>
+    <w:p>
+      <w:pPr>
+        <w:ind w:left="-567" w:firstLine="567"/>
+        <w:rPr>
+          <w:lang w:val="en-US"/>
+        </w:rPr>
+      </w:pPr>
+    </w:p>
+    <w:p>
+      <w:pPr>
+        <w:pStyle w:val="p1"/>
+      </w:pPr>
+      <w:r>
+        <w:rPr>
+          <w:b/>
+          <w:bCs/>
+        </w:rPr>
+        <w:lastRenderedPageBreak/>
+        <w:t>In JavaScript, we can change a value at a particular index in an array, but we cannot directly change a character at a particular index in a string because strings are immutable.</w:t>
+      </w:r>
+    </w:p>
+    <w:p>
+      <w:pPr>
+        <w:ind w:left="-567" w:firstLine="567"/>
+        <w:rPr>
+          <w:lang w:val="en-US"/>
+        </w:rPr>
+      </w:pPr>
     </w:p>
     <w:sectPr>
       <w:pgSz w:w="11906" w:h="16838"/>

</xml_diff>

<commit_message>
JS - Array methods
</commit_message>
<xml_diff>
--- a/Java Scripts.docx
+++ b/Java Scripts.docx
@@ -12031,6 +12031,123 @@
         </w:rPr>
         <w:lastRenderedPageBreak/>
         <w:t>In JavaScript, we can change a value at a particular index in an array, but we cannot directly change a character at a particular index in a string because strings are immutable.</w:t>
+      </w:r>
+    </w:p>
+    <w:p>
+      <w:pPr>
+        <w:pStyle w:val="Heading2"/>
+      </w:pPr>
+      <w:r>
+        <w:rPr>
+          <w:lang w:val="en-US"/>
+        </w:rPr>
+        <w:t>Array methods --</w:t>
+      </w:r>
+      <w:r>
+        <w:rPr>
+          <w:lang w:val="en-US"/>
+        </w:rPr>
+        <w:br/>
+      </w:r>
+      <w:r>
+        <w:rPr>
+          <w:lang w:val="en-US"/>
+        </w:rPr>
+        <w:br/>
+      </w:r>
+      <w:r>
+        <w:rPr>
+          <w:rStyle w:val="HTMLCode"/>
+          <w:rFonts w:eastAsiaTheme="majorEastAsia"/>
+        </w:rPr>
+        <w:t>slice()</w:t>
+      </w:r>
+    </w:p>
+    <w:p>
+      <w:pPr>
+        <w:pStyle w:val="Heading2"/>
+        <w:spacing w:before="0" w:after="0"/>
+      </w:pPr>
+      <w:r>
+        <w:rPr>
+          <w:rStyle w:val="s1"/>
+        </w:rPr>
+        <w:t xml:space="preserve">vs </w:t>
+      </w:r>
+    </w:p>
+    <w:p>
+      <w:pPr>
+        <w:pStyle w:val="Heading2"/>
+        <w:spacing w:before="0" w:after="0"/>
+      </w:pPr>
+      <w:r>
+        <w:rPr>
+          <w:rStyle w:val="HTMLCode"/>
+          <w:rFonts w:eastAsiaTheme="majorEastAsia"/>
+        </w:rPr>
+        <w:t>splice()</w:t>
+      </w:r>
+    </w:p>
+    <w:p>
+      <w:pPr>
+        <w:pStyle w:val="Heading2"/>
+        <w:spacing w:before="0" w:after="0"/>
+      </w:pPr>
+      <w:r>
+        <w:rPr>
+          <w:rStyle w:val="s1"/>
+        </w:rPr>
+        <w:t>in JavaScript</w:t>
+      </w:r>
+    </w:p>
+    <w:p>
+      <w:pPr>
+        <w:pStyle w:val="p2"/>
+      </w:pPr>
+      <w:r>
+        <w:t>The easiest way to remember:</w:t>
+      </w:r>
+    </w:p>
+    <w:p>
+      <w:pPr>
+        <w:pStyle w:val="p3"/>
+        <w:rPr>
+          <w:rStyle w:val="s1"/>
+        </w:rPr>
+      </w:pPr>
+      <w:r>
+        <w:rPr>
+          <w:rStyle w:val="HTMLCode"/>
+          <w:b/>
+          <w:bCs/>
+        </w:rPr>
+        <w:t>slice()</w:t>
+      </w:r>
+      <w:r>
+        <w:rPr>
+          <w:b/>
+          <w:bCs/>
+        </w:rPr>
+        <w:t xml:space="preserve"> → copies/extracts part of an array without changing the original.</w:t>
+      </w:r>
+      <w:r>
+        <w:br/>
+      </w:r>
+      <w:r>
+        <w:rPr>
+          <w:rStyle w:val="HTMLCode"/>
+          <w:b/>
+          <w:bCs/>
+        </w:rPr>
+        <w:t>splice()</w:t>
+      </w:r>
+      <w:r>
+        <w:rPr>
+          <w:rStyle w:val="s1"/>
+          <w:b/>
+          <w:bCs/>
+        </w:rPr>
+        <w:t xml:space="preserve"> → adds/removes/replaces items and changes the original array.</w:t>
       </w:r>
     </w:p>
     <w:p>

</xml_diff>

<commit_message>
JS - DOM Basics
</commit_message>
<xml_diff>
--- a/Java Scripts.docx
+++ b/Java Scripts.docx
@@ -12437,8 +12437,1145 @@
     </w:p>
     <w:p>
       <w:pPr>
+        <w:pStyle w:val="Heading3"/>
+      </w:pPr>
+      <w:r>
+        <w:lastRenderedPageBreak/>
+        <w:t>DOM:</w:t>
+      </w:r>
+      <w:r>
+        <w:br/>
+      </w:r>
+      <w:r>
+        <w:br/>
+      </w:r>
+      <w:r>
+        <w:rPr>
+          <w:rStyle w:val="s1"/>
+        </w:rPr>
+        <w:t>What is DOM in JavaScript?</w:t>
+      </w:r>
+    </w:p>
+    <w:p>
+      <w:pPr>
         <w:pStyle w:val="p2"/>
       </w:pPr>
+      <w:r>
+        <w:rPr>
+          <w:b/>
+          <w:bCs/>
+        </w:rPr>
+        <w:t>DOM = Document Object Model</w:t>
+      </w:r>
+      <w:r>
+        <w:rPr>
+          <w:b/>
+          <w:bCs/>
+        </w:rPr>
+        <w:br/>
+      </w:r>
+      <w:r>
+        <w:rPr>
+          <w:b/>
+          <w:bCs/>
+        </w:rPr>
+        <w:br/>
+      </w:r>
+      <w:r>
+        <w:rPr>
+          <w:b/>
+          <w:bCs/>
+        </w:rPr>
+        <w:br/>
+      </w:r>
+      <w:r>
+        <w:rPr>
+          <w:noProof/>
+          <w:lang w:val="en-US"/>
+        </w:rPr>
+        <w:drawing>
+          <wp:inline distT="0" distB="0" distL="0" distR="0" wp14:anchorId="711E62EA" wp14:editId="71557327">
+            <wp:extent cx="5731510" cy="4066540"/>
+            <wp:effectExtent l="0" t="0" r="0" b="0"/>
+            <wp:docPr id="52147054" name="Picture 3"/>
+            <wp:cNvGraphicFramePr>
+              <a:graphicFrameLocks xmlns:a="http://schemas.openxmlformats.org/drawingml/2006/main" noChangeAspect="1"/>
+            </wp:cNvGraphicFramePr>
+            <a:graphic xmlns:a="http://schemas.openxmlformats.org/drawingml/2006/main">
+              <a:graphicData uri="http://schemas.openxmlformats.org/drawingml/2006/picture">
+                <pic:pic xmlns:pic="http://schemas.openxmlformats.org/drawingml/2006/picture">
+                  <pic:nvPicPr>
+                    <pic:cNvPr id="52147054" name="Picture 52147054"/>
+                    <pic:cNvPicPr/>
+                  </pic:nvPicPr>
+                  <pic:blipFill>
+                    <a:blip r:embed="rId16" cstate="print">
+                      <a:extLst>
+                        <a:ext uri="{28A0092B-C50C-407E-A947-70E740481C1C}">
+                          <a14:useLocalDpi xmlns:a14="http://schemas.microsoft.com/office/drawing/2010/main" val="0"/>
+                        </a:ext>
+                      </a:extLst>
+                    </a:blip>
+                    <a:stretch>
+                      <a:fillRect/>
+                    </a:stretch>
+                  </pic:blipFill>
+                  <pic:spPr>
+                    <a:xfrm>
+                      <a:off x="0" y="0"/>
+                      <a:ext cx="5731510" cy="4066540"/>
+                    </a:xfrm>
+                    <a:prstGeom prst="rect">
+                      <a:avLst/>
+                    </a:prstGeom>
+                  </pic:spPr>
+                </pic:pic>
+              </a:graphicData>
+            </a:graphic>
+          </wp:inline>
+        </w:drawing>
+      </w:r>
+      <w:r>
+        <w:t xml:space="preserve">The DOM is a </w:t>
+      </w:r>
+      <w:r>
+        <w:rPr>
+          <w:rStyle w:val="s1"/>
+          <w:b/>
+          <w:bCs/>
+        </w:rPr>
+        <w:t>tree-like representation of an HTML page</w:t>
+      </w:r>
+      <w:r>
+        <w:t xml:space="preserve"> that JavaScript can use to </w:t>
+      </w:r>
+      <w:r>
+        <w:rPr>
+          <w:rStyle w:val="s1"/>
+          <w:b/>
+          <w:bCs/>
+        </w:rPr>
+        <w:t>read, change, add, or remove HTML elements and their styles/content</w:t>
+      </w:r>
+      <w:r>
+        <w:t>.</w:t>
+      </w:r>
+      <w:r>
+        <w:br/>
+      </w:r>
+      <w:r>
+        <w:br/>
+      </w:r>
+      <w:r>
+        <w:rPr>
+          <w:b/>
+          <w:bCs/>
+        </w:rPr>
+        <w:t>DOM is mainly for web development</w:t>
+      </w:r>
+      <w:r>
+        <w:t xml:space="preserve"> (HTML + JavaScript).</w:t>
+      </w:r>
+      <w:r>
+        <w:br/>
+      </w:r>
+      <w:r>
+        <w:br/>
+      </w:r>
+      <w:r>
+        <w:drawing>
+          <wp:inline distT="0" distB="0" distL="0" distR="0" wp14:anchorId="59109D15" wp14:editId="01CB6BFC">
+            <wp:extent cx="5731510" cy="2211705"/>
+            <wp:effectExtent l="0" t="0" r="0" b="0"/>
+            <wp:docPr id="136116379" name="Picture 1"/>
+            <wp:cNvGraphicFramePr>
+              <a:graphicFrameLocks xmlns:a="http://schemas.openxmlformats.org/drawingml/2006/main" noChangeAspect="1"/>
+            </wp:cNvGraphicFramePr>
+            <a:graphic xmlns:a="http://schemas.openxmlformats.org/drawingml/2006/main">
+              <a:graphicData uri="http://schemas.openxmlformats.org/drawingml/2006/picture">
+                <pic:pic xmlns:pic="http://schemas.openxmlformats.org/drawingml/2006/picture">
+                  <pic:nvPicPr>
+                    <pic:cNvPr id="136116379" name=""/>
+                    <pic:cNvPicPr/>
+                  </pic:nvPicPr>
+                  <pic:blipFill>
+                    <a:blip r:embed="rId17"/>
+                    <a:stretch>
+                      <a:fillRect/>
+                    </a:stretch>
+                  </pic:blipFill>
+                  <pic:spPr>
+                    <a:xfrm>
+                      <a:off x="0" y="0"/>
+                      <a:ext cx="5731510" cy="2211705"/>
+                    </a:xfrm>
+                    <a:prstGeom prst="rect">
+                      <a:avLst/>
+                    </a:prstGeom>
+                  </pic:spPr>
+                </pic:pic>
+              </a:graphicData>
+            </a:graphic>
+          </wp:inline>
+        </w:drawing>
+      </w:r>
+      <w:r>
+        <w:br/>
+      </w:r>
+      <w:r>
+        <w:br/>
+      </w:r>
+      <w:r>
+        <w:lastRenderedPageBreak/>
+        <w:drawing>
+          <wp:inline distT="0" distB="0" distL="0" distR="0" wp14:anchorId="7D16291B" wp14:editId="043BB444">
+            <wp:extent cx="5731510" cy="3217545"/>
+            <wp:effectExtent l="0" t="0" r="0" b="0"/>
+            <wp:docPr id="517189293" name="Picture 1"/>
+            <wp:cNvGraphicFramePr>
+              <a:graphicFrameLocks xmlns:a="http://schemas.openxmlformats.org/drawingml/2006/main" noChangeAspect="1"/>
+            </wp:cNvGraphicFramePr>
+            <a:graphic xmlns:a="http://schemas.openxmlformats.org/drawingml/2006/main">
+              <a:graphicData uri="http://schemas.openxmlformats.org/drawingml/2006/picture">
+                <pic:pic xmlns:pic="http://schemas.openxmlformats.org/drawingml/2006/picture">
+                  <pic:nvPicPr>
+                    <pic:cNvPr id="517189293" name=""/>
+                    <pic:cNvPicPr/>
+                  </pic:nvPicPr>
+                  <pic:blipFill>
+                    <a:blip r:embed="rId18"/>
+                    <a:stretch>
+                      <a:fillRect/>
+                    </a:stretch>
+                  </pic:blipFill>
+                  <pic:spPr>
+                    <a:xfrm>
+                      <a:off x="0" y="0"/>
+                      <a:ext cx="5731510" cy="3217545"/>
+                    </a:xfrm>
+                    <a:prstGeom prst="rect">
+                      <a:avLst/>
+                    </a:prstGeom>
+                  </pic:spPr>
+                </pic:pic>
+              </a:graphicData>
+            </a:graphic>
+          </wp:inline>
+        </w:drawing>
+      </w:r>
+      <w:r>
+        <w:br/>
+      </w:r>
+      <w:r>
+        <w:br/>
+      </w:r>
+      <w:r>
+        <w:br/>
+      </w:r>
+      <w:r>
+        <w:br/>
+      </w:r>
+      <w:r>
+        <w:br/>
+      </w:r>
+      <w:r>
+        <w:br/>
+      </w:r>
+      <w:r>
+        <w:br/>
+        <w:t>Window object:</w:t>
+      </w:r>
+    </w:p>
+    <w:p>
+      <w:pPr>
+        <w:pStyle w:val="p2"/>
+      </w:pPr>
+      <w:r>
+        <w:t xml:space="preserve">The </w:t>
+      </w:r>
+      <w:r>
+        <w:rPr>
+          <w:rStyle w:val="HTMLCode"/>
+          <w:b/>
+          <w:bCs/>
+        </w:rPr>
+        <w:t>window</w:t>
+      </w:r>
+      <w:r>
+        <w:rPr>
+          <w:rStyle w:val="s1"/>
+          <w:b/>
+          <w:bCs/>
+        </w:rPr>
+        <w:t xml:space="preserve"> object</w:t>
+      </w:r>
+      <w:r>
+        <w:t xml:space="preserve"> represents the </w:t>
+      </w:r>
+      <w:r>
+        <w:rPr>
+          <w:rStyle w:val="s1"/>
+          <w:b/>
+          <w:bCs/>
+        </w:rPr>
+        <w:t>browser window</w:t>
+      </w:r>
+      <w:r>
+        <w:t>. It is the top-level object provided by the browser for a web page.</w:t>
+      </w:r>
+    </w:p>
+    <w:p>
+      <w:pPr>
+        <w:pStyle w:val="p1"/>
+      </w:pPr>
+      <w:r>
+        <w:drawing>
+          <wp:inline distT="0" distB="0" distL="0" distR="0" wp14:anchorId="04C310F0" wp14:editId="410B36B2">
+            <wp:extent cx="2482896" cy="2826241"/>
+            <wp:effectExtent l="0" t="0" r="0" b="6350"/>
+            <wp:docPr id="22464357" name="Picture 1"/>
+            <wp:cNvGraphicFramePr>
+              <a:graphicFrameLocks xmlns:a="http://schemas.openxmlformats.org/drawingml/2006/main" noChangeAspect="1"/>
+            </wp:cNvGraphicFramePr>
+            <a:graphic xmlns:a="http://schemas.openxmlformats.org/drawingml/2006/main">
+              <a:graphicData uri="http://schemas.openxmlformats.org/drawingml/2006/picture">
+                <pic:pic xmlns:pic="http://schemas.openxmlformats.org/drawingml/2006/picture">
+                  <pic:nvPicPr>
+                    <pic:cNvPr id="22464357" name=""/>
+                    <pic:cNvPicPr/>
+                  </pic:nvPicPr>
+                  <pic:blipFill rotWithShape="1">
+                    <a:blip r:embed="rId19"/>
+                    <a:srcRect r="47597"/>
+                    <a:stretch>
+                      <a:fillRect/>
+                    </a:stretch>
+                  </pic:blipFill>
+                  <pic:spPr bwMode="auto">
+                    <a:xfrm>
+                      <a:off x="0" y="0"/>
+                      <a:ext cx="2498485" cy="2843986"/>
+                    </a:xfrm>
+                    <a:prstGeom prst="rect">
+                      <a:avLst/>
+                    </a:prstGeom>
+                    <a:ln>
+                      <a:noFill/>
+                    </a:ln>
+                    <a:extLst>
+                      <a:ext uri="{53640926-AAD7-44D8-BBD7-CCE9431645EC}">
+                        <a14:shadowObscured xmlns:a14="http://schemas.microsoft.com/office/drawing/2010/main"/>
+                      </a:ext>
+                    </a:extLst>
+                  </pic:spPr>
+                </pic:pic>
+              </a:graphicData>
+            </a:graphic>
+          </wp:inline>
+        </w:drawing>
+      </w:r>
+      <w:r>
+        <w:br/>
+      </w:r>
+      <w:r>
+        <w:br/>
+      </w:r>
+      <w:r>
+        <w:lastRenderedPageBreak/>
+        <w:drawing>
+          <wp:inline distT="0" distB="0" distL="0" distR="0" wp14:anchorId="130BFEC3" wp14:editId="3EBD4798">
+            <wp:extent cx="5731510" cy="4044315"/>
+            <wp:effectExtent l="0" t="0" r="0" b="0"/>
+            <wp:docPr id="8211296" name="Picture 1"/>
+            <wp:cNvGraphicFramePr>
+              <a:graphicFrameLocks xmlns:a="http://schemas.openxmlformats.org/drawingml/2006/main" noChangeAspect="1"/>
+            </wp:cNvGraphicFramePr>
+            <a:graphic xmlns:a="http://schemas.openxmlformats.org/drawingml/2006/main">
+              <a:graphicData uri="http://schemas.openxmlformats.org/drawingml/2006/picture">
+                <pic:pic xmlns:pic="http://schemas.openxmlformats.org/drawingml/2006/picture">
+                  <pic:nvPicPr>
+                    <pic:cNvPr id="8211296" name=""/>
+                    <pic:cNvPicPr/>
+                  </pic:nvPicPr>
+                  <pic:blipFill>
+                    <a:blip r:embed="rId20"/>
+                    <a:stretch>
+                      <a:fillRect/>
+                    </a:stretch>
+                  </pic:blipFill>
+                  <pic:spPr>
+                    <a:xfrm>
+                      <a:off x="0" y="0"/>
+                      <a:ext cx="5731510" cy="4044315"/>
+                    </a:xfrm>
+                    <a:prstGeom prst="rect">
+                      <a:avLst/>
+                    </a:prstGeom>
+                  </pic:spPr>
+                </pic:pic>
+              </a:graphicData>
+            </a:graphic>
+          </wp:inline>
+        </w:drawing>
+      </w:r>
+      <w:r>
+        <w:br/>
+      </w:r>
+    </w:p>
+    <w:p>
+      <w:pPr>
+        <w:pStyle w:val="Heading3"/>
+      </w:pPr>
+      <w:r>
+        <w:rPr>
+          <w:rStyle w:val="HTMLCode"/>
+          <w:rFonts w:eastAsiaTheme="majorEastAsia"/>
+        </w:rPr>
+        <w:t>console.log()</w:t>
+      </w:r>
+    </w:p>
+    <w:p>
+      <w:pPr>
+        <w:pStyle w:val="Heading3"/>
+        <w:spacing w:before="0" w:after="0"/>
+      </w:pPr>
+      <w:r>
+        <w:rPr>
+          <w:rStyle w:val="s1"/>
+        </w:rPr>
+        <w:t xml:space="preserve">vs </w:t>
+      </w:r>
+    </w:p>
+    <w:p>
+      <w:pPr>
+        <w:pStyle w:val="Heading3"/>
+        <w:spacing w:before="0" w:after="0"/>
+      </w:pPr>
+      <w:proofErr w:type="spellStart"/>
+      <w:r>
+        <w:rPr>
+          <w:rStyle w:val="HTMLCode"/>
+          <w:rFonts w:eastAsiaTheme="majorEastAsia"/>
+        </w:rPr>
+        <w:t>console.dir</w:t>
+      </w:r>
+      <w:proofErr w:type="spellEnd"/>
+      <w:r>
+        <w:rPr>
+          <w:rStyle w:val="HTMLCode"/>
+          <w:rFonts w:eastAsiaTheme="majorEastAsia"/>
+        </w:rPr>
+        <w:t>()</w:t>
+      </w:r>
+    </w:p>
+    <w:p>
+      <w:pPr>
+        <w:pStyle w:val="Heading3"/>
+        <w:spacing w:before="0" w:after="0"/>
+      </w:pPr>
+      <w:r>
+        <w:rPr>
+          <w:rStyle w:val="s1"/>
+        </w:rPr>
+        <w:t>in JavaScript</w:t>
+      </w:r>
+    </w:p>
+    <w:p>
+      <w:pPr>
+        <w:pStyle w:val="p2"/>
+      </w:pPr>
+      <w:r>
+        <w:t xml:space="preserve">Both are used to </w:t>
+      </w:r>
+      <w:r>
+        <w:rPr>
+          <w:rStyle w:val="s1"/>
+          <w:b/>
+          <w:bCs/>
+        </w:rPr>
+        <w:t>inspect/print values in the console</w:t>
+      </w:r>
+      <w:r>
+        <w:t>, but they are useful for slightly different purposes.</w:t>
+      </w:r>
+    </w:p>
+    <w:p>
+      <w:pPr>
+        <w:pStyle w:val="Heading3"/>
+      </w:pPr>
+      <w:r>
+        <w:rPr>
+          <w:rStyle w:val="s1"/>
+        </w:rPr>
+        <w:t xml:space="preserve">1. </w:t>
+      </w:r>
+    </w:p>
+    <w:p>
+      <w:pPr>
+        <w:pStyle w:val="Heading3"/>
+        <w:spacing w:before="0" w:after="0"/>
+      </w:pPr>
+      <w:r>
+        <w:rPr>
+          <w:rStyle w:val="HTMLCode"/>
+          <w:rFonts w:eastAsiaTheme="majorEastAsia"/>
+        </w:rPr>
+        <w:t>console.log()</w:t>
+      </w:r>
+    </w:p>
+    <w:p>
+      <w:pPr>
+        <w:pStyle w:val="p3"/>
+        <w:rPr>
+          <w:rStyle w:val="s2"/>
+        </w:rPr>
+      </w:pPr>
+      <w:r>
+        <w:t xml:space="preserve">Used for </w:t>
+      </w:r>
+      <w:r>
+        <w:rPr>
+          <w:rStyle w:val="s1"/>
+          <w:b/>
+          <w:bCs/>
+        </w:rPr>
+        <w:t>general output</w:t>
+      </w:r>
+      <w:r>
+        <w:rPr>
+          <w:rStyle w:val="s2"/>
+        </w:rPr>
+        <w:t>.</w:t>
+      </w:r>
+    </w:p>
+    <w:p>
+      <w:pPr>
+        <w:pStyle w:val="Heading3"/>
+      </w:pPr>
+      <w:r>
+        <w:rPr>
+          <w:rStyle w:val="s1"/>
+        </w:rPr>
+        <w:t xml:space="preserve">2. </w:t>
+      </w:r>
+    </w:p>
+    <w:p>
+      <w:pPr>
+        <w:pStyle w:val="Heading3"/>
+        <w:spacing w:before="0" w:after="0"/>
+      </w:pPr>
+      <w:proofErr w:type="spellStart"/>
+      <w:r>
+        <w:rPr>
+          <w:rStyle w:val="HTMLCode"/>
+          <w:rFonts w:eastAsiaTheme="majorEastAsia"/>
+        </w:rPr>
+        <w:t>console.dir</w:t>
+      </w:r>
+      <w:proofErr w:type="spellEnd"/>
+      <w:r>
+        <w:rPr>
+          <w:rStyle w:val="HTMLCode"/>
+          <w:rFonts w:eastAsiaTheme="majorEastAsia"/>
+        </w:rPr>
+        <w:t>()</w:t>
+      </w:r>
+    </w:p>
+    <w:p>
+      <w:pPr>
+        <w:pStyle w:val="p2"/>
+      </w:pPr>
+      <w:proofErr w:type="spellStart"/>
+      <w:r>
+        <w:rPr>
+          <w:rStyle w:val="HTMLCode"/>
+        </w:rPr>
+        <w:t>console.dir</w:t>
+      </w:r>
+      <w:proofErr w:type="spellEnd"/>
+      <w:r>
+        <w:rPr>
+          <w:rStyle w:val="HTMLCode"/>
+        </w:rPr>
+        <w:t>()</w:t>
+      </w:r>
+      <w:r>
+        <w:t xml:space="preserve"> is particularly useful for seeing an object’s </w:t>
+      </w:r>
+      <w:r>
+        <w:rPr>
+          <w:rStyle w:val="s1"/>
+          <w:b/>
+          <w:bCs/>
+        </w:rPr>
+        <w:t>properties and structure</w:t>
+      </w:r>
+      <w:r>
+        <w:t>.</w:t>
+      </w:r>
+    </w:p>
+    <w:p>
+      <w:pPr>
+        <w:pStyle w:val="p2"/>
+      </w:pPr>
+      <w:r>
+        <w:lastRenderedPageBreak/>
+        <w:drawing>
+          <wp:inline distT="0" distB="0" distL="0" distR="0" wp14:anchorId="47C69B84" wp14:editId="66DE868D">
+            <wp:extent cx="5731510" cy="1736090"/>
+            <wp:effectExtent l="0" t="0" r="0" b="3810"/>
+            <wp:docPr id="464824477" name="Picture 1"/>
+            <wp:cNvGraphicFramePr>
+              <a:graphicFrameLocks xmlns:a="http://schemas.openxmlformats.org/drawingml/2006/main" noChangeAspect="1"/>
+            </wp:cNvGraphicFramePr>
+            <a:graphic xmlns:a="http://schemas.openxmlformats.org/drawingml/2006/main">
+              <a:graphicData uri="http://schemas.openxmlformats.org/drawingml/2006/picture">
+                <pic:pic xmlns:pic="http://schemas.openxmlformats.org/drawingml/2006/picture">
+                  <pic:nvPicPr>
+                    <pic:cNvPr id="464824477" name=""/>
+                    <pic:cNvPicPr/>
+                  </pic:nvPicPr>
+                  <pic:blipFill>
+                    <a:blip r:embed="rId21"/>
+                    <a:stretch>
+                      <a:fillRect/>
+                    </a:stretch>
+                  </pic:blipFill>
+                  <pic:spPr>
+                    <a:xfrm>
+                      <a:off x="0" y="0"/>
+                      <a:ext cx="5731510" cy="1736090"/>
+                    </a:xfrm>
+                    <a:prstGeom prst="rect">
+                      <a:avLst/>
+                    </a:prstGeom>
+                  </pic:spPr>
+                </pic:pic>
+              </a:graphicData>
+            </a:graphic>
+          </wp:inline>
+        </w:drawing>
+      </w:r>
+    </w:p>
+    <w:p>
+      <w:pPr>
+        <w:pStyle w:val="p2"/>
+      </w:pPr>
+    </w:p>
+    <w:p>
+      <w:pPr>
+        <w:pStyle w:val="p2"/>
+      </w:pPr>
+      <w:r>
+        <w:t>DOM Manipulations:</w:t>
+      </w:r>
+      <w:r>
+        <w:br/>
+      </w:r>
+      <w:r>
+        <w:br/>
+      </w:r>
+      <w:r>
+        <w:t xml:space="preserve">ID     → </w:t>
+      </w:r>
+      <w:proofErr w:type="spellStart"/>
+      <w:r>
+        <w:t>getElementById</w:t>
+      </w:r>
+      <w:proofErr w:type="spellEnd"/>
+      <w:r>
+        <w:t>()</w:t>
+      </w:r>
+    </w:p>
+    <w:p>
+      <w:pPr>
+        <w:pStyle w:val="p2"/>
+      </w:pPr>
+      <w:r>
+        <w:t xml:space="preserve">Class  → </w:t>
+      </w:r>
+      <w:proofErr w:type="spellStart"/>
+      <w:r>
+        <w:t>getElementsByClassName</w:t>
+      </w:r>
+      <w:proofErr w:type="spellEnd"/>
+      <w:r>
+        <w:t>()</w:t>
+      </w:r>
+    </w:p>
+    <w:p>
+      <w:pPr>
+        <w:pStyle w:val="p2"/>
+      </w:pPr>
+      <w:r>
+        <w:t xml:space="preserve">Tag    → </w:t>
+      </w:r>
+      <w:proofErr w:type="spellStart"/>
+      <w:r>
+        <w:t>getElementsByTagName</w:t>
+      </w:r>
+      <w:proofErr w:type="spellEnd"/>
+      <w:r>
+        <w:t>()</w:t>
+      </w:r>
+      <w:r>
+        <w:br/>
+      </w:r>
+      <w:r>
+        <w:drawing>
+          <wp:inline distT="0" distB="0" distL="0" distR="0" wp14:anchorId="1BB1241F" wp14:editId="40C3AC06">
+            <wp:extent cx="5731510" cy="5228590"/>
+            <wp:effectExtent l="0" t="0" r="0" b="3810"/>
+            <wp:docPr id="146741118" name="Picture 1"/>
+            <wp:cNvGraphicFramePr>
+              <a:graphicFrameLocks xmlns:a="http://schemas.openxmlformats.org/drawingml/2006/main" noChangeAspect="1"/>
+            </wp:cNvGraphicFramePr>
+            <a:graphic xmlns:a="http://schemas.openxmlformats.org/drawingml/2006/main">
+              <a:graphicData uri="http://schemas.openxmlformats.org/drawingml/2006/picture">
+                <pic:pic xmlns:pic="http://schemas.openxmlformats.org/drawingml/2006/picture">
+                  <pic:nvPicPr>
+                    <pic:cNvPr id="146741118" name=""/>
+                    <pic:cNvPicPr/>
+                  </pic:nvPicPr>
+                  <pic:blipFill>
+                    <a:blip r:embed="rId22"/>
+                    <a:stretch>
+                      <a:fillRect/>
+                    </a:stretch>
+                  </pic:blipFill>
+                  <pic:spPr>
+                    <a:xfrm>
+                      <a:off x="0" y="0"/>
+                      <a:ext cx="5731510" cy="5228590"/>
+                    </a:xfrm>
+                    <a:prstGeom prst="rect">
+                      <a:avLst/>
+                    </a:prstGeom>
+                  </pic:spPr>
+                </pic:pic>
+              </a:graphicData>
+            </a:graphic>
+          </wp:inline>
+        </w:drawing>
+      </w:r>
+      <w:r>
+        <w:br/>
+      </w:r>
+      <w:r>
+        <w:lastRenderedPageBreak/>
+        <w:br/>
+      </w:r>
+      <w:r>
+        <w:drawing>
+          <wp:inline distT="0" distB="0" distL="0" distR="0" wp14:anchorId="0A324696" wp14:editId="3F1977E3">
+            <wp:extent cx="5731510" cy="4123690"/>
+            <wp:effectExtent l="0" t="0" r="0" b="3810"/>
+            <wp:docPr id="2120858927" name="Picture 1"/>
+            <wp:cNvGraphicFramePr>
+              <a:graphicFrameLocks xmlns:a="http://schemas.openxmlformats.org/drawingml/2006/main" noChangeAspect="1"/>
+            </wp:cNvGraphicFramePr>
+            <a:graphic xmlns:a="http://schemas.openxmlformats.org/drawingml/2006/main">
+              <a:graphicData uri="http://schemas.openxmlformats.org/drawingml/2006/picture">
+                <pic:pic xmlns:pic="http://schemas.openxmlformats.org/drawingml/2006/picture">
+                  <pic:nvPicPr>
+                    <pic:cNvPr id="2120858927" name=""/>
+                    <pic:cNvPicPr/>
+                  </pic:nvPicPr>
+                  <pic:blipFill>
+                    <a:blip r:embed="rId23"/>
+                    <a:stretch>
+                      <a:fillRect/>
+                    </a:stretch>
+                  </pic:blipFill>
+                  <pic:spPr>
+                    <a:xfrm>
+                      <a:off x="0" y="0"/>
+                      <a:ext cx="5731510" cy="4123690"/>
+                    </a:xfrm>
+                    <a:prstGeom prst="rect">
+                      <a:avLst/>
+                    </a:prstGeom>
+                  </pic:spPr>
+                </pic:pic>
+              </a:graphicData>
+            </a:graphic>
+          </wp:inline>
+        </w:drawing>
+      </w:r>
+    </w:p>
+    <w:p>
+      <w:pPr>
+        <w:pStyle w:val="Heading2"/>
+      </w:pPr>
+      <w:r>
+        <w:rPr>
+          <w:lang w:val="en-US"/>
+        </w:rPr>
+        <w:br/>
+      </w:r>
+      <w:r>
+        <w:rPr>
+          <w:rStyle w:val="s1"/>
+        </w:rPr>
+        <w:t>DOM Manipulation Properties in JavaScript</w:t>
+      </w:r>
+    </w:p>
+    <w:p>
+      <w:pPr>
+        <w:pStyle w:val="p2"/>
+      </w:pPr>
+      <w:r>
+        <w:t xml:space="preserve">After selecting an HTML element, you can use </w:t>
+      </w:r>
+      <w:r>
+        <w:rPr>
+          <w:rStyle w:val="s1"/>
+          <w:b/>
+          <w:bCs/>
+        </w:rPr>
+        <w:t>DOM properties</w:t>
+      </w:r>
+      <w:r>
+        <w:t xml:space="preserve"> to read or change its content, style, attributes, and more.</w:t>
+      </w:r>
+    </w:p>
+    <w:p>
+      <w:pPr>
+        <w:pStyle w:val="ListParagraph"/>
+        <w:spacing w:before="100" w:beforeAutospacing="1" w:after="100" w:afterAutospacing="1" w:line="240" w:lineRule="auto"/>
+        <w:ind w:left="0"/>
+        <w:rPr>
+          <w:lang w:val="en-US"/>
+        </w:rPr>
+      </w:pPr>
+    </w:p>
+    <w:p>
+      <w:pPr>
+        <w:pStyle w:val="ListParagraph"/>
+        <w:spacing w:before="100" w:beforeAutospacing="1" w:after="100" w:afterAutospacing="1" w:line="240" w:lineRule="auto"/>
+        <w:ind w:left="0"/>
+        <w:rPr>
+          <w:lang w:val="en-US"/>
+        </w:rPr>
+      </w:pPr>
+    </w:p>
+    <w:p>
+      <w:pPr>
+        <w:pStyle w:val="ListParagraph"/>
+        <w:numPr>
+          <w:ilvl w:val="0"/>
+          <w:numId w:val="8"/>
+        </w:numPr>
+        <w:spacing w:before="100" w:beforeAutospacing="1" w:after="100" w:afterAutospacing="1" w:line="240" w:lineRule="auto"/>
+        <w:rPr>
+          <w:rFonts w:ascii="Times New Roman" w:eastAsia="Times New Roman" w:hAnsi="Times New Roman" w:cs="Times New Roman"/>
+          <w:kern w:val="0"/>
+          <w:lang w:eastAsia="en-GB"/>
+          <w14:ligatures w14:val="none"/>
+        </w:rPr>
+      </w:pPr>
+      <w:proofErr w:type="spellStart"/>
+      <w:r>
+        <w:rPr>
+          <w:rFonts w:ascii="Courier New" w:eastAsia="Times New Roman" w:hAnsi="Courier New" w:cs="Courier New"/>
+          <w:b/>
+          <w:bCs/>
+          <w:kern w:val="0"/>
+          <w:sz w:val="20"/>
+          <w:szCs w:val="20"/>
+          <w:lang w:eastAsia="en-GB"/>
+          <w14:ligatures w14:val="none"/>
+        </w:rPr>
+        <w:t>tagName</w:t>
+      </w:r>
+      <w:proofErr w:type="spellEnd"/>
+      <w:r>
+        <w:rPr>
+          <w:rFonts w:ascii="Times New Roman" w:eastAsia="Times New Roman" w:hAnsi="Times New Roman" w:cs="Times New Roman"/>
+          <w:kern w:val="0"/>
+          <w:lang w:eastAsia="en-GB"/>
+          <w14:ligatures w14:val="none"/>
+        </w:rPr>
+        <w:t xml:space="preserve"> → Returns the name of the HTML tag, such as </w:t>
+      </w:r>
+      <w:r>
+        <w:rPr>
+          <w:rFonts w:ascii="Courier New" w:eastAsia="Times New Roman" w:hAnsi="Courier New" w:cs="Courier New"/>
+          <w:kern w:val="0"/>
+          <w:sz w:val="20"/>
+          <w:szCs w:val="20"/>
+          <w:lang w:eastAsia="en-GB"/>
+          <w14:ligatures w14:val="none"/>
+        </w:rPr>
+        <w:t>DIV</w:t>
+      </w:r>
+      <w:r>
+        <w:rPr>
+          <w:rFonts w:ascii="Times New Roman" w:eastAsia="Times New Roman" w:hAnsi="Times New Roman" w:cs="Times New Roman"/>
+          <w:kern w:val="0"/>
+          <w:lang w:eastAsia="en-GB"/>
+          <w14:ligatures w14:val="none"/>
+        </w:rPr>
+        <w:t xml:space="preserve">, </w:t>
+      </w:r>
+      <w:r>
+        <w:rPr>
+          <w:rFonts w:ascii="Courier New" w:eastAsia="Times New Roman" w:hAnsi="Courier New" w:cs="Courier New"/>
+          <w:kern w:val="0"/>
+          <w:sz w:val="20"/>
+          <w:szCs w:val="20"/>
+          <w:lang w:eastAsia="en-GB"/>
+          <w14:ligatures w14:val="none"/>
+        </w:rPr>
+        <w:t>P</w:t>
+      </w:r>
+      <w:r>
+        <w:rPr>
+          <w:rFonts w:ascii="Times New Roman" w:eastAsia="Times New Roman" w:hAnsi="Times New Roman" w:cs="Times New Roman"/>
+          <w:kern w:val="0"/>
+          <w:lang w:eastAsia="en-GB"/>
+          <w14:ligatures w14:val="none"/>
+        </w:rPr>
+        <w:t xml:space="preserve">, </w:t>
+      </w:r>
+      <w:r>
+        <w:rPr>
+          <w:rFonts w:ascii="Courier New" w:eastAsia="Times New Roman" w:hAnsi="Courier New" w:cs="Courier New"/>
+          <w:kern w:val="0"/>
+          <w:sz w:val="20"/>
+          <w:szCs w:val="20"/>
+          <w:lang w:eastAsia="en-GB"/>
+          <w14:ligatures w14:val="none"/>
+        </w:rPr>
+        <w:t>H1</w:t>
+      </w:r>
+      <w:r>
+        <w:rPr>
+          <w:rFonts w:ascii="Times New Roman" w:eastAsia="Times New Roman" w:hAnsi="Times New Roman" w:cs="Times New Roman"/>
+          <w:kern w:val="0"/>
+          <w:lang w:eastAsia="en-GB"/>
+          <w14:ligatures w14:val="none"/>
+        </w:rPr>
+        <w:t xml:space="preserve">, or </w:t>
+      </w:r>
+      <w:r>
+        <w:rPr>
+          <w:rFonts w:ascii="Courier New" w:eastAsia="Times New Roman" w:hAnsi="Courier New" w:cs="Courier New"/>
+          <w:kern w:val="0"/>
+          <w:sz w:val="20"/>
+          <w:szCs w:val="20"/>
+          <w:lang w:eastAsia="en-GB"/>
+          <w14:ligatures w14:val="none"/>
+        </w:rPr>
+        <w:t>BUTTON</w:t>
+      </w:r>
+      <w:r>
+        <w:rPr>
+          <w:rFonts w:ascii="Times New Roman" w:eastAsia="Times New Roman" w:hAnsi="Times New Roman" w:cs="Times New Roman"/>
+          <w:kern w:val="0"/>
+          <w:lang w:eastAsia="en-GB"/>
+          <w14:ligatures w14:val="none"/>
+        </w:rPr>
+        <w:t>.</w:t>
+      </w:r>
+    </w:p>
+    <w:p>
+      <w:pPr>
+        <w:pStyle w:val="ListParagraph"/>
+        <w:numPr>
+          <w:ilvl w:val="0"/>
+          <w:numId w:val="8"/>
+        </w:numPr>
+        <w:spacing w:before="100" w:beforeAutospacing="1" w:after="100" w:afterAutospacing="1" w:line="240" w:lineRule="auto"/>
+        <w:rPr>
+          <w:rFonts w:ascii="Times New Roman" w:eastAsia="Times New Roman" w:hAnsi="Times New Roman" w:cs="Times New Roman"/>
+          <w:kern w:val="0"/>
+          <w:lang w:eastAsia="en-GB"/>
+          <w14:ligatures w14:val="none"/>
+        </w:rPr>
+      </w:pPr>
+      <w:proofErr w:type="spellStart"/>
+      <w:r>
+        <w:rPr>
+          <w:rFonts w:ascii="Courier New" w:eastAsia="Times New Roman" w:hAnsi="Courier New" w:cs="Courier New"/>
+          <w:b/>
+          <w:bCs/>
+          <w:kern w:val="0"/>
+          <w:sz w:val="20"/>
+          <w:szCs w:val="20"/>
+          <w:lang w:eastAsia="en-GB"/>
+          <w14:ligatures w14:val="none"/>
+        </w:rPr>
+        <w:t>innerText</w:t>
+      </w:r>
+      <w:proofErr w:type="spellEnd"/>
+      <w:r>
+        <w:rPr>
+          <w:rFonts w:ascii="Times New Roman" w:eastAsia="Times New Roman" w:hAnsi="Times New Roman" w:cs="Times New Roman"/>
+          <w:kern w:val="0"/>
+          <w:lang w:eastAsia="en-GB"/>
+          <w14:ligatures w14:val="none"/>
+        </w:rPr>
+        <w:t xml:space="preserve"> → Gets or changes the </w:t>
+      </w:r>
+      <w:r>
+        <w:rPr>
+          <w:rFonts w:ascii="Times New Roman" w:eastAsia="Times New Roman" w:hAnsi="Times New Roman" w:cs="Times New Roman"/>
+          <w:b/>
+          <w:bCs/>
+          <w:kern w:val="0"/>
+          <w:lang w:eastAsia="en-GB"/>
+          <w14:ligatures w14:val="none"/>
+        </w:rPr>
+        <w:t>visible text</w:t>
+      </w:r>
+      <w:r>
+        <w:rPr>
+          <w:rFonts w:ascii="Times New Roman" w:eastAsia="Times New Roman" w:hAnsi="Times New Roman" w:cs="Times New Roman"/>
+          <w:kern w:val="0"/>
+          <w:lang w:eastAsia="en-GB"/>
+          <w14:ligatures w14:val="none"/>
+        </w:rPr>
+        <w:t xml:space="preserve"> inside an element.</w:t>
+      </w:r>
+    </w:p>
+    <w:p>
+      <w:pPr>
+        <w:pStyle w:val="ListParagraph"/>
+        <w:numPr>
+          <w:ilvl w:val="0"/>
+          <w:numId w:val="8"/>
+        </w:numPr>
+        <w:spacing w:before="100" w:beforeAutospacing="1" w:after="100" w:afterAutospacing="1" w:line="240" w:lineRule="auto"/>
+        <w:rPr>
+          <w:rFonts w:ascii="Times New Roman" w:eastAsia="Times New Roman" w:hAnsi="Times New Roman" w:cs="Times New Roman"/>
+          <w:kern w:val="0"/>
+          <w:lang w:eastAsia="en-GB"/>
+          <w14:ligatures w14:val="none"/>
+        </w:rPr>
+      </w:pPr>
+      <w:proofErr w:type="spellStart"/>
+      <w:r>
+        <w:rPr>
+          <w:rFonts w:ascii="Courier New" w:eastAsia="Times New Roman" w:hAnsi="Courier New" w:cs="Courier New"/>
+          <w:b/>
+          <w:bCs/>
+          <w:kern w:val="0"/>
+          <w:sz w:val="20"/>
+          <w:szCs w:val="20"/>
+          <w:lang w:eastAsia="en-GB"/>
+          <w14:ligatures w14:val="none"/>
+        </w:rPr>
+        <w:t>innerHTML</w:t>
+      </w:r>
+      <w:proofErr w:type="spellEnd"/>
+      <w:r>
+        <w:rPr>
+          <w:rFonts w:ascii="Times New Roman" w:eastAsia="Times New Roman" w:hAnsi="Times New Roman" w:cs="Times New Roman"/>
+          <w:kern w:val="0"/>
+          <w:lang w:eastAsia="en-GB"/>
+          <w14:ligatures w14:val="none"/>
+        </w:rPr>
+        <w:t xml:space="preserve"> → Gets or changes the </w:t>
+      </w:r>
+      <w:r>
+        <w:rPr>
+          <w:rFonts w:ascii="Times New Roman" w:eastAsia="Times New Roman" w:hAnsi="Times New Roman" w:cs="Times New Roman"/>
+          <w:b/>
+          <w:bCs/>
+          <w:kern w:val="0"/>
+          <w:lang w:eastAsia="en-GB"/>
+          <w14:ligatures w14:val="none"/>
+        </w:rPr>
+        <w:t>HTML content</w:t>
+      </w:r>
+      <w:r>
+        <w:rPr>
+          <w:rFonts w:ascii="Times New Roman" w:eastAsia="Times New Roman" w:hAnsi="Times New Roman" w:cs="Times New Roman"/>
+          <w:kern w:val="0"/>
+          <w:lang w:eastAsia="en-GB"/>
+          <w14:ligatures w14:val="none"/>
+        </w:rPr>
+        <w:t xml:space="preserve"> inside an element, including tags.</w:t>
+      </w:r>
+    </w:p>
+    <w:p>
+      <w:pPr>
+        <w:pStyle w:val="ListParagraph"/>
+        <w:numPr>
+          <w:ilvl w:val="0"/>
+          <w:numId w:val="8"/>
+        </w:numPr>
+        <w:spacing w:before="100" w:beforeAutospacing="1" w:after="100" w:afterAutospacing="1" w:line="240" w:lineRule="auto"/>
+        <w:rPr>
+          <w:rFonts w:ascii="Times New Roman" w:eastAsia="Times New Roman" w:hAnsi="Times New Roman" w:cs="Times New Roman"/>
+          <w:kern w:val="0"/>
+          <w:lang w:eastAsia="en-GB"/>
+          <w14:ligatures w14:val="none"/>
+        </w:rPr>
+      </w:pPr>
+      <w:proofErr w:type="spellStart"/>
+      <w:r>
+        <w:rPr>
+          <w:rFonts w:ascii="Courier New" w:eastAsia="Times New Roman" w:hAnsi="Courier New" w:cs="Courier New"/>
+          <w:b/>
+          <w:bCs/>
+          <w:kern w:val="0"/>
+          <w:sz w:val="20"/>
+          <w:szCs w:val="20"/>
+          <w:lang w:eastAsia="en-GB"/>
+          <w14:ligatures w14:val="none"/>
+        </w:rPr>
+        <w:t>textContent</w:t>
+      </w:r>
+      <w:proofErr w:type="spellEnd"/>
+      <w:r>
+        <w:rPr>
+          <w:rFonts w:ascii="Times New Roman" w:eastAsia="Times New Roman" w:hAnsi="Times New Roman" w:cs="Times New Roman"/>
+          <w:kern w:val="0"/>
+          <w:lang w:eastAsia="en-GB"/>
+          <w14:ligatures w14:val="none"/>
+        </w:rPr>
+        <w:t xml:space="preserve"> → Gets or changes </w:t>
+      </w:r>
+      <w:r>
+        <w:rPr>
+          <w:rFonts w:ascii="Times New Roman" w:eastAsia="Times New Roman" w:hAnsi="Times New Roman" w:cs="Times New Roman"/>
+          <w:b/>
+          <w:bCs/>
+          <w:kern w:val="0"/>
+          <w:lang w:eastAsia="en-GB"/>
+          <w14:ligatures w14:val="none"/>
+        </w:rPr>
+        <w:t>all text content</w:t>
+      </w:r>
+      <w:r>
+        <w:rPr>
+          <w:rFonts w:ascii="Times New Roman" w:eastAsia="Times New Roman" w:hAnsi="Times New Roman" w:cs="Times New Roman"/>
+          <w:kern w:val="0"/>
+          <w:lang w:eastAsia="en-GB"/>
+          <w14:ligatures w14:val="none"/>
+        </w:rPr>
+        <w:t xml:space="preserve"> inside an element, including text that may be hidden by CSS.</w:t>
+      </w:r>
+      <w:r>
+        <w:rPr>
+          <w:rFonts w:ascii="Times New Roman" w:eastAsia="Times New Roman" w:hAnsi="Times New Roman" w:cs="Times New Roman"/>
+          <w:kern w:val="0"/>
+          <w:lang w:eastAsia="en-GB"/>
+          <w14:ligatures w14:val="none"/>
+        </w:rPr>
+        <w:br/>
+      </w:r>
+      <w:r>
+        <w:rPr>
+          <w:rFonts w:ascii="Times New Roman" w:eastAsia="Times New Roman" w:hAnsi="Times New Roman" w:cs="Times New Roman"/>
+          <w:kern w:val="0"/>
+          <w:lang w:eastAsia="en-GB"/>
+          <w14:ligatures w14:val="none"/>
+        </w:rPr>
+        <w:br/>
+      </w:r>
     </w:p>
     <w:p>
       <w:pPr>
@@ -12461,6 +13598,155 @@
 <file path=word/numbering.xml><?xml version="1.0" encoding="utf-8"?>
 <w:numbering xmlns:wpc="http://schemas.microsoft.com/office/word/2010/wordprocessingCanvas" xmlns:cx="http://schemas.microsoft.com/office/drawing/2014/chartex" xmlns:cx1="http://schemas.microsoft.com/office/drawing/2015/9/8/chartex" xmlns:cx2="http://schemas.microsoft.com/office/drawing/2015/10/21/chartex" xmlns:cx3="http://schemas.microsoft.com/office/drawing/2016/5/9/chartex" xmlns:cx4="http://schemas.microsoft.com/office/drawing/2016/5/10/chartex" xmlns:cx5="http://schemas.microsoft.com/office/drawing/2016/5/11/chartex" xmlns:cx6="http://schemas.microsoft.com/office/drawing/2016/5/12/chartex" xmlns:cx7="http://schemas.microsoft.com/office/drawing/2016/5/13/chartex" xmlns:cx8="http://schemas.microsoft.com/office/drawing/2016/5/14/chartex" xmlns:mc="http://schemas.openxmlformats.org/markup-compatibility/2006" xmlns:m="http://schemas.openxmlformats.org/officeDocument/2006/math" xmlns:aink="http://schemas.microsoft.com/office/drawing/2016/ink" xmlns:am3d="http://schemas.microsoft.com/office/drawing/2017/model3d" xmlns:oel="http://schemas.microsoft.com/office/2019/extlst" xmlns:r="http://schemas.openxmlformats.org/officeDocument/2006/relationships" xmlns:wp14="http://schemas.microsoft.com/office/word/2010/wordprocessingDrawing" xmlns:wp="http://schemas.openxmlformats.org/drawingml/2006/wordprocessingDrawing" xmlns:wpg="http://schemas.microsoft.com/office/word/2010/wordprocessingGroup" xmlns:wpi="http://schemas.microsoft.com/office/word/2010/wordprocessingInk" xmlns:wps="http://schemas.microsoft.com/office/word/2010/wordprocessingShape" xmlns:o="urn:schemas-microsoft-com:office:office" xmlns:v="urn:schemas-microsoft-com:vml" xmlns:w10="urn:schemas-microsoft-com:office:word" xmlns:w="http://schemas.openxmlformats.org/wordprocessingml/2006/main" xmlns:w14="http://schemas.microsoft.com/office/word/2010/wordml" xmlns:w15="http://schemas.microsoft.com/office/word/2012/wordml" xmlns:w16cex="http://schemas.microsoft.com/office/word/2018/wordml/cex" xmlns:w16cid="http://schemas.microsoft.com/office/word/2016/wordml/cid" xmlns:w16="http://schemas.microsoft.com/office/word/2018/wordml" xmlns:w16sdtdh="http://schemas.microsoft.com/office/word/2020/wordml/sdtdatahash" xmlns:w16sdtfl="http://schemas.microsoft.com/office/word/2024/wordml/sdtformatlock" xmlns:w16se="http://schemas.microsoft.com/office/word/2015/wordml/symex" xmlns:w16du="http://schemas.microsoft.com/office/word/2023/wordml/word16du" xmlns:wne="http://schemas.microsoft.com/office/word/2006/wordml" mc:Ignorable="w14 w15 w16se w16cid w16 w16cex w16sdtdh w16sdtfl w16du wp14">
   <w:abstractNum w:abstractNumId="0" w15:restartNumberingAfterBreak="0">
+    <w:nsid w:val="196C7414"/>
+    <w:multiLevelType w:val="multilevel"/>
+    <w:tmpl w:val="75D4E802"/>
+    <w:lvl w:ilvl="0">
+      <w:start w:val="1"/>
+      <w:numFmt w:val="bullet"/>
+      <w:lvlText w:val=""/>
+      <w:lvlJc w:val="left"/>
+      <w:pPr>
+        <w:tabs>
+          <w:tab w:val="num" w:pos="720"/>
+        </w:tabs>
+        <w:ind w:left="720" w:hanging="360"/>
+      </w:pPr>
+      <w:rPr>
+        <w:rFonts w:ascii="Symbol" w:hAnsi="Symbol" w:hint="default"/>
+        <w:sz w:val="20"/>
+      </w:rPr>
+    </w:lvl>
+    <w:lvl w:ilvl="1" w:tentative="1">
+      <w:start w:val="1"/>
+      <w:numFmt w:val="bullet"/>
+      <w:lvlText w:val="o"/>
+      <w:lvlJc w:val="left"/>
+      <w:pPr>
+        <w:tabs>
+          <w:tab w:val="num" w:pos="1440"/>
+        </w:tabs>
+        <w:ind w:left="1440" w:hanging="360"/>
+      </w:pPr>
+      <w:rPr>
+        <w:rFonts w:ascii="Courier New" w:hAnsi="Courier New" w:hint="default"/>
+        <w:sz w:val="20"/>
+      </w:rPr>
+    </w:lvl>
+    <w:lvl w:ilvl="2" w:tentative="1">
+      <w:start w:val="1"/>
+      <w:numFmt w:val="bullet"/>
+      <w:lvlText w:val=""/>
+      <w:lvlJc w:val="left"/>
+      <w:pPr>
+        <w:tabs>
+          <w:tab w:val="num" w:pos="2160"/>
+        </w:tabs>
+        <w:ind w:left="2160" w:hanging="360"/>
+      </w:pPr>
+      <w:rPr>
+        <w:rFonts w:ascii="Wingdings" w:hAnsi="Wingdings" w:hint="default"/>
+        <w:sz w:val="20"/>
+      </w:rPr>
+    </w:lvl>
+    <w:lvl w:ilvl="3" w:tentative="1">
+      <w:start w:val="1"/>
+      <w:numFmt w:val="bullet"/>
+      <w:lvlText w:val=""/>
+      <w:lvlJc w:val="left"/>
+      <w:pPr>
+        <w:tabs>
+          <w:tab w:val="num" w:pos="2880"/>
+        </w:tabs>
+        <w:ind w:left="2880" w:hanging="360"/>
+      </w:pPr>
+      <w:rPr>
+        <w:rFonts w:ascii="Wingdings" w:hAnsi="Wingdings" w:hint="default"/>
+        <w:sz w:val="20"/>
+      </w:rPr>
+    </w:lvl>
+    <w:lvl w:ilvl="4" w:tentative="1">
+      <w:start w:val="1"/>
+      <w:numFmt w:val="bullet"/>
+      <w:lvlText w:val=""/>
+      <w:lvlJc w:val="left"/>
+      <w:pPr>
+        <w:tabs>
+          <w:tab w:val="num" w:pos="3600"/>
+        </w:tabs>
+        <w:ind w:left="3600" w:hanging="360"/>
+      </w:pPr>
+      <w:rPr>
+        <w:rFonts w:ascii="Wingdings" w:hAnsi="Wingdings" w:hint="default"/>
+        <w:sz w:val="20"/>
+      </w:rPr>
+    </w:lvl>
+    <w:lvl w:ilvl="5" w:tentative="1">
+      <w:start w:val="1"/>
+      <w:numFmt w:val="bullet"/>
+      <w:lvlText w:val=""/>
+      <w:lvlJc w:val="left"/>
+      <w:pPr>
+        <w:tabs>
+          <w:tab w:val="num" w:pos="4320"/>
+        </w:tabs>
+        <w:ind w:left="4320" w:hanging="360"/>
+      </w:pPr>
+      <w:rPr>
+        <w:rFonts w:ascii="Wingdings" w:hAnsi="Wingdings" w:hint="default"/>
+        <w:sz w:val="20"/>
+      </w:rPr>
+    </w:lvl>
+    <w:lvl w:ilvl="6" w:tentative="1">
+      <w:start w:val="1"/>
+      <w:numFmt w:val="bullet"/>
+      <w:lvlText w:val=""/>
+      <w:lvlJc w:val="left"/>
+      <w:pPr>
+        <w:tabs>
+          <w:tab w:val="num" w:pos="5040"/>
+        </w:tabs>
+        <w:ind w:left="5040" w:hanging="360"/>
+      </w:pPr>
+      <w:rPr>
+        <w:rFonts w:ascii="Wingdings" w:hAnsi="Wingdings" w:hint="default"/>
+        <w:sz w:val="20"/>
+      </w:rPr>
+    </w:lvl>
+    <w:lvl w:ilvl="7" w:tentative="1">
+      <w:start w:val="1"/>
+      <w:numFmt w:val="bullet"/>
+      <w:lvlText w:val=""/>
+      <w:lvlJc w:val="left"/>
+      <w:pPr>
+        <w:tabs>
+          <w:tab w:val="num" w:pos="5760"/>
+        </w:tabs>
+        <w:ind w:left="5760" w:hanging="360"/>
+      </w:pPr>
+      <w:rPr>
+        <w:rFonts w:ascii="Wingdings" w:hAnsi="Wingdings" w:hint="default"/>
+        <w:sz w:val="20"/>
+      </w:rPr>
+    </w:lvl>
+    <w:lvl w:ilvl="8" w:tentative="1">
+      <w:start w:val="1"/>
+      <w:numFmt w:val="bullet"/>
+      <w:lvlText w:val=""/>
+      <w:lvlJc w:val="left"/>
+      <w:pPr>
+        <w:tabs>
+          <w:tab w:val="num" w:pos="6480"/>
+        </w:tabs>
+        <w:ind w:left="6480" w:hanging="360"/>
+      </w:pPr>
+      <w:rPr>
+        <w:rFonts w:ascii="Wingdings" w:hAnsi="Wingdings" w:hint="default"/>
+        <w:sz w:val="20"/>
+      </w:rPr>
+    </w:lvl>
+  </w:abstractNum>
+  <w:abstractNum w:abstractNumId="1" w15:restartNumberingAfterBreak="0">
     <w:nsid w:val="28841460"/>
     <w:multiLevelType w:val="multilevel"/>
     <w:tmpl w:val="C8086288"/>
@@ -12573,7 +13859,7 @@
       </w:pPr>
     </w:lvl>
   </w:abstractNum>
-  <w:abstractNum w:abstractNumId="1" w15:restartNumberingAfterBreak="0">
+  <w:abstractNum w:abstractNumId="2" w15:restartNumberingAfterBreak="0">
     <w:nsid w:val="30207A80"/>
     <w:multiLevelType w:val="multilevel"/>
     <w:tmpl w:val="AA8A12A0"/>
@@ -12690,7 +13976,7 @@
       </w:pPr>
     </w:lvl>
   </w:abstractNum>
-  <w:abstractNum w:abstractNumId="2" w15:restartNumberingAfterBreak="0">
+  <w:abstractNum w:abstractNumId="3" w15:restartNumberingAfterBreak="0">
     <w:nsid w:val="384E3DDD"/>
     <w:multiLevelType w:val="multilevel"/>
     <w:tmpl w:val="2C2E629C"/>
@@ -12839,7 +14125,7 @@
       </w:rPr>
     </w:lvl>
   </w:abstractNum>
-  <w:abstractNum w:abstractNumId="3" w15:restartNumberingAfterBreak="0">
+  <w:abstractNum w:abstractNumId="4" w15:restartNumberingAfterBreak="0">
     <w:nsid w:val="41AE6D06"/>
     <w:multiLevelType w:val="multilevel"/>
     <w:tmpl w:val="B840F1BA"/>
@@ -12988,7 +14274,7 @@
       </w:rPr>
     </w:lvl>
   </w:abstractNum>
-  <w:abstractNum w:abstractNumId="4" w15:restartNumberingAfterBreak="0">
+  <w:abstractNum w:abstractNumId="5" w15:restartNumberingAfterBreak="0">
     <w:nsid w:val="55863DC6"/>
     <w:multiLevelType w:val="hybridMultilevel"/>
     <w:tmpl w:val="2F484630"/>
@@ -13077,20 +14363,327 @@
       </w:pPr>
     </w:lvl>
   </w:abstractNum>
+  <w:abstractNum w:abstractNumId="6" w15:restartNumberingAfterBreak="0">
+    <w:nsid w:val="5E63518E"/>
+    <w:multiLevelType w:val="multilevel"/>
+    <w:tmpl w:val="75D4E802"/>
+    <w:lvl w:ilvl="0">
+      <w:start w:val="1"/>
+      <w:numFmt w:val="bullet"/>
+      <w:lvlText w:val=""/>
+      <w:lvlJc w:val="left"/>
+      <w:pPr>
+        <w:tabs>
+          <w:tab w:val="num" w:pos="720"/>
+        </w:tabs>
+        <w:ind w:left="720" w:hanging="360"/>
+      </w:pPr>
+      <w:rPr>
+        <w:rFonts w:ascii="Symbol" w:hAnsi="Symbol" w:hint="default"/>
+        <w:sz w:val="20"/>
+      </w:rPr>
+    </w:lvl>
+    <w:lvl w:ilvl="1" w:tentative="1">
+      <w:start w:val="1"/>
+      <w:numFmt w:val="bullet"/>
+      <w:lvlText w:val="o"/>
+      <w:lvlJc w:val="left"/>
+      <w:pPr>
+        <w:tabs>
+          <w:tab w:val="num" w:pos="1440"/>
+        </w:tabs>
+        <w:ind w:left="1440" w:hanging="360"/>
+      </w:pPr>
+      <w:rPr>
+        <w:rFonts w:ascii="Courier New" w:hAnsi="Courier New" w:hint="default"/>
+        <w:sz w:val="20"/>
+      </w:rPr>
+    </w:lvl>
+    <w:lvl w:ilvl="2" w:tentative="1">
+      <w:start w:val="1"/>
+      <w:numFmt w:val="bullet"/>
+      <w:lvlText w:val=""/>
+      <w:lvlJc w:val="left"/>
+      <w:pPr>
+        <w:tabs>
+          <w:tab w:val="num" w:pos="2160"/>
+        </w:tabs>
+        <w:ind w:left="2160" w:hanging="360"/>
+      </w:pPr>
+      <w:rPr>
+        <w:rFonts w:ascii="Wingdings" w:hAnsi="Wingdings" w:hint="default"/>
+        <w:sz w:val="20"/>
+      </w:rPr>
+    </w:lvl>
+    <w:lvl w:ilvl="3" w:tentative="1">
+      <w:start w:val="1"/>
+      <w:numFmt w:val="bullet"/>
+      <w:lvlText w:val=""/>
+      <w:lvlJc w:val="left"/>
+      <w:pPr>
+        <w:tabs>
+          <w:tab w:val="num" w:pos="2880"/>
+        </w:tabs>
+        <w:ind w:left="2880" w:hanging="360"/>
+      </w:pPr>
+      <w:rPr>
+        <w:rFonts w:ascii="Wingdings" w:hAnsi="Wingdings" w:hint="default"/>
+        <w:sz w:val="20"/>
+      </w:rPr>
+    </w:lvl>
+    <w:lvl w:ilvl="4" w:tentative="1">
+      <w:start w:val="1"/>
+      <w:numFmt w:val="bullet"/>
+      <w:lvlText w:val=""/>
+      <w:lvlJc w:val="left"/>
+      <w:pPr>
+        <w:tabs>
+          <w:tab w:val="num" w:pos="3600"/>
+        </w:tabs>
+        <w:ind w:left="3600" w:hanging="360"/>
+      </w:pPr>
+      <w:rPr>
+        <w:rFonts w:ascii="Wingdings" w:hAnsi="Wingdings" w:hint="default"/>
+        <w:sz w:val="20"/>
+      </w:rPr>
+    </w:lvl>
+    <w:lvl w:ilvl="5" w:tentative="1">
+      <w:start w:val="1"/>
+      <w:numFmt w:val="bullet"/>
+      <w:lvlText w:val=""/>
+      <w:lvlJc w:val="left"/>
+      <w:pPr>
+        <w:tabs>
+          <w:tab w:val="num" w:pos="4320"/>
+        </w:tabs>
+        <w:ind w:left="4320" w:hanging="360"/>
+      </w:pPr>
+      <w:rPr>
+        <w:rFonts w:ascii="Wingdings" w:hAnsi="Wingdings" w:hint="default"/>
+        <w:sz w:val="20"/>
+      </w:rPr>
+    </w:lvl>
+    <w:lvl w:ilvl="6" w:tentative="1">
+      <w:start w:val="1"/>
+      <w:numFmt w:val="bullet"/>
+      <w:lvlText w:val=""/>
+      <w:lvlJc w:val="left"/>
+      <w:pPr>
+        <w:tabs>
+          <w:tab w:val="num" w:pos="5040"/>
+        </w:tabs>
+        <w:ind w:left="5040" w:hanging="360"/>
+      </w:pPr>
+      <w:rPr>
+        <w:rFonts w:ascii="Wingdings" w:hAnsi="Wingdings" w:hint="default"/>
+        <w:sz w:val="20"/>
+      </w:rPr>
+    </w:lvl>
+    <w:lvl w:ilvl="7" w:tentative="1">
+      <w:start w:val="1"/>
+      <w:numFmt w:val="bullet"/>
+      <w:lvlText w:val=""/>
+      <w:lvlJc w:val="left"/>
+      <w:pPr>
+        <w:tabs>
+          <w:tab w:val="num" w:pos="5760"/>
+        </w:tabs>
+        <w:ind w:left="5760" w:hanging="360"/>
+      </w:pPr>
+      <w:rPr>
+        <w:rFonts w:ascii="Wingdings" w:hAnsi="Wingdings" w:hint="default"/>
+        <w:sz w:val="20"/>
+      </w:rPr>
+    </w:lvl>
+    <w:lvl w:ilvl="8" w:tentative="1">
+      <w:start w:val="1"/>
+      <w:numFmt w:val="bullet"/>
+      <w:lvlText w:val=""/>
+      <w:lvlJc w:val="left"/>
+      <w:pPr>
+        <w:tabs>
+          <w:tab w:val="num" w:pos="6480"/>
+        </w:tabs>
+        <w:ind w:left="6480" w:hanging="360"/>
+      </w:pPr>
+      <w:rPr>
+        <w:rFonts w:ascii="Wingdings" w:hAnsi="Wingdings" w:hint="default"/>
+        <w:sz w:val="20"/>
+      </w:rPr>
+    </w:lvl>
+  </w:abstractNum>
+  <w:abstractNum w:abstractNumId="7" w15:restartNumberingAfterBreak="0">
+    <w:nsid w:val="776D52AF"/>
+    <w:multiLevelType w:val="multilevel"/>
+    <w:tmpl w:val="75D4E802"/>
+    <w:lvl w:ilvl="0">
+      <w:start w:val="1"/>
+      <w:numFmt w:val="bullet"/>
+      <w:lvlText w:val=""/>
+      <w:lvlJc w:val="left"/>
+      <w:pPr>
+        <w:tabs>
+          <w:tab w:val="num" w:pos="720"/>
+        </w:tabs>
+        <w:ind w:left="720" w:hanging="360"/>
+      </w:pPr>
+      <w:rPr>
+        <w:rFonts w:ascii="Symbol" w:hAnsi="Symbol" w:hint="default"/>
+        <w:sz w:val="20"/>
+      </w:rPr>
+    </w:lvl>
+    <w:lvl w:ilvl="1" w:tentative="1">
+      <w:start w:val="1"/>
+      <w:numFmt w:val="bullet"/>
+      <w:lvlText w:val="o"/>
+      <w:lvlJc w:val="left"/>
+      <w:pPr>
+        <w:tabs>
+          <w:tab w:val="num" w:pos="1440"/>
+        </w:tabs>
+        <w:ind w:left="1440" w:hanging="360"/>
+      </w:pPr>
+      <w:rPr>
+        <w:rFonts w:ascii="Courier New" w:hAnsi="Courier New" w:hint="default"/>
+        <w:sz w:val="20"/>
+      </w:rPr>
+    </w:lvl>
+    <w:lvl w:ilvl="2" w:tentative="1">
+      <w:start w:val="1"/>
+      <w:numFmt w:val="bullet"/>
+      <w:lvlText w:val=""/>
+      <w:lvlJc w:val="left"/>
+      <w:pPr>
+        <w:tabs>
+          <w:tab w:val="num" w:pos="2160"/>
+        </w:tabs>
+        <w:ind w:left="2160" w:hanging="360"/>
+      </w:pPr>
+      <w:rPr>
+        <w:rFonts w:ascii="Wingdings" w:hAnsi="Wingdings" w:hint="default"/>
+        <w:sz w:val="20"/>
+      </w:rPr>
+    </w:lvl>
+    <w:lvl w:ilvl="3" w:tentative="1">
+      <w:start w:val="1"/>
+      <w:numFmt w:val="bullet"/>
+      <w:lvlText w:val=""/>
+      <w:lvlJc w:val="left"/>
+      <w:pPr>
+        <w:tabs>
+          <w:tab w:val="num" w:pos="2880"/>
+        </w:tabs>
+        <w:ind w:left="2880" w:hanging="360"/>
+      </w:pPr>
+      <w:rPr>
+        <w:rFonts w:ascii="Wingdings" w:hAnsi="Wingdings" w:hint="default"/>
+        <w:sz w:val="20"/>
+      </w:rPr>
+    </w:lvl>
+    <w:lvl w:ilvl="4" w:tentative="1">
+      <w:start w:val="1"/>
+      <w:numFmt w:val="bullet"/>
+      <w:lvlText w:val=""/>
+      <w:lvlJc w:val="left"/>
+      <w:pPr>
+        <w:tabs>
+          <w:tab w:val="num" w:pos="3600"/>
+        </w:tabs>
+        <w:ind w:left="3600" w:hanging="360"/>
+      </w:pPr>
+      <w:rPr>
+        <w:rFonts w:ascii="Wingdings" w:hAnsi="Wingdings" w:hint="default"/>
+        <w:sz w:val="20"/>
+      </w:rPr>
+    </w:lvl>
+    <w:lvl w:ilvl="5" w:tentative="1">
+      <w:start w:val="1"/>
+      <w:numFmt w:val="bullet"/>
+      <w:lvlText w:val=""/>
+      <w:lvlJc w:val="left"/>
+      <w:pPr>
+        <w:tabs>
+          <w:tab w:val="num" w:pos="4320"/>
+        </w:tabs>
+        <w:ind w:left="4320" w:hanging="360"/>
+      </w:pPr>
+      <w:rPr>
+        <w:rFonts w:ascii="Wingdings" w:hAnsi="Wingdings" w:hint="default"/>
+        <w:sz w:val="20"/>
+      </w:rPr>
+    </w:lvl>
+    <w:lvl w:ilvl="6" w:tentative="1">
+      <w:start w:val="1"/>
+      <w:numFmt w:val="bullet"/>
+      <w:lvlText w:val=""/>
+      <w:lvlJc w:val="left"/>
+      <w:pPr>
+        <w:tabs>
+          <w:tab w:val="num" w:pos="5040"/>
+        </w:tabs>
+        <w:ind w:left="5040" w:hanging="360"/>
+      </w:pPr>
+      <w:rPr>
+        <w:rFonts w:ascii="Wingdings" w:hAnsi="Wingdings" w:hint="default"/>
+        <w:sz w:val="20"/>
+      </w:rPr>
+    </w:lvl>
+    <w:lvl w:ilvl="7" w:tentative="1">
+      <w:start w:val="1"/>
+      <w:numFmt w:val="bullet"/>
+      <w:lvlText w:val=""/>
+      <w:lvlJc w:val="left"/>
+      <w:pPr>
+        <w:tabs>
+          <w:tab w:val="num" w:pos="5760"/>
+        </w:tabs>
+        <w:ind w:left="5760" w:hanging="360"/>
+      </w:pPr>
+      <w:rPr>
+        <w:rFonts w:ascii="Wingdings" w:hAnsi="Wingdings" w:hint="default"/>
+        <w:sz w:val="20"/>
+      </w:rPr>
+    </w:lvl>
+    <w:lvl w:ilvl="8" w:tentative="1">
+      <w:start w:val="1"/>
+      <w:numFmt w:val="bullet"/>
+      <w:lvlText w:val=""/>
+      <w:lvlJc w:val="left"/>
+      <w:pPr>
+        <w:tabs>
+          <w:tab w:val="num" w:pos="6480"/>
+        </w:tabs>
+        <w:ind w:left="6480" w:hanging="360"/>
+      </w:pPr>
+      <w:rPr>
+        <w:rFonts w:ascii="Wingdings" w:hAnsi="Wingdings" w:hint="default"/>
+        <w:sz w:val="20"/>
+      </w:rPr>
+    </w:lvl>
+  </w:abstractNum>
   <w:num w:numId="1" w16cid:durableId="291636674">
+    <w:abstractNumId w:val="5"/>
+  </w:num>
+  <w:num w:numId="2" w16cid:durableId="53552216">
+    <w:abstractNumId w:val="2"/>
+  </w:num>
+  <w:num w:numId="3" w16cid:durableId="1259097058">
+    <w:abstractNumId w:val="3"/>
+  </w:num>
+  <w:num w:numId="4" w16cid:durableId="73017351">
     <w:abstractNumId w:val="4"/>
   </w:num>
-  <w:num w:numId="2" w16cid:durableId="53552216">
+  <w:num w:numId="5" w16cid:durableId="828978965">
     <w:abstractNumId w:val="1"/>
   </w:num>
-  <w:num w:numId="3" w16cid:durableId="1259097058">
-    <w:abstractNumId w:val="2"/>
+  <w:num w:numId="6" w16cid:durableId="697967689">
+    <w:abstractNumId w:val="7"/>
   </w:num>
-  <w:num w:numId="4" w16cid:durableId="73017351">
-    <w:abstractNumId w:val="3"/>
+  <w:num w:numId="7" w16cid:durableId="1991857785">
+    <w:abstractNumId w:val="0"/>
   </w:num>
-  <w:num w:numId="5" w16cid:durableId="828978965">
-    <w:abstractNumId w:val="0"/>
+  <w:num w:numId="8" w16cid:durableId="1350571167">
+    <w:abstractNumId w:val="6"/>
   </w:num>
 </w:numbering>
 </file>

</xml_diff>

<commit_message>
JS - DOM Problems
</commit_message>
<xml_diff>
--- a/Java Scripts.docx
+++ b/Java Scripts.docx
@@ -13584,6 +13584,111 @@
           <w:lang w:val="en-US"/>
         </w:rPr>
       </w:pPr>
+      <w:r>
+        <w:rPr>
+          <w:lang w:val="en-US"/>
+        </w:rPr>
+        <w:lastRenderedPageBreak/>
+        <w:drawing>
+          <wp:inline distT="0" distB="0" distL="0" distR="0" wp14:anchorId="0FC28CB3" wp14:editId="3EC97BE1">
+            <wp:extent cx="5731510" cy="3758565"/>
+            <wp:effectExtent l="0" t="0" r="0" b="635"/>
+            <wp:docPr id="897428776" name="Picture 1"/>
+            <wp:cNvGraphicFramePr>
+              <a:graphicFrameLocks xmlns:a="http://schemas.openxmlformats.org/drawingml/2006/main" noChangeAspect="1"/>
+            </wp:cNvGraphicFramePr>
+            <a:graphic xmlns:a="http://schemas.openxmlformats.org/drawingml/2006/main">
+              <a:graphicData uri="http://schemas.openxmlformats.org/drawingml/2006/picture">
+                <pic:pic xmlns:pic="http://schemas.openxmlformats.org/drawingml/2006/picture">
+                  <pic:nvPicPr>
+                    <pic:cNvPr id="897428776" name=""/>
+                    <pic:cNvPicPr/>
+                  </pic:nvPicPr>
+                  <pic:blipFill>
+                    <a:blip r:embed="rId24"/>
+                    <a:stretch>
+                      <a:fillRect/>
+                    </a:stretch>
+                  </pic:blipFill>
+                  <pic:spPr>
+                    <a:xfrm>
+                      <a:off x="0" y="0"/>
+                      <a:ext cx="5731510" cy="3758565"/>
+                    </a:xfrm>
+                    <a:prstGeom prst="rect">
+                      <a:avLst/>
+                    </a:prstGeom>
+                  </pic:spPr>
+                </pic:pic>
+              </a:graphicData>
+            </a:graphic>
+          </wp:inline>
+        </w:drawing>
+      </w:r>
+    </w:p>
+    <w:p>
+      <w:pPr>
+        <w:ind w:left="-567" w:firstLine="567"/>
+        <w:rPr>
+          <w:lang w:val="en-US"/>
+        </w:rPr>
+      </w:pPr>
+    </w:p>
+    <w:p>
+      <w:pPr>
+        <w:ind w:left="-567" w:firstLine="567"/>
+        <w:rPr>
+          <w:lang w:val="en-US"/>
+        </w:rPr>
+      </w:pPr>
+    </w:p>
+    <w:p>
+      <w:pPr>
+        <w:ind w:left="-567" w:firstLine="567"/>
+        <w:rPr>
+          <w:lang w:val="en-US"/>
+        </w:rPr>
+      </w:pPr>
+      <w:r>
+        <w:rPr>
+          <w:lang w:val="en-US"/>
+        </w:rPr>
+        <w:drawing>
+          <wp:inline distT="0" distB="0" distL="0" distR="0" wp14:anchorId="30788F7D" wp14:editId="67673546">
+            <wp:extent cx="5731510" cy="3569970"/>
+            <wp:effectExtent l="0" t="0" r="0" b="0"/>
+            <wp:docPr id="223996315" name="Picture 1"/>
+            <wp:cNvGraphicFramePr>
+              <a:graphicFrameLocks xmlns:a="http://schemas.openxmlformats.org/drawingml/2006/main" noChangeAspect="1"/>
+            </wp:cNvGraphicFramePr>
+            <a:graphic xmlns:a="http://schemas.openxmlformats.org/drawingml/2006/main">
+              <a:graphicData uri="http://schemas.openxmlformats.org/drawingml/2006/picture">
+                <pic:pic xmlns:pic="http://schemas.openxmlformats.org/drawingml/2006/picture">
+                  <pic:nvPicPr>
+                    <pic:cNvPr id="223996315" name=""/>
+                    <pic:cNvPicPr/>
+                  </pic:nvPicPr>
+                  <pic:blipFill>
+                    <a:blip r:embed="rId25"/>
+                    <a:stretch>
+                      <a:fillRect/>
+                    </a:stretch>
+                  </pic:blipFill>
+                  <pic:spPr>
+                    <a:xfrm>
+                      <a:off x="0" y="0"/>
+                      <a:ext cx="5731510" cy="3569970"/>
+                    </a:xfrm>
+                    <a:prstGeom prst="rect">
+                      <a:avLst/>
+                    </a:prstGeom>
+                  </pic:spPr>
+                </pic:pic>
+              </a:graphicData>
+            </a:graphic>
+          </wp:inline>
+        </w:drawing>
+      </w:r>
     </w:p>
     <w:sectPr>
       <w:pgSz w:w="11906" w:h="16838"/>

</xml_diff>

<commit_message>
JS - DOM - Advance
</commit_message>
<xml_diff>
--- a/Java Scripts.docx
+++ b/Java Scripts.docx
@@ -13653,6 +13653,7 @@
         <w:rPr>
           <w:lang w:val="en-US"/>
         </w:rPr>
+        <w:lastRenderedPageBreak/>
         <w:drawing>
           <wp:inline distT="0" distB="0" distL="0" distR="0" wp14:anchorId="30788F7D" wp14:editId="67673546">
             <wp:extent cx="5731510" cy="3569970"/>
@@ -13678,6 +13679,53 @@
                     <a:xfrm>
                       <a:off x="0" y="0"/>
                       <a:ext cx="5731510" cy="3569970"/>
+                    </a:xfrm>
+                    <a:prstGeom prst="rect">
+                      <a:avLst/>
+                    </a:prstGeom>
+                  </pic:spPr>
+                </pic:pic>
+              </a:graphicData>
+            </a:graphic>
+          </wp:inline>
+        </w:drawing>
+      </w:r>
+      <w:r>
+        <w:rPr>
+          <w:noProof/>
+          <w:lang w:val="en-US"/>
+        </w:rPr>
+        <w:drawing>
+          <wp:inline distT="0" distB="0" distL="0" distR="0" wp14:anchorId="78ABE62B" wp14:editId="013AE809">
+            <wp:extent cx="5731510" cy="4280535"/>
+            <wp:effectExtent l="0" t="0" r="0" b="0"/>
+            <wp:docPr id="572973231" name="Picture 4"/>
+            <wp:cNvGraphicFramePr>
+              <a:graphicFrameLocks xmlns:a="http://schemas.openxmlformats.org/drawingml/2006/main" noChangeAspect="1"/>
+            </wp:cNvGraphicFramePr>
+            <a:graphic xmlns:a="http://schemas.openxmlformats.org/drawingml/2006/main">
+              <a:graphicData uri="http://schemas.openxmlformats.org/drawingml/2006/picture">
+                <pic:pic xmlns:pic="http://schemas.openxmlformats.org/drawingml/2006/picture">
+                  <pic:nvPicPr>
+                    <pic:cNvPr id="572973231" name="Picture 572973231"/>
+                    <pic:cNvPicPr/>
+                  </pic:nvPicPr>
+                  <pic:blipFill>
+                    <a:blip r:embed="rId26" cstate="print">
+                      <a:extLst>
+                        <a:ext uri="{28A0092B-C50C-407E-A947-70E740481C1C}">
+                          <a14:useLocalDpi xmlns:a14="http://schemas.microsoft.com/office/drawing/2010/main" val="0"/>
+                        </a:ext>
+                      </a:extLst>
+                    </a:blip>
+                    <a:stretch>
+                      <a:fillRect/>
+                    </a:stretch>
+                  </pic:blipFill>
+                  <pic:spPr>
+                    <a:xfrm>
+                      <a:off x="0" y="0"/>
+                      <a:ext cx="5731510" cy="4280535"/>
                     </a:xfrm>
                     <a:prstGeom prst="rect">
                       <a:avLst/>

</xml_diff>

<commit_message>
JS - Event and Event Objects
</commit_message>
<xml_diff>
--- a/Java Scripts.docx
+++ b/Java Scripts.docx
@@ -13737,6 +13737,1525 @@
           </wp:inline>
         </w:drawing>
       </w:r>
+    </w:p>
+    <w:p>
+      <w:pPr>
+        <w:ind w:left="-567" w:firstLine="567"/>
+        <w:rPr>
+          <w:lang w:val="en-US"/>
+        </w:rPr>
+      </w:pPr>
+    </w:p>
+    <w:p>
+      <w:pPr>
+        <w:ind w:left="-567" w:firstLine="567"/>
+        <w:rPr>
+          <w:lang w:val="en-US"/>
+        </w:rPr>
+      </w:pPr>
+    </w:p>
+    <w:p>
+      <w:pPr>
+        <w:ind w:left="-567" w:firstLine="567"/>
+        <w:rPr>
+          <w:lang w:val="en-US"/>
+        </w:rPr>
+      </w:pPr>
+    </w:p>
+    <w:p>
+      <w:pPr>
+        <w:ind w:left="-567" w:firstLine="567"/>
+        <w:rPr>
+          <w:lang w:val="en-US"/>
+        </w:rPr>
+      </w:pPr>
+      <w:r>
+        <w:rPr>
+          <w:lang w:val="en-US"/>
+        </w:rPr>
+        <w:lastRenderedPageBreak/>
+        <w:t>Events:</w:t>
+      </w:r>
+    </w:p>
+    <w:p>
+      <w:pPr>
+        <w:pStyle w:val="p1"/>
+      </w:pPr>
+      <w:r>
+        <w:t xml:space="preserve">In JavaScript, </w:t>
+      </w:r>
+      <w:r>
+        <w:rPr>
+          <w:rStyle w:val="s1"/>
+          <w:b/>
+          <w:bCs/>
+        </w:rPr>
+        <w:t>events</w:t>
+      </w:r>
+      <w:r>
+        <w:t xml:space="preserve"> are actions that happen in the browser—such as a user clicking a button, typing on the keyboard, submitting a form, or the page finishing loading. JavaScript can “listen” for these events and run code when they occur.</w:t>
+      </w:r>
+    </w:p>
+    <w:p>
+      <w:pPr>
+        <w:pStyle w:val="Heading3"/>
+      </w:pPr>
+      <w:r>
+        <w:rPr>
+          <w:rStyle w:val="s1"/>
+        </w:rPr>
+        <w:t>Common JavaScript events</w:t>
+      </w:r>
+    </w:p>
+    <w:tbl>
+      <w:tblPr>
+        <w:tblW w:w="5000" w:type="pct"/>
+        <w:tblBorders>
+          <w:top w:val="single" w:sz="6" w:space="0" w:color="auto"/>
+          <w:left w:val="single" w:sz="6" w:space="0" w:color="auto"/>
+          <w:bottom w:val="single" w:sz="6" w:space="0" w:color="auto"/>
+          <w:right w:val="single" w:sz="6" w:space="0" w:color="auto"/>
+        </w:tblBorders>
+        <w:tblCellMar>
+          <w:top w:w="160" w:type="dxa"/>
+          <w:left w:w="160" w:type="dxa"/>
+          <w:bottom w:w="160" w:type="dxa"/>
+          <w:right w:w="160" w:type="dxa"/>
+        </w:tblCellMar>
+        <w:tblLook w:val="04A0" w:firstRow="1" w:lastRow="0" w:firstColumn="1" w:lastColumn="0" w:noHBand="0" w:noVBand="1"/>
+      </w:tblPr>
+      <w:tblGrid>
+        <w:gridCol w:w="3421"/>
+        <w:gridCol w:w="5589"/>
+      </w:tblGrid>
+      <w:tr>
+        <w:trPr>
+          <w:tblHeader/>
+        </w:trPr>
+        <w:tc>
+          <w:tcPr>
+            <w:tcW w:w="0" w:type="auto"/>
+            <w:tcBorders>
+              <w:top w:val="single" w:sz="6" w:space="0" w:color="auto"/>
+              <w:left w:val="single" w:sz="6" w:space="0" w:color="auto"/>
+              <w:bottom w:val="single" w:sz="6" w:space="0" w:color="auto"/>
+              <w:right w:val="single" w:sz="6" w:space="0" w:color="auto"/>
+            </w:tcBorders>
+            <w:noWrap/>
+            <w:tcMar>
+              <w:top w:w="120" w:type="dxa"/>
+              <w:left w:w="180" w:type="dxa"/>
+              <w:bottom w:w="120" w:type="dxa"/>
+              <w:right w:w="180" w:type="dxa"/>
+            </w:tcMar>
+            <w:vAlign w:val="center"/>
+            <w:hideMark/>
+          </w:tcPr>
+          <w:p>
+            <w:pPr>
+              <w:spacing w:before="100" w:beforeAutospacing="1" w:after="100" w:afterAutospacing="1" w:line="240" w:lineRule="auto"/>
+              <w:jc w:val="center"/>
+              <w:rPr>
+                <w:rFonts w:ascii="Times New Roman" w:eastAsia="Times New Roman" w:hAnsi="Times New Roman" w:cs="Times New Roman"/>
+                <w:b/>
+                <w:bCs/>
+                <w:kern w:val="0"/>
+                <w:lang w:eastAsia="en-GB"/>
+                <w14:ligatures w14:val="none"/>
+              </w:rPr>
+            </w:pPr>
+            <w:r>
+              <w:rPr>
+                <w:rFonts w:ascii="Times New Roman" w:eastAsia="Times New Roman" w:hAnsi="Times New Roman" w:cs="Times New Roman"/>
+                <w:b/>
+                <w:bCs/>
+                <w:kern w:val="0"/>
+                <w:lang w:eastAsia="en-GB"/>
+                <w14:ligatures w14:val="none"/>
+              </w:rPr>
+              <w:t>Event</w:t>
+            </w:r>
+          </w:p>
+        </w:tc>
+        <w:tc>
+          <w:tcPr>
+            <w:tcW w:w="0" w:type="auto"/>
+            <w:tcBorders>
+              <w:top w:val="single" w:sz="6" w:space="0" w:color="auto"/>
+              <w:left w:val="single" w:sz="6" w:space="0" w:color="auto"/>
+              <w:bottom w:val="single" w:sz="6" w:space="0" w:color="auto"/>
+              <w:right w:val="single" w:sz="6" w:space="0" w:color="auto"/>
+            </w:tcBorders>
+            <w:noWrap/>
+            <w:tcMar>
+              <w:top w:w="120" w:type="dxa"/>
+              <w:left w:w="180" w:type="dxa"/>
+              <w:bottom w:w="120" w:type="dxa"/>
+              <w:right w:w="180" w:type="dxa"/>
+            </w:tcMar>
+            <w:vAlign w:val="center"/>
+            <w:hideMark/>
+          </w:tcPr>
+          <w:p>
+            <w:pPr>
+              <w:spacing w:before="100" w:beforeAutospacing="1" w:after="100" w:afterAutospacing="1" w:line="240" w:lineRule="auto"/>
+              <w:jc w:val="center"/>
+              <w:rPr>
+                <w:rFonts w:ascii="Times New Roman" w:eastAsia="Times New Roman" w:hAnsi="Times New Roman" w:cs="Times New Roman"/>
+                <w:b/>
+                <w:bCs/>
+                <w:kern w:val="0"/>
+                <w:lang w:eastAsia="en-GB"/>
+                <w14:ligatures w14:val="none"/>
+              </w:rPr>
+            </w:pPr>
+            <w:r>
+              <w:rPr>
+                <w:rFonts w:ascii="Times New Roman" w:eastAsia="Times New Roman" w:hAnsi="Times New Roman" w:cs="Times New Roman"/>
+                <w:b/>
+                <w:bCs/>
+                <w:kern w:val="0"/>
+                <w:lang w:eastAsia="en-GB"/>
+                <w14:ligatures w14:val="none"/>
+              </w:rPr>
+              <w:t>Happens when</w:t>
+            </w:r>
+          </w:p>
+        </w:tc>
+      </w:tr>
+      <w:tr>
+        <w:tc>
+          <w:tcPr>
+            <w:tcW w:w="0" w:type="auto"/>
+            <w:tcBorders>
+              <w:top w:val="single" w:sz="6" w:space="0" w:color="auto"/>
+              <w:left w:val="single" w:sz="6" w:space="0" w:color="auto"/>
+              <w:bottom w:val="single" w:sz="6" w:space="0" w:color="auto"/>
+              <w:right w:val="single" w:sz="6" w:space="0" w:color="auto"/>
+            </w:tcBorders>
+            <w:noWrap/>
+            <w:tcMar>
+              <w:top w:w="120" w:type="dxa"/>
+              <w:left w:w="180" w:type="dxa"/>
+              <w:bottom w:w="120" w:type="dxa"/>
+              <w:right w:w="180" w:type="dxa"/>
+            </w:tcMar>
+            <w:vAlign w:val="center"/>
+            <w:hideMark/>
+          </w:tcPr>
+          <w:p>
+            <w:pPr>
+              <w:spacing w:before="100" w:beforeAutospacing="1" w:after="100" w:afterAutospacing="1" w:line="240" w:lineRule="auto"/>
+              <w:rPr>
+                <w:rFonts w:ascii="Times New Roman" w:eastAsia="Times New Roman" w:hAnsi="Times New Roman" w:cs="Times New Roman"/>
+                <w:kern w:val="0"/>
+                <w:lang w:eastAsia="en-GB"/>
+                <w14:ligatures w14:val="none"/>
+              </w:rPr>
+            </w:pPr>
+            <w:r>
+              <w:rPr>
+                <w:rFonts w:ascii="Courier New" w:eastAsia="Times New Roman" w:hAnsi="Courier New" w:cs="Courier New"/>
+                <w:kern w:val="0"/>
+                <w:sz w:val="20"/>
+                <w:szCs w:val="20"/>
+                <w:lang w:eastAsia="en-GB"/>
+                <w14:ligatures w14:val="none"/>
+              </w:rPr>
+              <w:t>click</w:t>
+            </w:r>
+          </w:p>
+        </w:tc>
+        <w:tc>
+          <w:tcPr>
+            <w:tcW w:w="0" w:type="auto"/>
+            <w:tcBorders>
+              <w:top w:val="single" w:sz="6" w:space="0" w:color="auto"/>
+              <w:left w:val="single" w:sz="6" w:space="0" w:color="auto"/>
+              <w:bottom w:val="single" w:sz="6" w:space="0" w:color="auto"/>
+              <w:right w:val="single" w:sz="6" w:space="0" w:color="auto"/>
+            </w:tcBorders>
+            <w:noWrap/>
+            <w:tcMar>
+              <w:top w:w="120" w:type="dxa"/>
+              <w:left w:w="180" w:type="dxa"/>
+              <w:bottom w:w="120" w:type="dxa"/>
+              <w:right w:w="180" w:type="dxa"/>
+            </w:tcMar>
+            <w:vAlign w:val="center"/>
+            <w:hideMark/>
+          </w:tcPr>
+          <w:p>
+            <w:pPr>
+              <w:spacing w:before="100" w:beforeAutospacing="1" w:after="100" w:afterAutospacing="1" w:line="240" w:lineRule="auto"/>
+              <w:rPr>
+                <w:rFonts w:ascii="Times New Roman" w:eastAsia="Times New Roman" w:hAnsi="Times New Roman" w:cs="Times New Roman"/>
+                <w:kern w:val="0"/>
+                <w:lang w:eastAsia="en-GB"/>
+                <w14:ligatures w14:val="none"/>
+              </w:rPr>
+            </w:pPr>
+            <w:r>
+              <w:rPr>
+                <w:rFonts w:ascii="Times New Roman" w:eastAsia="Times New Roman" w:hAnsi="Times New Roman" w:cs="Times New Roman"/>
+                <w:kern w:val="0"/>
+                <w:lang w:eastAsia="en-GB"/>
+                <w14:ligatures w14:val="none"/>
+              </w:rPr>
+              <w:t>User clicks an element</w:t>
+            </w:r>
+          </w:p>
+        </w:tc>
+      </w:tr>
+      <w:tr>
+        <w:tc>
+          <w:tcPr>
+            <w:tcW w:w="0" w:type="auto"/>
+            <w:tcBorders>
+              <w:top w:val="single" w:sz="6" w:space="0" w:color="auto"/>
+              <w:left w:val="single" w:sz="6" w:space="0" w:color="auto"/>
+              <w:bottom w:val="single" w:sz="6" w:space="0" w:color="auto"/>
+              <w:right w:val="single" w:sz="6" w:space="0" w:color="auto"/>
+            </w:tcBorders>
+            <w:noWrap/>
+            <w:tcMar>
+              <w:top w:w="120" w:type="dxa"/>
+              <w:left w:w="180" w:type="dxa"/>
+              <w:bottom w:w="120" w:type="dxa"/>
+              <w:right w:w="180" w:type="dxa"/>
+            </w:tcMar>
+            <w:vAlign w:val="center"/>
+            <w:hideMark/>
+          </w:tcPr>
+          <w:p>
+            <w:pPr>
+              <w:spacing w:before="100" w:beforeAutospacing="1" w:after="100" w:afterAutospacing="1" w:line="240" w:lineRule="auto"/>
+              <w:rPr>
+                <w:rFonts w:ascii="Times New Roman" w:eastAsia="Times New Roman" w:hAnsi="Times New Roman" w:cs="Times New Roman"/>
+                <w:kern w:val="0"/>
+                <w:lang w:eastAsia="en-GB"/>
+                <w14:ligatures w14:val="none"/>
+              </w:rPr>
+            </w:pPr>
+            <w:proofErr w:type="spellStart"/>
+            <w:r>
+              <w:rPr>
+                <w:rFonts w:ascii="Courier New" w:eastAsia="Times New Roman" w:hAnsi="Courier New" w:cs="Courier New"/>
+                <w:kern w:val="0"/>
+                <w:sz w:val="20"/>
+                <w:szCs w:val="20"/>
+                <w:lang w:eastAsia="en-GB"/>
+                <w14:ligatures w14:val="none"/>
+              </w:rPr>
+              <w:t>dblclick</w:t>
+            </w:r>
+            <w:proofErr w:type="spellEnd"/>
+          </w:p>
+        </w:tc>
+        <w:tc>
+          <w:tcPr>
+            <w:tcW w:w="0" w:type="auto"/>
+            <w:tcBorders>
+              <w:top w:val="single" w:sz="6" w:space="0" w:color="auto"/>
+              <w:left w:val="single" w:sz="6" w:space="0" w:color="auto"/>
+              <w:bottom w:val="single" w:sz="6" w:space="0" w:color="auto"/>
+              <w:right w:val="single" w:sz="6" w:space="0" w:color="auto"/>
+            </w:tcBorders>
+            <w:noWrap/>
+            <w:tcMar>
+              <w:top w:w="120" w:type="dxa"/>
+              <w:left w:w="180" w:type="dxa"/>
+              <w:bottom w:w="120" w:type="dxa"/>
+              <w:right w:w="180" w:type="dxa"/>
+            </w:tcMar>
+            <w:vAlign w:val="center"/>
+            <w:hideMark/>
+          </w:tcPr>
+          <w:p>
+            <w:pPr>
+              <w:spacing w:before="100" w:beforeAutospacing="1" w:after="100" w:afterAutospacing="1" w:line="240" w:lineRule="auto"/>
+              <w:rPr>
+                <w:rFonts w:ascii="Times New Roman" w:eastAsia="Times New Roman" w:hAnsi="Times New Roman" w:cs="Times New Roman"/>
+                <w:kern w:val="0"/>
+                <w:lang w:eastAsia="en-GB"/>
+                <w14:ligatures w14:val="none"/>
+              </w:rPr>
+            </w:pPr>
+            <w:r>
+              <w:rPr>
+                <w:rFonts w:ascii="Times New Roman" w:eastAsia="Times New Roman" w:hAnsi="Times New Roman" w:cs="Times New Roman"/>
+                <w:kern w:val="0"/>
+                <w:lang w:eastAsia="en-GB"/>
+                <w14:ligatures w14:val="none"/>
+              </w:rPr>
+              <w:t>User double-clicks</w:t>
+            </w:r>
+          </w:p>
+        </w:tc>
+      </w:tr>
+      <w:tr>
+        <w:tc>
+          <w:tcPr>
+            <w:tcW w:w="0" w:type="auto"/>
+            <w:tcBorders>
+              <w:top w:val="single" w:sz="6" w:space="0" w:color="auto"/>
+              <w:left w:val="single" w:sz="6" w:space="0" w:color="auto"/>
+              <w:bottom w:val="single" w:sz="6" w:space="0" w:color="auto"/>
+              <w:right w:val="single" w:sz="6" w:space="0" w:color="auto"/>
+            </w:tcBorders>
+            <w:noWrap/>
+            <w:tcMar>
+              <w:top w:w="120" w:type="dxa"/>
+              <w:left w:w="180" w:type="dxa"/>
+              <w:bottom w:w="120" w:type="dxa"/>
+              <w:right w:w="180" w:type="dxa"/>
+            </w:tcMar>
+            <w:vAlign w:val="center"/>
+            <w:hideMark/>
+          </w:tcPr>
+          <w:p>
+            <w:pPr>
+              <w:spacing w:before="100" w:beforeAutospacing="1" w:after="100" w:afterAutospacing="1" w:line="240" w:lineRule="auto"/>
+              <w:rPr>
+                <w:rFonts w:ascii="Times New Roman" w:eastAsia="Times New Roman" w:hAnsi="Times New Roman" w:cs="Times New Roman"/>
+                <w:kern w:val="0"/>
+                <w:lang w:eastAsia="en-GB"/>
+                <w14:ligatures w14:val="none"/>
+              </w:rPr>
+            </w:pPr>
+            <w:r>
+              <w:rPr>
+                <w:rFonts w:ascii="Courier New" w:eastAsia="Times New Roman" w:hAnsi="Courier New" w:cs="Courier New"/>
+                <w:kern w:val="0"/>
+                <w:sz w:val="20"/>
+                <w:szCs w:val="20"/>
+                <w:lang w:eastAsia="en-GB"/>
+                <w14:ligatures w14:val="none"/>
+              </w:rPr>
+              <w:t>mouseover</w:t>
+            </w:r>
+          </w:p>
+        </w:tc>
+        <w:tc>
+          <w:tcPr>
+            <w:tcW w:w="0" w:type="auto"/>
+            <w:tcBorders>
+              <w:top w:val="single" w:sz="6" w:space="0" w:color="auto"/>
+              <w:left w:val="single" w:sz="6" w:space="0" w:color="auto"/>
+              <w:bottom w:val="single" w:sz="6" w:space="0" w:color="auto"/>
+              <w:right w:val="single" w:sz="6" w:space="0" w:color="auto"/>
+            </w:tcBorders>
+            <w:noWrap/>
+            <w:tcMar>
+              <w:top w:w="120" w:type="dxa"/>
+              <w:left w:w="180" w:type="dxa"/>
+              <w:bottom w:w="120" w:type="dxa"/>
+              <w:right w:w="180" w:type="dxa"/>
+            </w:tcMar>
+            <w:vAlign w:val="center"/>
+            <w:hideMark/>
+          </w:tcPr>
+          <w:p>
+            <w:pPr>
+              <w:spacing w:before="100" w:beforeAutospacing="1" w:after="100" w:afterAutospacing="1" w:line="240" w:lineRule="auto"/>
+              <w:rPr>
+                <w:rFonts w:ascii="Times New Roman" w:eastAsia="Times New Roman" w:hAnsi="Times New Roman" w:cs="Times New Roman"/>
+                <w:kern w:val="0"/>
+                <w:lang w:eastAsia="en-GB"/>
+                <w14:ligatures w14:val="none"/>
+              </w:rPr>
+            </w:pPr>
+            <w:r>
+              <w:rPr>
+                <w:rFonts w:ascii="Times New Roman" w:eastAsia="Times New Roman" w:hAnsi="Times New Roman" w:cs="Times New Roman"/>
+                <w:kern w:val="0"/>
+                <w:lang w:eastAsia="en-GB"/>
+                <w14:ligatures w14:val="none"/>
+              </w:rPr>
+              <w:t>Mouse enters an element</w:t>
+            </w:r>
+          </w:p>
+        </w:tc>
+      </w:tr>
+      <w:tr>
+        <w:tc>
+          <w:tcPr>
+            <w:tcW w:w="0" w:type="auto"/>
+            <w:tcBorders>
+              <w:top w:val="single" w:sz="6" w:space="0" w:color="auto"/>
+              <w:left w:val="single" w:sz="6" w:space="0" w:color="auto"/>
+              <w:bottom w:val="single" w:sz="6" w:space="0" w:color="auto"/>
+              <w:right w:val="single" w:sz="6" w:space="0" w:color="auto"/>
+            </w:tcBorders>
+            <w:noWrap/>
+            <w:tcMar>
+              <w:top w:w="120" w:type="dxa"/>
+              <w:left w:w="180" w:type="dxa"/>
+              <w:bottom w:w="120" w:type="dxa"/>
+              <w:right w:w="180" w:type="dxa"/>
+            </w:tcMar>
+            <w:vAlign w:val="center"/>
+            <w:hideMark/>
+          </w:tcPr>
+          <w:p>
+            <w:pPr>
+              <w:spacing w:before="100" w:beforeAutospacing="1" w:after="100" w:afterAutospacing="1" w:line="240" w:lineRule="auto"/>
+              <w:rPr>
+                <w:rFonts w:ascii="Times New Roman" w:eastAsia="Times New Roman" w:hAnsi="Times New Roman" w:cs="Times New Roman"/>
+                <w:kern w:val="0"/>
+                <w:lang w:eastAsia="en-GB"/>
+                <w14:ligatures w14:val="none"/>
+              </w:rPr>
+            </w:pPr>
+            <w:proofErr w:type="spellStart"/>
+            <w:r>
+              <w:rPr>
+                <w:rFonts w:ascii="Courier New" w:eastAsia="Times New Roman" w:hAnsi="Courier New" w:cs="Courier New"/>
+                <w:kern w:val="0"/>
+                <w:sz w:val="20"/>
+                <w:szCs w:val="20"/>
+                <w:lang w:eastAsia="en-GB"/>
+                <w14:ligatures w14:val="none"/>
+              </w:rPr>
+              <w:t>mouseout</w:t>
+            </w:r>
+            <w:proofErr w:type="spellEnd"/>
+          </w:p>
+        </w:tc>
+        <w:tc>
+          <w:tcPr>
+            <w:tcW w:w="0" w:type="auto"/>
+            <w:tcBorders>
+              <w:top w:val="single" w:sz="6" w:space="0" w:color="auto"/>
+              <w:left w:val="single" w:sz="6" w:space="0" w:color="auto"/>
+              <w:bottom w:val="single" w:sz="6" w:space="0" w:color="auto"/>
+              <w:right w:val="single" w:sz="6" w:space="0" w:color="auto"/>
+            </w:tcBorders>
+            <w:noWrap/>
+            <w:tcMar>
+              <w:top w:w="120" w:type="dxa"/>
+              <w:left w:w="180" w:type="dxa"/>
+              <w:bottom w:w="120" w:type="dxa"/>
+              <w:right w:w="180" w:type="dxa"/>
+            </w:tcMar>
+            <w:vAlign w:val="center"/>
+            <w:hideMark/>
+          </w:tcPr>
+          <w:p>
+            <w:pPr>
+              <w:spacing w:before="100" w:beforeAutospacing="1" w:after="100" w:afterAutospacing="1" w:line="240" w:lineRule="auto"/>
+              <w:rPr>
+                <w:rFonts w:ascii="Times New Roman" w:eastAsia="Times New Roman" w:hAnsi="Times New Roman" w:cs="Times New Roman"/>
+                <w:kern w:val="0"/>
+                <w:lang w:eastAsia="en-GB"/>
+                <w14:ligatures w14:val="none"/>
+              </w:rPr>
+            </w:pPr>
+            <w:r>
+              <w:rPr>
+                <w:rFonts w:ascii="Times New Roman" w:eastAsia="Times New Roman" w:hAnsi="Times New Roman" w:cs="Times New Roman"/>
+                <w:kern w:val="0"/>
+                <w:lang w:eastAsia="en-GB"/>
+                <w14:ligatures w14:val="none"/>
+              </w:rPr>
+              <w:t>Mouse leaves an element</w:t>
+            </w:r>
+          </w:p>
+        </w:tc>
+      </w:tr>
+      <w:tr>
+        <w:tc>
+          <w:tcPr>
+            <w:tcW w:w="0" w:type="auto"/>
+            <w:tcBorders>
+              <w:top w:val="single" w:sz="6" w:space="0" w:color="auto"/>
+              <w:left w:val="single" w:sz="6" w:space="0" w:color="auto"/>
+              <w:bottom w:val="single" w:sz="6" w:space="0" w:color="auto"/>
+              <w:right w:val="single" w:sz="6" w:space="0" w:color="auto"/>
+            </w:tcBorders>
+            <w:noWrap/>
+            <w:tcMar>
+              <w:top w:w="120" w:type="dxa"/>
+              <w:left w:w="180" w:type="dxa"/>
+              <w:bottom w:w="120" w:type="dxa"/>
+              <w:right w:w="180" w:type="dxa"/>
+            </w:tcMar>
+            <w:vAlign w:val="center"/>
+            <w:hideMark/>
+          </w:tcPr>
+          <w:p>
+            <w:pPr>
+              <w:spacing w:before="100" w:beforeAutospacing="1" w:after="100" w:afterAutospacing="1" w:line="240" w:lineRule="auto"/>
+              <w:rPr>
+                <w:rFonts w:ascii="Times New Roman" w:eastAsia="Times New Roman" w:hAnsi="Times New Roman" w:cs="Times New Roman"/>
+                <w:kern w:val="0"/>
+                <w:lang w:eastAsia="en-GB"/>
+                <w14:ligatures w14:val="none"/>
+              </w:rPr>
+            </w:pPr>
+            <w:proofErr w:type="spellStart"/>
+            <w:r>
+              <w:rPr>
+                <w:rFonts w:ascii="Courier New" w:eastAsia="Times New Roman" w:hAnsi="Courier New" w:cs="Courier New"/>
+                <w:kern w:val="0"/>
+                <w:sz w:val="20"/>
+                <w:szCs w:val="20"/>
+                <w:lang w:eastAsia="en-GB"/>
+                <w14:ligatures w14:val="none"/>
+              </w:rPr>
+              <w:t>keydown</w:t>
+            </w:r>
+            <w:proofErr w:type="spellEnd"/>
+          </w:p>
+        </w:tc>
+        <w:tc>
+          <w:tcPr>
+            <w:tcW w:w="0" w:type="auto"/>
+            <w:tcBorders>
+              <w:top w:val="single" w:sz="6" w:space="0" w:color="auto"/>
+              <w:left w:val="single" w:sz="6" w:space="0" w:color="auto"/>
+              <w:bottom w:val="single" w:sz="6" w:space="0" w:color="auto"/>
+              <w:right w:val="single" w:sz="6" w:space="0" w:color="auto"/>
+            </w:tcBorders>
+            <w:noWrap/>
+            <w:tcMar>
+              <w:top w:w="120" w:type="dxa"/>
+              <w:left w:w="180" w:type="dxa"/>
+              <w:bottom w:w="120" w:type="dxa"/>
+              <w:right w:w="180" w:type="dxa"/>
+            </w:tcMar>
+            <w:vAlign w:val="center"/>
+            <w:hideMark/>
+          </w:tcPr>
+          <w:p>
+            <w:pPr>
+              <w:spacing w:before="100" w:beforeAutospacing="1" w:after="100" w:afterAutospacing="1" w:line="240" w:lineRule="auto"/>
+              <w:rPr>
+                <w:rFonts w:ascii="Times New Roman" w:eastAsia="Times New Roman" w:hAnsi="Times New Roman" w:cs="Times New Roman"/>
+                <w:kern w:val="0"/>
+                <w:lang w:eastAsia="en-GB"/>
+                <w14:ligatures w14:val="none"/>
+              </w:rPr>
+            </w:pPr>
+            <w:r>
+              <w:rPr>
+                <w:rFonts w:ascii="Times New Roman" w:eastAsia="Times New Roman" w:hAnsi="Times New Roman" w:cs="Times New Roman"/>
+                <w:kern w:val="0"/>
+                <w:lang w:eastAsia="en-GB"/>
+                <w14:ligatures w14:val="none"/>
+              </w:rPr>
+              <w:t>A keyboard key is pressed</w:t>
+            </w:r>
+          </w:p>
+        </w:tc>
+      </w:tr>
+      <w:tr>
+        <w:tc>
+          <w:tcPr>
+            <w:tcW w:w="0" w:type="auto"/>
+            <w:tcBorders>
+              <w:top w:val="single" w:sz="6" w:space="0" w:color="auto"/>
+              <w:left w:val="single" w:sz="6" w:space="0" w:color="auto"/>
+              <w:bottom w:val="single" w:sz="6" w:space="0" w:color="auto"/>
+              <w:right w:val="single" w:sz="6" w:space="0" w:color="auto"/>
+            </w:tcBorders>
+            <w:noWrap/>
+            <w:tcMar>
+              <w:top w:w="120" w:type="dxa"/>
+              <w:left w:w="180" w:type="dxa"/>
+              <w:bottom w:w="120" w:type="dxa"/>
+              <w:right w:w="180" w:type="dxa"/>
+            </w:tcMar>
+            <w:vAlign w:val="center"/>
+            <w:hideMark/>
+          </w:tcPr>
+          <w:p>
+            <w:pPr>
+              <w:spacing w:before="100" w:beforeAutospacing="1" w:after="100" w:afterAutospacing="1" w:line="240" w:lineRule="auto"/>
+              <w:rPr>
+                <w:rFonts w:ascii="Times New Roman" w:eastAsia="Times New Roman" w:hAnsi="Times New Roman" w:cs="Times New Roman"/>
+                <w:kern w:val="0"/>
+                <w:lang w:eastAsia="en-GB"/>
+                <w14:ligatures w14:val="none"/>
+              </w:rPr>
+            </w:pPr>
+            <w:proofErr w:type="spellStart"/>
+            <w:r>
+              <w:rPr>
+                <w:rFonts w:ascii="Courier New" w:eastAsia="Times New Roman" w:hAnsi="Courier New" w:cs="Courier New"/>
+                <w:kern w:val="0"/>
+                <w:sz w:val="20"/>
+                <w:szCs w:val="20"/>
+                <w:lang w:eastAsia="en-GB"/>
+                <w14:ligatures w14:val="none"/>
+              </w:rPr>
+              <w:t>keyup</w:t>
+            </w:r>
+            <w:proofErr w:type="spellEnd"/>
+          </w:p>
+        </w:tc>
+        <w:tc>
+          <w:tcPr>
+            <w:tcW w:w="0" w:type="auto"/>
+            <w:tcBorders>
+              <w:top w:val="single" w:sz="6" w:space="0" w:color="auto"/>
+              <w:left w:val="single" w:sz="6" w:space="0" w:color="auto"/>
+              <w:bottom w:val="single" w:sz="6" w:space="0" w:color="auto"/>
+              <w:right w:val="single" w:sz="6" w:space="0" w:color="auto"/>
+            </w:tcBorders>
+            <w:noWrap/>
+            <w:tcMar>
+              <w:top w:w="120" w:type="dxa"/>
+              <w:left w:w="180" w:type="dxa"/>
+              <w:bottom w:w="120" w:type="dxa"/>
+              <w:right w:w="180" w:type="dxa"/>
+            </w:tcMar>
+            <w:vAlign w:val="center"/>
+            <w:hideMark/>
+          </w:tcPr>
+          <w:p>
+            <w:pPr>
+              <w:spacing w:before="100" w:beforeAutospacing="1" w:after="100" w:afterAutospacing="1" w:line="240" w:lineRule="auto"/>
+              <w:rPr>
+                <w:rFonts w:ascii="Times New Roman" w:eastAsia="Times New Roman" w:hAnsi="Times New Roman" w:cs="Times New Roman"/>
+                <w:kern w:val="0"/>
+                <w:lang w:eastAsia="en-GB"/>
+                <w14:ligatures w14:val="none"/>
+              </w:rPr>
+            </w:pPr>
+            <w:r>
+              <w:rPr>
+                <w:rFonts w:ascii="Times New Roman" w:eastAsia="Times New Roman" w:hAnsi="Times New Roman" w:cs="Times New Roman"/>
+                <w:kern w:val="0"/>
+                <w:lang w:eastAsia="en-GB"/>
+                <w14:ligatures w14:val="none"/>
+              </w:rPr>
+              <w:t>A keyboard key is released</w:t>
+            </w:r>
+          </w:p>
+        </w:tc>
+      </w:tr>
+      <w:tr>
+        <w:tc>
+          <w:tcPr>
+            <w:tcW w:w="0" w:type="auto"/>
+            <w:tcBorders>
+              <w:top w:val="single" w:sz="6" w:space="0" w:color="auto"/>
+              <w:left w:val="single" w:sz="6" w:space="0" w:color="auto"/>
+              <w:bottom w:val="single" w:sz="6" w:space="0" w:color="auto"/>
+              <w:right w:val="single" w:sz="6" w:space="0" w:color="auto"/>
+            </w:tcBorders>
+            <w:noWrap/>
+            <w:tcMar>
+              <w:top w:w="120" w:type="dxa"/>
+              <w:left w:w="180" w:type="dxa"/>
+              <w:bottom w:w="120" w:type="dxa"/>
+              <w:right w:w="180" w:type="dxa"/>
+            </w:tcMar>
+            <w:vAlign w:val="center"/>
+            <w:hideMark/>
+          </w:tcPr>
+          <w:p>
+            <w:pPr>
+              <w:spacing w:before="100" w:beforeAutospacing="1" w:after="100" w:afterAutospacing="1" w:line="240" w:lineRule="auto"/>
+              <w:rPr>
+                <w:rFonts w:ascii="Times New Roman" w:eastAsia="Times New Roman" w:hAnsi="Times New Roman" w:cs="Times New Roman"/>
+                <w:kern w:val="0"/>
+                <w:lang w:eastAsia="en-GB"/>
+                <w14:ligatures w14:val="none"/>
+              </w:rPr>
+            </w:pPr>
+            <w:r>
+              <w:rPr>
+                <w:rFonts w:ascii="Courier New" w:eastAsia="Times New Roman" w:hAnsi="Courier New" w:cs="Courier New"/>
+                <w:kern w:val="0"/>
+                <w:sz w:val="20"/>
+                <w:szCs w:val="20"/>
+                <w:lang w:eastAsia="en-GB"/>
+                <w14:ligatures w14:val="none"/>
+              </w:rPr>
+              <w:t>input</w:t>
+            </w:r>
+          </w:p>
+        </w:tc>
+        <w:tc>
+          <w:tcPr>
+            <w:tcW w:w="0" w:type="auto"/>
+            <w:tcBorders>
+              <w:top w:val="single" w:sz="6" w:space="0" w:color="auto"/>
+              <w:left w:val="single" w:sz="6" w:space="0" w:color="auto"/>
+              <w:bottom w:val="single" w:sz="6" w:space="0" w:color="auto"/>
+              <w:right w:val="single" w:sz="6" w:space="0" w:color="auto"/>
+            </w:tcBorders>
+            <w:noWrap/>
+            <w:tcMar>
+              <w:top w:w="120" w:type="dxa"/>
+              <w:left w:w="180" w:type="dxa"/>
+              <w:bottom w:w="120" w:type="dxa"/>
+              <w:right w:w="180" w:type="dxa"/>
+            </w:tcMar>
+            <w:vAlign w:val="center"/>
+            <w:hideMark/>
+          </w:tcPr>
+          <w:p>
+            <w:pPr>
+              <w:spacing w:before="100" w:beforeAutospacing="1" w:after="100" w:afterAutospacing="1" w:line="240" w:lineRule="auto"/>
+              <w:rPr>
+                <w:rFonts w:ascii="Times New Roman" w:eastAsia="Times New Roman" w:hAnsi="Times New Roman" w:cs="Times New Roman"/>
+                <w:kern w:val="0"/>
+                <w:lang w:eastAsia="en-GB"/>
+                <w14:ligatures w14:val="none"/>
+              </w:rPr>
+            </w:pPr>
+            <w:r>
+              <w:rPr>
+                <w:rFonts w:ascii="Times New Roman" w:eastAsia="Times New Roman" w:hAnsi="Times New Roman" w:cs="Times New Roman"/>
+                <w:kern w:val="0"/>
+                <w:lang w:eastAsia="en-GB"/>
+                <w14:ligatures w14:val="none"/>
+              </w:rPr>
+              <w:t>Input value changes</w:t>
+            </w:r>
+          </w:p>
+        </w:tc>
+      </w:tr>
+      <w:tr>
+        <w:tc>
+          <w:tcPr>
+            <w:tcW w:w="0" w:type="auto"/>
+            <w:tcBorders>
+              <w:top w:val="single" w:sz="6" w:space="0" w:color="auto"/>
+              <w:left w:val="single" w:sz="6" w:space="0" w:color="auto"/>
+              <w:bottom w:val="single" w:sz="6" w:space="0" w:color="auto"/>
+              <w:right w:val="single" w:sz="6" w:space="0" w:color="auto"/>
+            </w:tcBorders>
+            <w:noWrap/>
+            <w:tcMar>
+              <w:top w:w="120" w:type="dxa"/>
+              <w:left w:w="180" w:type="dxa"/>
+              <w:bottom w:w="120" w:type="dxa"/>
+              <w:right w:w="180" w:type="dxa"/>
+            </w:tcMar>
+            <w:vAlign w:val="center"/>
+            <w:hideMark/>
+          </w:tcPr>
+          <w:p>
+            <w:pPr>
+              <w:spacing w:before="100" w:beforeAutospacing="1" w:after="100" w:afterAutospacing="1" w:line="240" w:lineRule="auto"/>
+              <w:rPr>
+                <w:rFonts w:ascii="Times New Roman" w:eastAsia="Times New Roman" w:hAnsi="Times New Roman" w:cs="Times New Roman"/>
+                <w:kern w:val="0"/>
+                <w:lang w:eastAsia="en-GB"/>
+                <w14:ligatures w14:val="none"/>
+              </w:rPr>
+            </w:pPr>
+            <w:r>
+              <w:rPr>
+                <w:rFonts w:ascii="Courier New" w:eastAsia="Times New Roman" w:hAnsi="Courier New" w:cs="Courier New"/>
+                <w:kern w:val="0"/>
+                <w:sz w:val="20"/>
+                <w:szCs w:val="20"/>
+                <w:lang w:eastAsia="en-GB"/>
+                <w14:ligatures w14:val="none"/>
+              </w:rPr>
+              <w:t>change</w:t>
+            </w:r>
+          </w:p>
+        </w:tc>
+        <w:tc>
+          <w:tcPr>
+            <w:tcW w:w="0" w:type="auto"/>
+            <w:tcBorders>
+              <w:top w:val="single" w:sz="6" w:space="0" w:color="auto"/>
+              <w:left w:val="single" w:sz="6" w:space="0" w:color="auto"/>
+              <w:bottom w:val="single" w:sz="6" w:space="0" w:color="auto"/>
+              <w:right w:val="single" w:sz="6" w:space="0" w:color="auto"/>
+            </w:tcBorders>
+            <w:noWrap/>
+            <w:tcMar>
+              <w:top w:w="120" w:type="dxa"/>
+              <w:left w:w="180" w:type="dxa"/>
+              <w:bottom w:w="120" w:type="dxa"/>
+              <w:right w:w="180" w:type="dxa"/>
+            </w:tcMar>
+            <w:vAlign w:val="center"/>
+            <w:hideMark/>
+          </w:tcPr>
+          <w:p>
+            <w:pPr>
+              <w:spacing w:before="100" w:beforeAutospacing="1" w:after="100" w:afterAutospacing="1" w:line="240" w:lineRule="auto"/>
+              <w:rPr>
+                <w:rFonts w:ascii="Times New Roman" w:eastAsia="Times New Roman" w:hAnsi="Times New Roman" w:cs="Times New Roman"/>
+                <w:kern w:val="0"/>
+                <w:lang w:eastAsia="en-GB"/>
+                <w14:ligatures w14:val="none"/>
+              </w:rPr>
+            </w:pPr>
+            <w:r>
+              <w:rPr>
+                <w:rFonts w:ascii="Times New Roman" w:eastAsia="Times New Roman" w:hAnsi="Times New Roman" w:cs="Times New Roman"/>
+                <w:kern w:val="0"/>
+                <w:lang w:eastAsia="en-GB"/>
+                <w14:ligatures w14:val="none"/>
+              </w:rPr>
+              <w:t>Form value is changed/committed</w:t>
+            </w:r>
+          </w:p>
+        </w:tc>
+      </w:tr>
+      <w:tr>
+        <w:tc>
+          <w:tcPr>
+            <w:tcW w:w="0" w:type="auto"/>
+            <w:tcBorders>
+              <w:top w:val="single" w:sz="6" w:space="0" w:color="auto"/>
+              <w:left w:val="single" w:sz="6" w:space="0" w:color="auto"/>
+              <w:bottom w:val="single" w:sz="6" w:space="0" w:color="auto"/>
+              <w:right w:val="single" w:sz="6" w:space="0" w:color="auto"/>
+            </w:tcBorders>
+            <w:noWrap/>
+            <w:tcMar>
+              <w:top w:w="120" w:type="dxa"/>
+              <w:left w:w="180" w:type="dxa"/>
+              <w:bottom w:w="120" w:type="dxa"/>
+              <w:right w:w="180" w:type="dxa"/>
+            </w:tcMar>
+            <w:vAlign w:val="center"/>
+            <w:hideMark/>
+          </w:tcPr>
+          <w:p>
+            <w:pPr>
+              <w:spacing w:before="100" w:beforeAutospacing="1" w:after="100" w:afterAutospacing="1" w:line="240" w:lineRule="auto"/>
+              <w:rPr>
+                <w:rFonts w:ascii="Times New Roman" w:eastAsia="Times New Roman" w:hAnsi="Times New Roman" w:cs="Times New Roman"/>
+                <w:kern w:val="0"/>
+                <w:lang w:eastAsia="en-GB"/>
+                <w14:ligatures w14:val="none"/>
+              </w:rPr>
+            </w:pPr>
+            <w:r>
+              <w:rPr>
+                <w:rFonts w:ascii="Courier New" w:eastAsia="Times New Roman" w:hAnsi="Courier New" w:cs="Courier New"/>
+                <w:kern w:val="0"/>
+                <w:sz w:val="20"/>
+                <w:szCs w:val="20"/>
+                <w:lang w:eastAsia="en-GB"/>
+                <w14:ligatures w14:val="none"/>
+              </w:rPr>
+              <w:t>submit</w:t>
+            </w:r>
+          </w:p>
+        </w:tc>
+        <w:tc>
+          <w:tcPr>
+            <w:tcW w:w="0" w:type="auto"/>
+            <w:tcBorders>
+              <w:top w:val="single" w:sz="6" w:space="0" w:color="auto"/>
+              <w:left w:val="single" w:sz="6" w:space="0" w:color="auto"/>
+              <w:bottom w:val="single" w:sz="6" w:space="0" w:color="auto"/>
+              <w:right w:val="single" w:sz="6" w:space="0" w:color="auto"/>
+            </w:tcBorders>
+            <w:noWrap/>
+            <w:tcMar>
+              <w:top w:w="120" w:type="dxa"/>
+              <w:left w:w="180" w:type="dxa"/>
+              <w:bottom w:w="120" w:type="dxa"/>
+              <w:right w:w="180" w:type="dxa"/>
+            </w:tcMar>
+            <w:vAlign w:val="center"/>
+            <w:hideMark/>
+          </w:tcPr>
+          <w:p>
+            <w:pPr>
+              <w:spacing w:before="100" w:beforeAutospacing="1" w:after="100" w:afterAutospacing="1" w:line="240" w:lineRule="auto"/>
+              <w:rPr>
+                <w:rFonts w:ascii="Times New Roman" w:eastAsia="Times New Roman" w:hAnsi="Times New Roman" w:cs="Times New Roman"/>
+                <w:kern w:val="0"/>
+                <w:lang w:eastAsia="en-GB"/>
+                <w14:ligatures w14:val="none"/>
+              </w:rPr>
+            </w:pPr>
+            <w:r>
+              <w:rPr>
+                <w:rFonts w:ascii="Times New Roman" w:eastAsia="Times New Roman" w:hAnsi="Times New Roman" w:cs="Times New Roman"/>
+                <w:kern w:val="0"/>
+                <w:lang w:eastAsia="en-GB"/>
+                <w14:ligatures w14:val="none"/>
+              </w:rPr>
+              <w:t>A form is submitted</w:t>
+            </w:r>
+          </w:p>
+        </w:tc>
+      </w:tr>
+      <w:tr>
+        <w:tc>
+          <w:tcPr>
+            <w:tcW w:w="0" w:type="auto"/>
+            <w:tcBorders>
+              <w:top w:val="single" w:sz="6" w:space="0" w:color="auto"/>
+              <w:left w:val="single" w:sz="6" w:space="0" w:color="auto"/>
+              <w:bottom w:val="single" w:sz="6" w:space="0" w:color="auto"/>
+              <w:right w:val="single" w:sz="6" w:space="0" w:color="auto"/>
+            </w:tcBorders>
+            <w:noWrap/>
+            <w:tcMar>
+              <w:top w:w="120" w:type="dxa"/>
+              <w:left w:w="180" w:type="dxa"/>
+              <w:bottom w:w="120" w:type="dxa"/>
+              <w:right w:w="180" w:type="dxa"/>
+            </w:tcMar>
+            <w:vAlign w:val="center"/>
+            <w:hideMark/>
+          </w:tcPr>
+          <w:p>
+            <w:pPr>
+              <w:spacing w:before="100" w:beforeAutospacing="1" w:after="100" w:afterAutospacing="1" w:line="240" w:lineRule="auto"/>
+              <w:rPr>
+                <w:rFonts w:ascii="Times New Roman" w:eastAsia="Times New Roman" w:hAnsi="Times New Roman" w:cs="Times New Roman"/>
+                <w:kern w:val="0"/>
+                <w:lang w:eastAsia="en-GB"/>
+                <w14:ligatures w14:val="none"/>
+              </w:rPr>
+            </w:pPr>
+            <w:r>
+              <w:rPr>
+                <w:rFonts w:ascii="Courier New" w:eastAsia="Times New Roman" w:hAnsi="Courier New" w:cs="Courier New"/>
+                <w:kern w:val="0"/>
+                <w:sz w:val="20"/>
+                <w:szCs w:val="20"/>
+                <w:lang w:eastAsia="en-GB"/>
+                <w14:ligatures w14:val="none"/>
+              </w:rPr>
+              <w:t>focus</w:t>
+            </w:r>
+          </w:p>
+        </w:tc>
+        <w:tc>
+          <w:tcPr>
+            <w:tcW w:w="0" w:type="auto"/>
+            <w:tcBorders>
+              <w:top w:val="single" w:sz="6" w:space="0" w:color="auto"/>
+              <w:left w:val="single" w:sz="6" w:space="0" w:color="auto"/>
+              <w:bottom w:val="single" w:sz="6" w:space="0" w:color="auto"/>
+              <w:right w:val="single" w:sz="6" w:space="0" w:color="auto"/>
+            </w:tcBorders>
+            <w:noWrap/>
+            <w:tcMar>
+              <w:top w:w="120" w:type="dxa"/>
+              <w:left w:w="180" w:type="dxa"/>
+              <w:bottom w:w="120" w:type="dxa"/>
+              <w:right w:w="180" w:type="dxa"/>
+            </w:tcMar>
+            <w:vAlign w:val="center"/>
+            <w:hideMark/>
+          </w:tcPr>
+          <w:p>
+            <w:pPr>
+              <w:spacing w:before="100" w:beforeAutospacing="1" w:after="100" w:afterAutospacing="1" w:line="240" w:lineRule="auto"/>
+              <w:rPr>
+                <w:rFonts w:ascii="Times New Roman" w:eastAsia="Times New Roman" w:hAnsi="Times New Roman" w:cs="Times New Roman"/>
+                <w:kern w:val="0"/>
+                <w:lang w:eastAsia="en-GB"/>
+                <w14:ligatures w14:val="none"/>
+              </w:rPr>
+            </w:pPr>
+            <w:r>
+              <w:rPr>
+                <w:rFonts w:ascii="Times New Roman" w:eastAsia="Times New Roman" w:hAnsi="Times New Roman" w:cs="Times New Roman"/>
+                <w:kern w:val="0"/>
+                <w:lang w:eastAsia="en-GB"/>
+                <w14:ligatures w14:val="none"/>
+              </w:rPr>
+              <w:t>An input receives focus</w:t>
+            </w:r>
+          </w:p>
+        </w:tc>
+      </w:tr>
+      <w:tr>
+        <w:tc>
+          <w:tcPr>
+            <w:tcW w:w="0" w:type="auto"/>
+            <w:tcBorders>
+              <w:top w:val="single" w:sz="6" w:space="0" w:color="auto"/>
+              <w:left w:val="single" w:sz="6" w:space="0" w:color="auto"/>
+              <w:bottom w:val="single" w:sz="6" w:space="0" w:color="auto"/>
+              <w:right w:val="single" w:sz="6" w:space="0" w:color="auto"/>
+            </w:tcBorders>
+            <w:noWrap/>
+            <w:tcMar>
+              <w:top w:w="120" w:type="dxa"/>
+              <w:left w:w="180" w:type="dxa"/>
+              <w:bottom w:w="120" w:type="dxa"/>
+              <w:right w:w="180" w:type="dxa"/>
+            </w:tcMar>
+            <w:vAlign w:val="center"/>
+            <w:hideMark/>
+          </w:tcPr>
+          <w:p>
+            <w:pPr>
+              <w:spacing w:before="100" w:beforeAutospacing="1" w:after="100" w:afterAutospacing="1" w:line="240" w:lineRule="auto"/>
+              <w:rPr>
+                <w:rFonts w:ascii="Times New Roman" w:eastAsia="Times New Roman" w:hAnsi="Times New Roman" w:cs="Times New Roman"/>
+                <w:kern w:val="0"/>
+                <w:lang w:eastAsia="en-GB"/>
+                <w14:ligatures w14:val="none"/>
+              </w:rPr>
+            </w:pPr>
+            <w:r>
+              <w:rPr>
+                <w:rFonts w:ascii="Courier New" w:eastAsia="Times New Roman" w:hAnsi="Courier New" w:cs="Courier New"/>
+                <w:kern w:val="0"/>
+                <w:sz w:val="20"/>
+                <w:szCs w:val="20"/>
+                <w:lang w:eastAsia="en-GB"/>
+                <w14:ligatures w14:val="none"/>
+              </w:rPr>
+              <w:t>blur</w:t>
+            </w:r>
+          </w:p>
+        </w:tc>
+        <w:tc>
+          <w:tcPr>
+            <w:tcW w:w="0" w:type="auto"/>
+            <w:tcBorders>
+              <w:top w:val="single" w:sz="6" w:space="0" w:color="auto"/>
+              <w:left w:val="single" w:sz="6" w:space="0" w:color="auto"/>
+              <w:bottom w:val="single" w:sz="6" w:space="0" w:color="auto"/>
+              <w:right w:val="single" w:sz="6" w:space="0" w:color="auto"/>
+            </w:tcBorders>
+            <w:noWrap/>
+            <w:tcMar>
+              <w:top w:w="120" w:type="dxa"/>
+              <w:left w:w="180" w:type="dxa"/>
+              <w:bottom w:w="120" w:type="dxa"/>
+              <w:right w:w="180" w:type="dxa"/>
+            </w:tcMar>
+            <w:vAlign w:val="center"/>
+            <w:hideMark/>
+          </w:tcPr>
+          <w:p>
+            <w:pPr>
+              <w:spacing w:before="100" w:beforeAutospacing="1" w:after="100" w:afterAutospacing="1" w:line="240" w:lineRule="auto"/>
+              <w:rPr>
+                <w:rFonts w:ascii="Times New Roman" w:eastAsia="Times New Roman" w:hAnsi="Times New Roman" w:cs="Times New Roman"/>
+                <w:kern w:val="0"/>
+                <w:lang w:eastAsia="en-GB"/>
+                <w14:ligatures w14:val="none"/>
+              </w:rPr>
+            </w:pPr>
+            <w:r>
+              <w:rPr>
+                <w:rFonts w:ascii="Times New Roman" w:eastAsia="Times New Roman" w:hAnsi="Times New Roman" w:cs="Times New Roman"/>
+                <w:kern w:val="0"/>
+                <w:lang w:eastAsia="en-GB"/>
+                <w14:ligatures w14:val="none"/>
+              </w:rPr>
+              <w:t>An input loses focus</w:t>
+            </w:r>
+          </w:p>
+        </w:tc>
+      </w:tr>
+      <w:tr>
+        <w:tc>
+          <w:tcPr>
+            <w:tcW w:w="0" w:type="auto"/>
+            <w:tcBorders>
+              <w:top w:val="single" w:sz="6" w:space="0" w:color="auto"/>
+              <w:left w:val="single" w:sz="6" w:space="0" w:color="auto"/>
+              <w:bottom w:val="single" w:sz="6" w:space="0" w:color="auto"/>
+              <w:right w:val="single" w:sz="6" w:space="0" w:color="auto"/>
+            </w:tcBorders>
+            <w:noWrap/>
+            <w:tcMar>
+              <w:top w:w="120" w:type="dxa"/>
+              <w:left w:w="180" w:type="dxa"/>
+              <w:bottom w:w="120" w:type="dxa"/>
+              <w:right w:w="180" w:type="dxa"/>
+            </w:tcMar>
+            <w:vAlign w:val="center"/>
+            <w:hideMark/>
+          </w:tcPr>
+          <w:p>
+            <w:pPr>
+              <w:spacing w:before="100" w:beforeAutospacing="1" w:after="100" w:afterAutospacing="1" w:line="240" w:lineRule="auto"/>
+              <w:rPr>
+                <w:rFonts w:ascii="Times New Roman" w:eastAsia="Times New Roman" w:hAnsi="Times New Roman" w:cs="Times New Roman"/>
+                <w:kern w:val="0"/>
+                <w:lang w:eastAsia="en-GB"/>
+                <w14:ligatures w14:val="none"/>
+              </w:rPr>
+            </w:pPr>
+            <w:proofErr w:type="spellStart"/>
+            <w:r>
+              <w:rPr>
+                <w:rFonts w:ascii="Courier New" w:eastAsia="Times New Roman" w:hAnsi="Courier New" w:cs="Courier New"/>
+                <w:kern w:val="0"/>
+                <w:sz w:val="20"/>
+                <w:szCs w:val="20"/>
+                <w:lang w:eastAsia="en-GB"/>
+                <w14:ligatures w14:val="none"/>
+              </w:rPr>
+              <w:t>DOMContentLoaded</w:t>
+            </w:r>
+            <w:proofErr w:type="spellEnd"/>
+          </w:p>
+        </w:tc>
+        <w:tc>
+          <w:tcPr>
+            <w:tcW w:w="0" w:type="auto"/>
+            <w:tcBorders>
+              <w:top w:val="single" w:sz="6" w:space="0" w:color="auto"/>
+              <w:left w:val="single" w:sz="6" w:space="0" w:color="auto"/>
+              <w:bottom w:val="single" w:sz="6" w:space="0" w:color="auto"/>
+              <w:right w:val="single" w:sz="6" w:space="0" w:color="auto"/>
+            </w:tcBorders>
+            <w:noWrap/>
+            <w:tcMar>
+              <w:top w:w="120" w:type="dxa"/>
+              <w:left w:w="180" w:type="dxa"/>
+              <w:bottom w:w="120" w:type="dxa"/>
+              <w:right w:w="180" w:type="dxa"/>
+            </w:tcMar>
+            <w:vAlign w:val="center"/>
+            <w:hideMark/>
+          </w:tcPr>
+          <w:p>
+            <w:pPr>
+              <w:spacing w:before="100" w:beforeAutospacing="1" w:after="100" w:afterAutospacing="1" w:line="240" w:lineRule="auto"/>
+              <w:rPr>
+                <w:rFonts w:ascii="Times New Roman" w:eastAsia="Times New Roman" w:hAnsi="Times New Roman" w:cs="Times New Roman"/>
+                <w:kern w:val="0"/>
+                <w:lang w:eastAsia="en-GB"/>
+                <w14:ligatures w14:val="none"/>
+              </w:rPr>
+            </w:pPr>
+            <w:r>
+              <w:rPr>
+                <w:rFonts w:ascii="Times New Roman" w:eastAsia="Times New Roman" w:hAnsi="Times New Roman" w:cs="Times New Roman"/>
+                <w:kern w:val="0"/>
+                <w:lang w:eastAsia="en-GB"/>
+                <w14:ligatures w14:val="none"/>
+              </w:rPr>
+              <w:t>HTML has been loaded and parsed</w:t>
+            </w:r>
+          </w:p>
+        </w:tc>
+      </w:tr>
+    </w:tbl>
+    <w:p>
+      <w:pPr>
+        <w:ind w:left="-567" w:firstLine="567"/>
+        <w:rPr>
+          <w:lang w:val="en-US"/>
+        </w:rPr>
+      </w:pPr>
+    </w:p>
+    <w:p>
+      <w:pPr>
+        <w:ind w:left="-567" w:firstLine="567"/>
+        <w:rPr>
+          <w:lang w:val="en-US"/>
+        </w:rPr>
+      </w:pPr>
+      <w:r>
+        <w:rPr>
+          <w:lang w:val="en-US"/>
+        </w:rPr>
+        <w:lastRenderedPageBreak/>
+        <w:drawing>
+          <wp:inline distT="0" distB="0" distL="0" distR="0" wp14:anchorId="6E157EAD" wp14:editId="09E58278">
+            <wp:extent cx="5731510" cy="2964180"/>
+            <wp:effectExtent l="0" t="0" r="0" b="0"/>
+            <wp:docPr id="1737461912" name="Picture 1"/>
+            <wp:cNvGraphicFramePr>
+              <a:graphicFrameLocks xmlns:a="http://schemas.openxmlformats.org/drawingml/2006/main" noChangeAspect="1"/>
+            </wp:cNvGraphicFramePr>
+            <a:graphic xmlns:a="http://schemas.openxmlformats.org/drawingml/2006/main">
+              <a:graphicData uri="http://schemas.openxmlformats.org/drawingml/2006/picture">
+                <pic:pic xmlns:pic="http://schemas.openxmlformats.org/drawingml/2006/picture">
+                  <pic:nvPicPr>
+                    <pic:cNvPr id="1737461912" name=""/>
+                    <pic:cNvPicPr/>
+                  </pic:nvPicPr>
+                  <pic:blipFill>
+                    <a:blip r:embed="rId27"/>
+                    <a:stretch>
+                      <a:fillRect/>
+                    </a:stretch>
+                  </pic:blipFill>
+                  <pic:spPr>
+                    <a:xfrm>
+                      <a:off x="0" y="0"/>
+                      <a:ext cx="5731510" cy="2964180"/>
+                    </a:xfrm>
+                    <a:prstGeom prst="rect">
+                      <a:avLst/>
+                    </a:prstGeom>
+                  </pic:spPr>
+                </pic:pic>
+              </a:graphicData>
+            </a:graphic>
+          </wp:inline>
+        </w:drawing>
+      </w:r>
+    </w:p>
+    <w:p>
+      <w:pPr>
+        <w:ind w:left="-567" w:firstLine="567"/>
+        <w:rPr>
+          <w:lang w:val="en-US"/>
+        </w:rPr>
+      </w:pPr>
+    </w:p>
+    <w:p>
+      <w:pPr>
+        <w:ind w:left="-567" w:firstLine="567"/>
+        <w:rPr>
+          <w:lang w:val="en-US"/>
+        </w:rPr>
+      </w:pPr>
+      <w:r>
+        <w:rPr>
+          <w:lang w:val="en-US"/>
+        </w:rPr>
+        <w:t>Event Handling in Java</w:t>
+      </w:r>
+      <w:r>
+        <w:rPr>
+          <w:lang w:val="en-US"/>
+        </w:rPr>
+        <w:t xml:space="preserve"> </w:t>
+      </w:r>
+      <w:r>
+        <w:rPr>
+          <w:lang w:val="en-US"/>
+        </w:rPr>
+        <w:t>script:</w:t>
+      </w:r>
+      <w:r>
+        <w:rPr>
+          <w:lang w:val="en-US"/>
+        </w:rPr>
+        <w:br/>
+      </w:r>
+    </w:p>
+    <w:p>
+      <w:pPr>
+        <w:ind w:left="-567" w:firstLine="567"/>
+        <w:rPr>
+          <w:lang w:val="en-US"/>
+        </w:rPr>
+      </w:pPr>
+      <w:r>
+        <w:rPr>
+          <w:lang w:val="en-US"/>
+        </w:rPr>
+        <w:drawing>
+          <wp:inline distT="0" distB="0" distL="0" distR="0" wp14:anchorId="095D676B" wp14:editId="080BF4C2">
+            <wp:extent cx="5586517" cy="4863249"/>
+            <wp:effectExtent l="0" t="0" r="1905" b="1270"/>
+            <wp:docPr id="107211074" name="Picture 1"/>
+            <wp:cNvGraphicFramePr>
+              <a:graphicFrameLocks xmlns:a="http://schemas.openxmlformats.org/drawingml/2006/main" noChangeAspect="1"/>
+            </wp:cNvGraphicFramePr>
+            <a:graphic xmlns:a="http://schemas.openxmlformats.org/drawingml/2006/main">
+              <a:graphicData uri="http://schemas.openxmlformats.org/drawingml/2006/picture">
+                <pic:pic xmlns:pic="http://schemas.openxmlformats.org/drawingml/2006/picture">
+                  <pic:nvPicPr>
+                    <pic:cNvPr id="107211074" name=""/>
+                    <pic:cNvPicPr/>
+                  </pic:nvPicPr>
+                  <pic:blipFill rotWithShape="1">
+                    <a:blip r:embed="rId28"/>
+                    <a:srcRect r="10797"/>
+                    <a:stretch>
+                      <a:fillRect/>
+                    </a:stretch>
+                  </pic:blipFill>
+                  <pic:spPr bwMode="auto">
+                    <a:xfrm>
+                      <a:off x="0" y="0"/>
+                      <a:ext cx="5619590" cy="4892040"/>
+                    </a:xfrm>
+                    <a:prstGeom prst="rect">
+                      <a:avLst/>
+                    </a:prstGeom>
+                    <a:ln>
+                      <a:noFill/>
+                    </a:ln>
+                    <a:extLst>
+                      <a:ext uri="{53640926-AAD7-44D8-BBD7-CCE9431645EC}">
+                        <a14:shadowObscured xmlns:a14="http://schemas.microsoft.com/office/drawing/2010/main"/>
+                      </a:ext>
+                    </a:extLst>
+                  </pic:spPr>
+                </pic:pic>
+              </a:graphicData>
+            </a:graphic>
+          </wp:inline>
+        </w:drawing>
+      </w:r>
+    </w:p>
+    <w:p>
+      <w:pPr>
+        <w:ind w:left="-567" w:firstLine="567"/>
+        <w:rPr>
+          <w:lang w:val="en-US"/>
+        </w:rPr>
+      </w:pPr>
+      <w:r>
+        <w:rPr>
+          <w:lang w:val="en-US"/>
+        </w:rPr>
+        <w:lastRenderedPageBreak/>
+        <w:drawing>
+          <wp:inline distT="0" distB="0" distL="0" distR="0" wp14:anchorId="72EDAF42" wp14:editId="1B36F70F">
+            <wp:extent cx="5731510" cy="5553710"/>
+            <wp:effectExtent l="0" t="0" r="0" b="0"/>
+            <wp:docPr id="240739578" name="Picture 1"/>
+            <wp:cNvGraphicFramePr>
+              <a:graphicFrameLocks xmlns:a="http://schemas.openxmlformats.org/drawingml/2006/main" noChangeAspect="1"/>
+            </wp:cNvGraphicFramePr>
+            <a:graphic xmlns:a="http://schemas.openxmlformats.org/drawingml/2006/main">
+              <a:graphicData uri="http://schemas.openxmlformats.org/drawingml/2006/picture">
+                <pic:pic xmlns:pic="http://schemas.openxmlformats.org/drawingml/2006/picture">
+                  <pic:nvPicPr>
+                    <pic:cNvPr id="240739578" name=""/>
+                    <pic:cNvPicPr/>
+                  </pic:nvPicPr>
+                  <pic:blipFill>
+                    <a:blip r:embed="rId29"/>
+                    <a:stretch>
+                      <a:fillRect/>
+                    </a:stretch>
+                  </pic:blipFill>
+                  <pic:spPr>
+                    <a:xfrm>
+                      <a:off x="0" y="0"/>
+                      <a:ext cx="5731510" cy="5553710"/>
+                    </a:xfrm>
+                    <a:prstGeom prst="rect">
+                      <a:avLst/>
+                    </a:prstGeom>
+                  </pic:spPr>
+                </pic:pic>
+              </a:graphicData>
+            </a:graphic>
+          </wp:inline>
+        </w:drawing>
+      </w:r>
+    </w:p>
+    <w:p>
+      <w:pPr>
+        <w:ind w:left="-567" w:firstLine="567"/>
+        <w:rPr>
+          <w:lang w:val="en-US"/>
+        </w:rPr>
+      </w:pPr>
+    </w:p>
+    <w:p>
+      <w:pPr>
+        <w:ind w:left="-567" w:firstLine="567"/>
+        <w:rPr>
+          <w:lang w:val="en-US"/>
+        </w:rPr>
+      </w:pPr>
+      <w:r>
+        <w:rPr>
+          <w:lang w:val="en-US"/>
+        </w:rPr>
+        <w:drawing>
+          <wp:inline distT="0" distB="0" distL="0" distR="0" wp14:anchorId="65818684" wp14:editId="2A0BFBF9">
+            <wp:extent cx="5731510" cy="2558148"/>
+            <wp:effectExtent l="0" t="0" r="0" b="0"/>
+            <wp:docPr id="1212679266" name="Picture 1"/>
+            <wp:cNvGraphicFramePr>
+              <a:graphicFrameLocks xmlns:a="http://schemas.openxmlformats.org/drawingml/2006/main" noChangeAspect="1"/>
+            </wp:cNvGraphicFramePr>
+            <a:graphic xmlns:a="http://schemas.openxmlformats.org/drawingml/2006/main">
+              <a:graphicData uri="http://schemas.openxmlformats.org/drawingml/2006/picture">
+                <pic:pic xmlns:pic="http://schemas.openxmlformats.org/drawingml/2006/picture">
+                  <pic:nvPicPr>
+                    <pic:cNvPr id="1212679266" name=""/>
+                    <pic:cNvPicPr/>
+                  </pic:nvPicPr>
+                  <pic:blipFill rotWithShape="1">
+                    <a:blip r:embed="rId30"/>
+                    <a:srcRect r="5674"/>
+                    <a:stretch>
+                      <a:fillRect/>
+                    </a:stretch>
+                  </pic:blipFill>
+                  <pic:spPr bwMode="auto">
+                    <a:xfrm>
+                      <a:off x="0" y="0"/>
+                      <a:ext cx="5753611" cy="2568012"/>
+                    </a:xfrm>
+                    <a:prstGeom prst="rect">
+                      <a:avLst/>
+                    </a:prstGeom>
+                    <a:ln>
+                      <a:noFill/>
+                    </a:ln>
+                    <a:extLst>
+                      <a:ext uri="{53640926-AAD7-44D8-BBD7-CCE9431645EC}">
+                        <a14:shadowObscured xmlns:a14="http://schemas.microsoft.com/office/drawing/2010/main"/>
+                      </a:ext>
+                    </a:extLst>
+                  </pic:spPr>
+                </pic:pic>
+              </a:graphicData>
+            </a:graphic>
+          </wp:inline>
+        </w:drawing>
+      </w:r>
+    </w:p>
+    <w:p>
+      <w:pPr>
+        <w:pStyle w:val="Heading2"/>
+      </w:pPr>
+      <w:r>
+        <w:rPr>
+          <w:rStyle w:val="s1"/>
+        </w:rPr>
+        <w:lastRenderedPageBreak/>
+        <w:t>JavaScript Event Object</w:t>
+      </w:r>
+    </w:p>
+    <w:p>
+      <w:pPr>
+        <w:pStyle w:val="p2"/>
+      </w:pPr>
+      <w:r>
+        <w:t xml:space="preserve">The </w:t>
+      </w:r>
+      <w:r>
+        <w:rPr>
+          <w:rStyle w:val="s1"/>
+          <w:b/>
+          <w:bCs/>
+        </w:rPr>
+        <w:t>Event Object</w:t>
+      </w:r>
+      <w:r>
+        <w:t xml:space="preserve"> is an object automatically created by the browser when an event happens. It contains information about that event.</w:t>
+      </w:r>
+    </w:p>
+    <w:p>
+      <w:pPr>
+        <w:ind w:left="-567" w:firstLine="567"/>
+        <w:rPr>
+          <w:lang w:val="en-US"/>
+        </w:rPr>
+      </w:pPr>
+    </w:p>
+    <w:p>
+      <w:pPr>
+        <w:ind w:left="-567" w:firstLine="567"/>
+        <w:rPr>
+          <w:lang w:val="en-US"/>
+        </w:rPr>
+      </w:pPr>
     </w:p>
     <w:sectPr>
       <w:pgSz w:w="11906" w:h="16838"/>

</xml_diff>

<commit_message>
JS - RockPaperScissors added logic and completed
</commit_message>
<xml_diff>
--- a/Java Scripts.docx
+++ b/Java Scripts.docx
@@ -7351,21 +7351,7 @@
             <w:rStyle w:val="Hyperlink"/>
             <w:lang w:val="en-US"/>
           </w:rPr>
-          <w:t>https://developer.mozilla.or</w:t>
-        </w:r>
-        <w:r>
-          <w:rPr>
-            <w:rStyle w:val="Hyperlink"/>
-            <w:lang w:val="en-US"/>
-          </w:rPr>
-          <w:t>g</w:t>
-        </w:r>
-        <w:r>
-          <w:rPr>
-            <w:rStyle w:val="Hyperlink"/>
-            <w:lang w:val="en-US"/>
-          </w:rPr>
-          <w:t>/en-US/</w:t>
+          <w:t>https://developer.mozilla.org/en-US/</w:t>
         </w:r>
       </w:hyperlink>
       <w:r>
@@ -7405,6 +7391,9 @@
         <w:br/>
       </w:r>
       <w:r>
+        <w:rPr>
+          <w:noProof/>
+        </w:rPr>
         <w:drawing>
           <wp:inline distT="0" distB="0" distL="0" distR="0" wp14:anchorId="2B39FF79" wp14:editId="39E42728">
             <wp:extent cx="5731510" cy="1308100"/>
@@ -7582,6 +7571,7 @@
       </w:r>
       <w:r>
         <w:rPr>
+          <w:noProof/>
           <w:lang w:val="en-US"/>
         </w:rPr>
         <w:drawing>
@@ -7707,6 +7697,7 @@
       </w:pPr>
       <w:r>
         <w:rPr>
+          <w:noProof/>
           <w:lang w:val="en-US"/>
         </w:rPr>
         <w:drawing>
@@ -7865,33 +7856,75 @@
           <w:b/>
           <w:bCs/>
         </w:rPr>
-        <w:t>p</w:t>
-      </w:r>
+        <w:t xml:space="preserve">p </w:t>
+      </w:r>
+      <w:proofErr w:type="spellStart"/>
       <w:r>
         <w:rPr>
           <w:rStyle w:val="s1"/>
           <w:b/>
           <w:bCs/>
         </w:rPr>
-        <w:t xml:space="preserve"> </w:t>
-      </w:r>
-      <w:proofErr w:type="spellStart"/>
+        <w:t>utting</w:t>
+      </w:r>
+      <w:proofErr w:type="spellEnd"/>
       <w:r>
         <w:rPr>
           <w:rStyle w:val="s1"/>
           <w:b/>
           <w:bCs/>
         </w:rPr>
-        <w:t>utting</w:t>
-      </w:r>
-      <w:proofErr w:type="spellEnd"/>
+        <w:t xml:space="preserve"> variables or expressions directly inside a string</w:t>
+      </w:r>
+      <w:r>
+        <w:rPr>
+          <w:rStyle w:val="s2"/>
+        </w:rPr>
+        <w:t>.</w:t>
+      </w:r>
+    </w:p>
+    <w:p>
+      <w:pPr>
+        <w:pStyle w:val="p2"/>
+        <w:ind w:left="-567" w:firstLine="567"/>
+        <w:rPr>
+          <w:rStyle w:val="s2"/>
+        </w:rPr>
+      </w:pPr>
+      <w:r>
+        <w:t xml:space="preserve">In JavaScript, we use </w:t>
+      </w:r>
       <w:r>
         <w:rPr>
           <w:rStyle w:val="s1"/>
           <w:b/>
           <w:bCs/>
         </w:rPr>
-        <w:t xml:space="preserve"> variables or expressions directly inside a string</w:t>
+        <w:t>template literals</w:t>
+      </w:r>
+      <w:r>
+        <w:rPr>
+          <w:rStyle w:val="s2"/>
+        </w:rPr>
+        <w:t xml:space="preserve"> with backticks </w:t>
+      </w:r>
+      <w:r>
+        <w:rPr>
+          <w:rStyle w:val="HTMLCode"/>
+        </w:rPr>
+        <w:t>`</w:t>
+      </w:r>
+      <w:r>
+        <w:rPr>
+          <w:rStyle w:val="s2"/>
+        </w:rPr>
+        <w:t xml:space="preserve"> and </w:t>
+      </w:r>
+      <w:r>
+        <w:rPr>
+          <w:rStyle w:val="HTMLCode"/>
+        </w:rPr>
+        <w:t>${}</w:t>
       </w:r>
       <w:r>
         <w:rPr>
@@ -7902,63 +7935,14 @@
     </w:p>
     <w:p>
       <w:pPr>
-        <w:pStyle w:val="p2"/>
         <w:ind w:left="-567" w:firstLine="567"/>
         <w:rPr>
-          <w:rStyle w:val="s2"/>
-        </w:rPr>
-      </w:pPr>
-      <w:r>
-        <w:t xml:space="preserve">In JavaScript, we use </w:t>
-      </w:r>
-      <w:r>
-        <w:rPr>
-          <w:rStyle w:val="s1"/>
-          <w:b/>
-          <w:bCs/>
-        </w:rPr>
-        <w:t>template literals</w:t>
-      </w:r>
-      <w:r>
-        <w:rPr>
-          <w:rStyle w:val="s2"/>
-        </w:rPr>
-        <w:t xml:space="preserve"> with backticks </w:t>
-      </w:r>
-      <w:r>
-        <w:rPr>
-          <w:rStyle w:val="HTMLCode"/>
-        </w:rPr>
-        <w:t>`</w:t>
-      </w:r>
-      <w:r>
-        <w:rPr>
-          <w:rStyle w:val="s2"/>
-        </w:rPr>
-        <w:t xml:space="preserve"> and </w:t>
-      </w:r>
-      <w:r>
-        <w:rPr>
-          <w:rStyle w:val="HTMLCode"/>
-        </w:rPr>
-        <w:t>${}</w:t>
-      </w:r>
-      <w:r>
-        <w:rPr>
-          <w:rStyle w:val="s2"/>
-        </w:rPr>
-        <w:t>.</w:t>
-      </w:r>
-    </w:p>
-    <w:p>
-      <w:pPr>
-        <w:ind w:left="-567" w:firstLine="567"/>
-        <w:rPr>
           <w:lang w:val="en-US"/>
         </w:rPr>
       </w:pPr>
       <w:r>
         <w:rPr>
+          <w:noProof/>
           <w:lang w:val="en-US"/>
         </w:rPr>
         <w:drawing>
@@ -8041,6 +8025,7 @@
       </w:r>
       <w:r>
         <w:rPr>
+          <w:noProof/>
           <w:lang w:val="en-US"/>
         </w:rPr>
         <w:drawing>
@@ -9312,6 +9297,7 @@
       </w:pPr>
       <w:r>
         <w:rPr>
+          <w:noProof/>
           <w:lang w:val="en-US"/>
         </w:rPr>
         <w:drawing>
@@ -11895,6 +11881,7 @@
       <w:r>
         <w:rPr>
           <w:rStyle w:val="s1"/>
+          <w:noProof/>
         </w:rPr>
         <w:drawing>
           <wp:inline distT="0" distB="0" distL="0" distR="0" wp14:anchorId="0A9A7245" wp14:editId="794EDF57">
@@ -11964,6 +11951,7 @@
       </w:r>
       <w:r>
         <w:rPr>
+          <w:noProof/>
           <w:lang w:val="en-US"/>
         </w:rPr>
         <w:drawing>
@@ -12583,6 +12571,9 @@
         <w:br/>
       </w:r>
       <w:r>
+        <w:rPr>
+          <w:noProof/>
+        </w:rPr>
         <w:drawing>
           <wp:inline distT="0" distB="0" distL="0" distR="0" wp14:anchorId="59109D15" wp14:editId="01CB6BFC">
             <wp:extent cx="5731510" cy="2211705"/>
@@ -12626,6 +12617,9 @@
         <w:br/>
       </w:r>
       <w:r>
+        <w:rPr>
+          <w:noProof/>
+        </w:rPr>
         <w:lastRenderedPageBreak/>
         <w:drawing>
           <wp:inline distT="0" distB="0" distL="0" distR="0" wp14:anchorId="7D16291B" wp14:editId="043BB444">
@@ -12729,6 +12723,9 @@
         <w:pStyle w:val="p1"/>
       </w:pPr>
       <w:r>
+        <w:rPr>
+          <w:noProof/>
+        </w:rPr>
         <w:drawing>
           <wp:inline distT="0" distB="0" distL="0" distR="0" wp14:anchorId="04C310F0" wp14:editId="410B36B2">
             <wp:extent cx="2482896" cy="2826241"/>
@@ -12781,6 +12778,9 @@
         <w:br/>
       </w:r>
       <w:r>
+        <w:rPr>
+          <w:noProof/>
+        </w:rPr>
         <w:lastRenderedPageBreak/>
         <w:drawing>
           <wp:inline distT="0" distB="0" distL="0" distR="0" wp14:anchorId="130BFEC3" wp14:editId="3EBD4798">
@@ -13019,6 +13019,9 @@
         <w:pStyle w:val="p2"/>
       </w:pPr>
       <w:r>
+        <w:rPr>
+          <w:noProof/>
+        </w:rPr>
         <w:lastRenderedPageBreak/>
         <w:drawing>
           <wp:inline distT="0" distB="0" distL="0" distR="0" wp14:anchorId="47C69B84" wp14:editId="66DE868D">
@@ -13122,6 +13125,9 @@
         <w:br/>
       </w:r>
       <w:r>
+        <w:rPr>
+          <w:noProof/>
+        </w:rPr>
         <w:drawing>
           <wp:inline distT="0" distB="0" distL="0" distR="0" wp14:anchorId="1BB1241F" wp14:editId="40C3AC06">
             <wp:extent cx="5731510" cy="5228590"/>
@@ -13166,6 +13172,9 @@
         <w:br/>
       </w:r>
       <w:r>
+        <w:rPr>
+          <w:noProof/>
+        </w:rPr>
         <w:drawing>
           <wp:inline distT="0" distB="0" distL="0" distR="0" wp14:anchorId="0A324696" wp14:editId="3F1977E3">
             <wp:extent cx="5731510" cy="4123690"/>
@@ -13586,6 +13595,7 @@
       </w:pPr>
       <w:r>
         <w:rPr>
+          <w:noProof/>
           <w:lang w:val="en-US"/>
         </w:rPr>
         <w:lastRenderedPageBreak/>
@@ -13651,6 +13661,7 @@
       </w:pPr>
       <w:r>
         <w:rPr>
+          <w:noProof/>
           <w:lang w:val="en-US"/>
         </w:rPr>
         <w:lastRenderedPageBreak/>
@@ -14959,6 +14970,7 @@
       </w:pPr>
       <w:r>
         <w:rPr>
+          <w:noProof/>
           <w:lang w:val="en-US"/>
         </w:rPr>
         <w:lastRenderedPageBreak/>
@@ -15032,24 +15044,81 @@
         </w:rPr>
         <w:t>script:</w:t>
       </w:r>
-      <w:r>
-        <w:rPr>
-          <w:lang w:val="en-US"/>
-        </w:rPr>
-        <w:br/>
-      </w:r>
     </w:p>
     <w:p>
       <w:pPr>
         <w:ind w:left="-567" w:firstLine="567"/>
+        <w:jc w:val="right"/>
         <w:rPr>
           <w:lang w:val="en-US"/>
         </w:rPr>
       </w:pPr>
       <w:r>
         <w:rPr>
+          <w:noProof/>
+        </w:rPr>
+        <w:drawing>
+          <wp:inline distT="0" distB="0" distL="0" distR="0" wp14:anchorId="2820D8E0" wp14:editId="70C8D02A">
+            <wp:extent cx="4054506" cy="2215918"/>
+            <wp:effectExtent l="0" t="0" r="0" b="0"/>
+            <wp:docPr id="511855439" name="Picture 5"/>
+            <wp:cNvGraphicFramePr>
+              <a:graphicFrameLocks xmlns:a="http://schemas.openxmlformats.org/drawingml/2006/main" noChangeAspect="1"/>
+            </wp:cNvGraphicFramePr>
+            <a:graphic xmlns:a="http://schemas.openxmlformats.org/drawingml/2006/main">
+              <a:graphicData uri="http://schemas.openxmlformats.org/drawingml/2006/picture">
+                <pic:pic xmlns:pic="http://schemas.openxmlformats.org/drawingml/2006/picture">
+                  <pic:nvPicPr>
+                    <pic:cNvPr id="511855439" name="Picture 5"/>
+                    <pic:cNvPicPr/>
+                  </pic:nvPicPr>
+                  <pic:blipFill>
+                    <a:blip r:embed="rId28" cstate="print">
+                      <a:extLst>
+                        <a:ext uri="{28A0092B-C50C-407E-A947-70E740481C1C}">
+                          <a14:useLocalDpi xmlns:a14="http://schemas.microsoft.com/office/drawing/2010/main" val="0"/>
+                        </a:ext>
+                      </a:extLst>
+                    </a:blip>
+                    <a:stretch>
+                      <a:fillRect/>
+                    </a:stretch>
+                  </pic:blipFill>
+                  <pic:spPr>
+                    <a:xfrm>
+                      <a:off x="0" y="0"/>
+                      <a:ext cx="4093929" cy="2237464"/>
+                    </a:xfrm>
+                    <a:prstGeom prst="rect">
+                      <a:avLst/>
+                    </a:prstGeom>
+                  </pic:spPr>
+                </pic:pic>
+              </a:graphicData>
+            </a:graphic>
+          </wp:inline>
+        </w:drawing>
+      </w:r>
+      <w:r>
+        <w:rPr>
           <w:lang w:val="en-US"/>
         </w:rPr>
+        <w:br/>
+      </w:r>
+    </w:p>
+    <w:p>
+      <w:pPr>
+        <w:ind w:left="-567" w:firstLine="567"/>
+        <w:rPr>
+          <w:lang w:val="en-US"/>
+        </w:rPr>
+      </w:pPr>
+      <w:r>
+        <w:rPr>
+          <w:noProof/>
+          <w:lang w:val="en-US"/>
+        </w:rPr>
+        <w:lastRenderedPageBreak/>
         <w:drawing>
           <wp:inline distT="0" distB="0" distL="0" distR="0" wp14:anchorId="095D676B" wp14:editId="080BF4C2">
             <wp:extent cx="5586517" cy="4863249"/>
@@ -15066,7 +15135,7 @@
                     <pic:cNvPicPr/>
                   </pic:nvPicPr>
                   <pic:blipFill rotWithShape="1">
-                    <a:blip r:embed="rId28"/>
+                    <a:blip r:embed="rId29"/>
                     <a:srcRect r="10797"/>
                     <a:stretch>
                       <a:fillRect/>
@@ -15105,6 +15174,7 @@
       </w:pPr>
       <w:r>
         <w:rPr>
+          <w:noProof/>
           <w:lang w:val="en-US"/>
         </w:rPr>
         <w:lastRenderedPageBreak/>
@@ -15124,7 +15194,7 @@
                     <pic:cNvPicPr/>
                   </pic:nvPicPr>
                   <pic:blipFill>
-                    <a:blip r:embed="rId29"/>
+                    <a:blip r:embed="rId30"/>
                     <a:stretch>
                       <a:fillRect/>
                     </a:stretch>
@@ -15162,6 +15232,7 @@
       </w:pPr>
       <w:r>
         <w:rPr>
+          <w:noProof/>
           <w:lang w:val="en-US"/>
         </w:rPr>
         <w:drawing>
@@ -15180,7 +15251,7 @@
                     <pic:cNvPicPr/>
                   </pic:nvPicPr>
                   <pic:blipFill rotWithShape="1">
-                    <a:blip r:embed="rId30"/>
+                    <a:blip r:embed="rId31"/>
                     <a:srcRect r="5674"/>
                     <a:stretch>
                       <a:fillRect/>
@@ -15256,6 +15327,94 @@
           <w:lang w:val="en-US"/>
         </w:rPr>
       </w:pPr>
+      <w:r>
+        <w:rPr>
+          <w:lang w:val="en-US"/>
+        </w:rPr>
+        <w:t xml:space="preserve">For getting random number use Math class in </w:t>
+      </w:r>
+      <w:proofErr w:type="spellStart"/>
+      <w:r>
+        <w:rPr>
+          <w:lang w:val="en-US"/>
+        </w:rPr>
+        <w:t>Javascripts</w:t>
+      </w:r>
+      <w:proofErr w:type="spellEnd"/>
+      <w:r>
+        <w:rPr>
+          <w:lang w:val="en-US"/>
+        </w:rPr>
+        <w:t>:</w:t>
+      </w:r>
+    </w:p>
+    <w:p>
+      <w:pPr>
+        <w:ind w:left="-567" w:firstLine="567"/>
+        <w:rPr>
+          <w:lang w:val="en-US"/>
+        </w:rPr>
+      </w:pPr>
+    </w:p>
+    <w:p>
+      <w:pPr>
+        <w:ind w:left="-567" w:firstLine="567"/>
+        <w:rPr>
+          <w:lang w:val="en-US"/>
+        </w:rPr>
+      </w:pPr>
+      <w:r>
+        <w:rPr>
+          <w:lang w:val="en-US"/>
+        </w:rPr>
+        <w:drawing>
+          <wp:inline distT="0" distB="0" distL="0" distR="0" wp14:anchorId="52FFC005" wp14:editId="4D3D8F40">
+            <wp:extent cx="5731510" cy="2595880"/>
+            <wp:effectExtent l="0" t="0" r="0" b="0"/>
+            <wp:docPr id="1375060911" name="Picture 1"/>
+            <wp:cNvGraphicFramePr>
+              <a:graphicFrameLocks xmlns:a="http://schemas.openxmlformats.org/drawingml/2006/main" noChangeAspect="1"/>
+            </wp:cNvGraphicFramePr>
+            <a:graphic xmlns:a="http://schemas.openxmlformats.org/drawingml/2006/main">
+              <a:graphicData uri="http://schemas.openxmlformats.org/drawingml/2006/picture">
+                <pic:pic xmlns:pic="http://schemas.openxmlformats.org/drawingml/2006/picture">
+                  <pic:nvPicPr>
+                    <pic:cNvPr id="1375060911" name=""/>
+                    <pic:cNvPicPr/>
+                  </pic:nvPicPr>
+                  <pic:blipFill>
+                    <a:blip r:embed="rId32"/>
+                    <a:stretch>
+                      <a:fillRect/>
+                    </a:stretch>
+                  </pic:blipFill>
+                  <pic:spPr>
+                    <a:xfrm>
+                      <a:off x="0" y="0"/>
+                      <a:ext cx="5731510" cy="2595880"/>
+                    </a:xfrm>
+                    <a:prstGeom prst="rect">
+                      <a:avLst/>
+                    </a:prstGeom>
+                  </pic:spPr>
+                </pic:pic>
+              </a:graphicData>
+            </a:graphic>
+          </wp:inline>
+        </w:drawing>
+      </w:r>
+      <w:r>
+        <w:rPr>
+          <w:lang w:val="en-US"/>
+        </w:rPr>
+        <w:br/>
+      </w:r>
+      <w:r>
+        <w:rPr>
+          <w:lang w:val="en-US"/>
+        </w:rPr>
+        <w:br/>
+      </w:r>
     </w:p>
     <w:sectPr>
       <w:pgSz w:w="11906" w:h="16838"/>

</xml_diff>

<commit_message>
JS: Object and Prototype Property in JS
</commit_message>
<xml_diff>
--- a/Java Scripts.docx
+++ b/Java Scripts.docx
@@ -15358,10 +15358,7 @@
     </w:p>
     <w:p>
       <w:pPr>
-        <w:ind w:left="-567" w:firstLine="567"/>
-        <w:rPr>
-          <w:lang w:val="en-US"/>
-        </w:rPr>
+        <w:pStyle w:val="p1"/>
       </w:pPr>
       <w:r>
         <w:rPr>
@@ -15414,6 +15411,526 @@
           <w:lang w:val="en-US"/>
         </w:rPr>
         <w:br/>
+      </w:r>
+      <w:r>
+        <w:rPr>
+          <w:lang w:val="en-US"/>
+        </w:rPr>
+        <w:t>Classes and object in JS:</w:t>
+      </w:r>
+      <w:r>
+        <w:rPr>
+          <w:lang w:val="en-US"/>
+        </w:rPr>
+        <w:br/>
+      </w:r>
+      <w:r>
+        <w:rPr>
+          <w:lang w:val="en-US"/>
+        </w:rPr>
+        <w:br/>
+      </w:r>
+      <w:proofErr w:type="gramStart"/>
+      <w:r>
+        <w:rPr>
+          <w:lang w:val="en-US"/>
+        </w:rPr>
+        <w:t>A  Java</w:t>
+      </w:r>
+      <w:proofErr w:type="gramEnd"/>
+      <w:r>
+        <w:rPr>
+          <w:lang w:val="en-US"/>
+        </w:rPr>
+        <w:t xml:space="preserve"> script object is an entity having state and behavior (properties and method).</w:t>
+      </w:r>
+      <w:r>
+        <w:rPr>
+          <w:lang w:val="en-US"/>
+        </w:rPr>
+        <w:br/>
+      </w:r>
+      <w:r>
+        <w:rPr>
+          <w:lang w:val="en-US"/>
+        </w:rPr>
+        <w:br/>
+      </w:r>
+      <w:r>
+        <w:t xml:space="preserve">In JavaScript, an </w:t>
+      </w:r>
+      <w:r>
+        <w:rPr>
+          <w:rStyle w:val="s1"/>
+          <w:b/>
+          <w:bCs/>
+        </w:rPr>
+        <w:t>object</w:t>
+      </w:r>
+      <w:r>
+        <w:t xml:space="preserve"> is a collection of related data stored as </w:t>
+      </w:r>
+      <w:r>
+        <w:rPr>
+          <w:rStyle w:val="s1"/>
+          <w:b/>
+          <w:bCs/>
+        </w:rPr>
+        <w:t>key–value pairs</w:t>
+      </w:r>
+      <w:r>
+        <w:t>.</w:t>
+      </w:r>
+      <w:r>
+        <w:br/>
+      </w:r>
+      <w:r>
+        <w:br/>
+      </w:r>
+      <w:r>
+        <w:rPr>
+          <w:rStyle w:val="HTMLCode"/>
+          <w:rFonts w:eastAsiaTheme="majorEastAsia"/>
+        </w:rPr>
+        <w:t xml:space="preserve"> </w:t>
+      </w:r>
+      <w:r>
+        <w:rPr>
+          <w:rStyle w:val="HTMLCode"/>
+          <w:rFonts w:eastAsiaTheme="majorEastAsia"/>
+        </w:rPr>
+        <w:t>P</w:t>
+      </w:r>
+      <w:r>
+        <w:rPr>
+          <w:rStyle w:val="HTMLCode"/>
+        </w:rPr>
+        <w:t>rototype</w:t>
+      </w:r>
+      <w:r>
+        <w:t xml:space="preserve"> </w:t>
+      </w:r>
+      <w:r>
+        <w:rPr>
+          <w:rStyle w:val="s1"/>
+        </w:rPr>
+        <w:t>property</w:t>
+      </w:r>
+    </w:p>
+    <w:p>
+      <w:pPr>
+        <w:pStyle w:val="p2"/>
+        <w:rPr>
+          <w:rStyle w:val="s2"/>
+        </w:rPr>
+      </w:pPr>
+      <w:r>
+        <w:t xml:space="preserve">The </w:t>
+      </w:r>
+      <w:r>
+        <w:rPr>
+          <w:rStyle w:val="HTMLCode"/>
+          <w:b/>
+          <w:bCs/>
+        </w:rPr>
+        <w:t>prototype</w:t>
+      </w:r>
+      <w:r>
+        <w:rPr>
+          <w:rStyle w:val="s1"/>
+          <w:b/>
+          <w:bCs/>
+        </w:rPr>
+        <w:t xml:space="preserve"> property belongs mainly to constructor functions/classes</w:t>
+      </w:r>
+      <w:r>
+        <w:rPr>
+          <w:rStyle w:val="s2"/>
+        </w:rPr>
+        <w:t>, not to normal objects.</w:t>
+      </w:r>
+      <w:r>
+        <w:rPr>
+          <w:rStyle w:val="s2"/>
+        </w:rPr>
+        <w:br/>
+      </w:r>
+      <w:r>
+        <w:rPr>
+          <w:rStyle w:val="s2"/>
+        </w:rPr>
+        <w:br/>
+        <w:t>prototype is a reference type of an object.</w:t>
+      </w:r>
+    </w:p>
+    <w:p>
+      <w:pPr>
+        <w:pStyle w:val="p1"/>
+      </w:pPr>
+    </w:p>
+    <w:p>
+      <w:pPr>
+        <w:ind w:left="-567" w:firstLine="567"/>
+        <w:rPr>
+          <w:lang w:val="en-US"/>
+        </w:rPr>
+      </w:pPr>
+    </w:p>
+    <w:p>
+      <w:pPr>
+        <w:ind w:left="-567" w:firstLine="567"/>
+        <w:rPr>
+          <w:lang w:val="en-US"/>
+        </w:rPr>
+      </w:pPr>
+      <w:r>
+        <w:rPr>
+          <w:noProof/>
+          <w:lang w:val="en-US"/>
+        </w:rPr>
+        <w:lastRenderedPageBreak/>
+        <w:drawing>
+          <wp:inline distT="0" distB="0" distL="0" distR="0" wp14:anchorId="3A4B67BE" wp14:editId="5C54FD57">
+            <wp:extent cx="5731510" cy="4693920"/>
+            <wp:effectExtent l="0" t="0" r="0" b="5080"/>
+            <wp:docPr id="22372529" name="Picture 1"/>
+            <wp:cNvGraphicFramePr>
+              <a:graphicFrameLocks xmlns:a="http://schemas.openxmlformats.org/drawingml/2006/main" noChangeAspect="1"/>
+            </wp:cNvGraphicFramePr>
+            <a:graphic xmlns:a="http://schemas.openxmlformats.org/drawingml/2006/main">
+              <a:graphicData uri="http://schemas.openxmlformats.org/drawingml/2006/picture">
+                <pic:pic xmlns:pic="http://schemas.openxmlformats.org/drawingml/2006/picture">
+                  <pic:nvPicPr>
+                    <pic:cNvPr id="22372529" name="Picture 22372529"/>
+                    <pic:cNvPicPr/>
+                  </pic:nvPicPr>
+                  <pic:blipFill>
+                    <a:blip r:embed="rId33">
+                      <a:extLst>
+                        <a:ext uri="{28A0092B-C50C-407E-A947-70E740481C1C}">
+                          <a14:useLocalDpi xmlns:a14="http://schemas.microsoft.com/office/drawing/2010/main" val="0"/>
+                        </a:ext>
+                      </a:extLst>
+                    </a:blip>
+                    <a:stretch>
+                      <a:fillRect/>
+                    </a:stretch>
+                  </pic:blipFill>
+                  <pic:spPr>
+                    <a:xfrm>
+                      <a:off x="0" y="0"/>
+                      <a:ext cx="5731510" cy="4693920"/>
+                    </a:xfrm>
+                    <a:prstGeom prst="rect">
+                      <a:avLst/>
+                    </a:prstGeom>
+                  </pic:spPr>
+                </pic:pic>
+              </a:graphicData>
+            </a:graphic>
+          </wp:inline>
+        </w:drawing>
+      </w:r>
+    </w:p>
+    <w:p>
+      <w:pPr>
+        <w:ind w:left="-567" w:firstLine="567"/>
+        <w:rPr>
+          <w:lang w:val="en-US"/>
+        </w:rPr>
+      </w:pPr>
+    </w:p>
+    <w:p>
+      <w:pPr>
+        <w:ind w:left="-567" w:firstLine="567"/>
+        <w:rPr>
+          <w:lang w:val="en-US"/>
+        </w:rPr>
+      </w:pPr>
+      <w:r>
+        <w:rPr>
+          <w:lang w:val="en-US"/>
+        </w:rPr>
+        <w:lastRenderedPageBreak/>
+        <w:drawing>
+          <wp:inline distT="0" distB="0" distL="0" distR="0" wp14:anchorId="16FB78B2" wp14:editId="63E0688F">
+            <wp:extent cx="5731510" cy="5461635"/>
+            <wp:effectExtent l="0" t="0" r="0" b="0"/>
+            <wp:docPr id="931055462" name="Picture 1"/>
+            <wp:cNvGraphicFramePr>
+              <a:graphicFrameLocks xmlns:a="http://schemas.openxmlformats.org/drawingml/2006/main" noChangeAspect="1"/>
+            </wp:cNvGraphicFramePr>
+            <a:graphic xmlns:a="http://schemas.openxmlformats.org/drawingml/2006/main">
+              <a:graphicData uri="http://schemas.openxmlformats.org/drawingml/2006/picture">
+                <pic:pic xmlns:pic="http://schemas.openxmlformats.org/drawingml/2006/picture">
+                  <pic:nvPicPr>
+                    <pic:cNvPr id="931055462" name=""/>
+                    <pic:cNvPicPr/>
+                  </pic:nvPicPr>
+                  <pic:blipFill>
+                    <a:blip r:embed="rId34"/>
+                    <a:stretch>
+                      <a:fillRect/>
+                    </a:stretch>
+                  </pic:blipFill>
+                  <pic:spPr>
+                    <a:xfrm>
+                      <a:off x="0" y="0"/>
+                      <a:ext cx="5731510" cy="5461635"/>
+                    </a:xfrm>
+                    <a:prstGeom prst="rect">
+                      <a:avLst/>
+                    </a:prstGeom>
+                  </pic:spPr>
+                </pic:pic>
+              </a:graphicData>
+            </a:graphic>
+          </wp:inline>
+        </w:drawing>
+      </w:r>
+    </w:p>
+    <w:p>
+      <w:pPr>
+        <w:ind w:left="-567" w:firstLine="567"/>
+        <w:rPr>
+          <w:lang w:val="en-US"/>
+        </w:rPr>
+      </w:pPr>
+    </w:p>
+    <w:p>
+      <w:pPr>
+        <w:ind w:left="-567" w:firstLine="567"/>
+        <w:rPr>
+          <w:lang w:val="en-US"/>
+        </w:rPr>
+      </w:pPr>
+      <w:r>
+        <w:rPr>
+          <w:lang w:val="en-US"/>
+        </w:rPr>
+        <w:t xml:space="preserve">We can set prototype </w:t>
+      </w:r>
+      <w:proofErr w:type="gramStart"/>
+      <w:r>
+        <w:rPr>
+          <w:lang w:val="en-US"/>
+        </w:rPr>
+        <w:t xml:space="preserve">using </w:t>
+      </w:r>
+      <w:r>
+        <w:rPr>
+          <w:lang w:val="en-US"/>
+        </w:rPr>
+        <w:t xml:space="preserve"> </w:t>
+      </w:r>
+      <w:r>
+        <w:rPr>
+          <w:lang w:val="en-US"/>
+        </w:rPr>
+        <w:t>‘</w:t>
+      </w:r>
+      <w:proofErr w:type="gramEnd"/>
+      <w:r>
+        <w:rPr>
+          <w:lang w:val="en-US"/>
+        </w:rPr>
+        <w:t>_ _proto</w:t>
+      </w:r>
+      <w:proofErr w:type="gramStart"/>
+      <w:r>
+        <w:rPr>
+          <w:lang w:val="en-US"/>
+        </w:rPr>
+        <w:t xml:space="preserve">_ </w:t>
+      </w:r>
+      <w:r>
+        <w:rPr>
+          <w:lang w:val="en-US"/>
+        </w:rPr>
+        <w:t>:</w:t>
+      </w:r>
+      <w:proofErr w:type="gramEnd"/>
+      <w:r>
+        <w:rPr>
+          <w:lang w:val="en-US"/>
+        </w:rPr>
+        <w:br/>
+      </w:r>
+      <w:r>
+        <w:rPr>
+          <w:lang w:val="en-US"/>
+        </w:rPr>
+        <w:br/>
+      </w:r>
+      <w:r>
+        <w:rPr>
+          <w:lang w:val="en-US"/>
+        </w:rPr>
+        <w:lastRenderedPageBreak/>
+        <w:drawing>
+          <wp:inline distT="0" distB="0" distL="0" distR="0" wp14:anchorId="5DB105FD" wp14:editId="3D6878A8">
+            <wp:extent cx="5731510" cy="4013835"/>
+            <wp:effectExtent l="0" t="0" r="0" b="0"/>
+            <wp:docPr id="77221366" name="Picture 1"/>
+            <wp:cNvGraphicFramePr>
+              <a:graphicFrameLocks xmlns:a="http://schemas.openxmlformats.org/drawingml/2006/main" noChangeAspect="1"/>
+            </wp:cNvGraphicFramePr>
+            <a:graphic xmlns:a="http://schemas.openxmlformats.org/drawingml/2006/main">
+              <a:graphicData uri="http://schemas.openxmlformats.org/drawingml/2006/picture">
+                <pic:pic xmlns:pic="http://schemas.openxmlformats.org/drawingml/2006/picture">
+                  <pic:nvPicPr>
+                    <pic:cNvPr id="77221366" name=""/>
+                    <pic:cNvPicPr/>
+                  </pic:nvPicPr>
+                  <pic:blipFill>
+                    <a:blip r:embed="rId35"/>
+                    <a:stretch>
+                      <a:fillRect/>
+                    </a:stretch>
+                  </pic:blipFill>
+                  <pic:spPr>
+                    <a:xfrm>
+                      <a:off x="0" y="0"/>
+                      <a:ext cx="5731510" cy="4013835"/>
+                    </a:xfrm>
+                    <a:prstGeom prst="rect">
+                      <a:avLst/>
+                    </a:prstGeom>
+                  </pic:spPr>
+                </pic:pic>
+              </a:graphicData>
+            </a:graphic>
+          </wp:inline>
+        </w:drawing>
+      </w:r>
+      <w:r>
+        <w:rPr>
+          <w:lang w:val="en-US"/>
+        </w:rPr>
+        <w:br/>
+      </w:r>
+      <w:r>
+        <w:rPr>
+          <w:lang w:val="en-US"/>
+        </w:rPr>
+        <w:br/>
+      </w:r>
+    </w:p>
+    <w:p>
+      <w:pPr>
+        <w:ind w:left="-567" w:firstLine="567"/>
+        <w:rPr>
+          <w:lang w:val="en-US"/>
+        </w:rPr>
+      </w:pPr>
+    </w:p>
+    <w:p>
+      <w:pPr>
+        <w:ind w:left="-567" w:firstLine="567"/>
+        <w:rPr>
+          <w:lang w:val="en-US"/>
+        </w:rPr>
+      </w:pPr>
+      <w:r>
+        <w:rPr>
+          <w:noProof/>
+          <w:lang w:val="en-US"/>
+        </w:rPr>
+        <w:lastRenderedPageBreak/>
+        <w:drawing>
+          <wp:inline distT="0" distB="0" distL="0" distR="0" wp14:anchorId="5B430949" wp14:editId="5FCF832E">
+            <wp:extent cx="5731510" cy="2844165"/>
+            <wp:effectExtent l="0" t="0" r="0" b="635"/>
+            <wp:docPr id="1632802534" name="Picture 2"/>
+            <wp:cNvGraphicFramePr>
+              <a:graphicFrameLocks xmlns:a="http://schemas.openxmlformats.org/drawingml/2006/main" noChangeAspect="1"/>
+            </wp:cNvGraphicFramePr>
+            <a:graphic xmlns:a="http://schemas.openxmlformats.org/drawingml/2006/main">
+              <a:graphicData uri="http://schemas.openxmlformats.org/drawingml/2006/picture">
+                <pic:pic xmlns:pic="http://schemas.openxmlformats.org/drawingml/2006/picture">
+                  <pic:nvPicPr>
+                    <pic:cNvPr id="1632802534" name="Picture 1632802534"/>
+                    <pic:cNvPicPr/>
+                  </pic:nvPicPr>
+                  <pic:blipFill>
+                    <a:blip r:embed="rId36">
+                      <a:extLst>
+                        <a:ext uri="{28A0092B-C50C-407E-A947-70E740481C1C}">
+                          <a14:useLocalDpi xmlns:a14="http://schemas.microsoft.com/office/drawing/2010/main" val="0"/>
+                        </a:ext>
+                      </a:extLst>
+                    </a:blip>
+                    <a:stretch>
+                      <a:fillRect/>
+                    </a:stretch>
+                  </pic:blipFill>
+                  <pic:spPr>
+                    <a:xfrm>
+                      <a:off x="0" y="0"/>
+                      <a:ext cx="5731510" cy="2844165"/>
+                    </a:xfrm>
+                    <a:prstGeom prst="rect">
+                      <a:avLst/>
+                    </a:prstGeom>
+                  </pic:spPr>
+                </pic:pic>
+              </a:graphicData>
+            </a:graphic>
+          </wp:inline>
+        </w:drawing>
+      </w:r>
+      <w:r>
+        <w:rPr>
+          <w:lang w:val="en-US"/>
+        </w:rPr>
+        <w:t>_’</w:t>
+      </w:r>
+      <w:r>
+        <w:rPr>
+          <w:noProof/>
+          <w:lang w:val="en-US"/>
+        </w:rPr>
+        <w:drawing>
+          <wp:inline distT="0" distB="0" distL="0" distR="0" wp14:anchorId="3F7146C2" wp14:editId="67E6E92C">
+            <wp:extent cx="5731510" cy="3335655"/>
+            <wp:effectExtent l="0" t="0" r="0" b="4445"/>
+            <wp:docPr id="193494060" name="Picture 3"/>
+            <wp:cNvGraphicFramePr>
+              <a:graphicFrameLocks xmlns:a="http://schemas.openxmlformats.org/drawingml/2006/main" noChangeAspect="1"/>
+            </wp:cNvGraphicFramePr>
+            <a:graphic xmlns:a="http://schemas.openxmlformats.org/drawingml/2006/main">
+              <a:graphicData uri="http://schemas.openxmlformats.org/drawingml/2006/picture">
+                <pic:pic xmlns:pic="http://schemas.openxmlformats.org/drawingml/2006/picture">
+                  <pic:nvPicPr>
+                    <pic:cNvPr id="193494060" name="Picture 193494060"/>
+                    <pic:cNvPicPr/>
+                  </pic:nvPicPr>
+                  <pic:blipFill>
+                    <a:blip r:embed="rId37">
+                      <a:extLst>
+                        <a:ext uri="{28A0092B-C50C-407E-A947-70E740481C1C}">
+                          <a14:useLocalDpi xmlns:a14="http://schemas.microsoft.com/office/drawing/2010/main" val="0"/>
+                        </a:ext>
+                      </a:extLst>
+                    </a:blip>
+                    <a:stretch>
+                      <a:fillRect/>
+                    </a:stretch>
+                  </pic:blipFill>
+                  <pic:spPr>
+                    <a:xfrm>
+                      <a:off x="0" y="0"/>
+                      <a:ext cx="5731510" cy="3335655"/>
+                    </a:xfrm>
+                    <a:prstGeom prst="rect">
+                      <a:avLst/>
+                    </a:prstGeom>
+                  </pic:spPr>
+                </pic:pic>
+              </a:graphicData>
+            </a:graphic>
+          </wp:inline>
+        </w:drawing>
       </w:r>
     </w:p>
     <w:sectPr>

</xml_diff>

<commit_message>
JS - Class and Inheritance
</commit_message>
<xml_diff>
--- a/Java Scripts.docx
+++ b/Java Scripts.docx
@@ -15560,6 +15560,13 @@
           <w:rStyle w:val="s2"/>
         </w:rPr>
         <w:br/>
+      </w:r>
+      <w:r>
+        <w:rPr>
+          <w:rStyle w:val="s2"/>
+          <w:b/>
+          <w:bCs/>
+        </w:rPr>
         <w:t>prototype is a reference type of an object.</w:t>
       </w:r>
     </w:p>
@@ -15634,6 +15641,171 @@
     </w:p>
     <w:p>
       <w:pPr>
+        <w:pStyle w:val="Heading3"/>
+      </w:pPr>
+      <w:r>
+        <w:rPr>
+          <w:rStyle w:val="s1"/>
+        </w:rPr>
+        <w:t>Class in JavaScript</w:t>
+      </w:r>
+    </w:p>
+    <w:p>
+      <w:pPr>
+        <w:pStyle w:val="p2"/>
+      </w:pPr>
+      <w:r>
+        <w:t xml:space="preserve">A </w:t>
+      </w:r>
+      <w:r>
+        <w:rPr>
+          <w:rStyle w:val="s1"/>
+          <w:b/>
+          <w:bCs/>
+        </w:rPr>
+        <w:t>class</w:t>
+      </w:r>
+      <w:r>
+        <w:t xml:space="preserve"> in JavaScript is a blueprint for creating objects with </w:t>
+      </w:r>
+      <w:r>
+        <w:rPr>
+          <w:rStyle w:val="s1"/>
+          <w:b/>
+          <w:bCs/>
+        </w:rPr>
+        <w:t>properties and methods</w:t>
+      </w:r>
+      <w:r>
+        <w:t>.</w:t>
+      </w:r>
+    </w:p>
+    <w:p>
+      <w:pPr>
+        <w:pStyle w:val="p2"/>
+      </w:pPr>
+      <w:r>
+        <w:t xml:space="preserve">If you come from Swift/iOS, you can think of a JS </w:t>
+      </w:r>
+      <w:r>
+        <w:rPr>
+          <w:rStyle w:val="HTMLCode"/>
+        </w:rPr>
+        <w:t>class</w:t>
+      </w:r>
+      <w:r>
+        <w:t xml:space="preserve"> as being similar to a Swift </w:t>
+      </w:r>
+      <w:r>
+        <w:rPr>
+          <w:rStyle w:val="HTMLCode"/>
+        </w:rPr>
+        <w:t>class</w:t>
+      </w:r>
+      <w:r>
+        <w:t>.</w:t>
+      </w:r>
+    </w:p>
+    <w:p>
+      <w:pPr>
+        <w:ind w:left="-567" w:firstLine="567"/>
+        <w:rPr>
+          <w:lang w:val="en-US"/>
+        </w:rPr>
+      </w:pPr>
+      <w:r>
+        <w:rPr>
+          <w:lang w:val="en-US"/>
+        </w:rPr>
+        <w:lastRenderedPageBreak/>
+        <w:drawing>
+          <wp:inline distT="0" distB="0" distL="0" distR="0" wp14:anchorId="20E16A97" wp14:editId="59FC92A2">
+            <wp:extent cx="5731510" cy="5069840"/>
+            <wp:effectExtent l="0" t="0" r="0" b="0"/>
+            <wp:docPr id="420968511" name="Picture 1"/>
+            <wp:cNvGraphicFramePr>
+              <a:graphicFrameLocks xmlns:a="http://schemas.openxmlformats.org/drawingml/2006/main" noChangeAspect="1"/>
+            </wp:cNvGraphicFramePr>
+            <a:graphic xmlns:a="http://schemas.openxmlformats.org/drawingml/2006/main">
+              <a:graphicData uri="http://schemas.openxmlformats.org/drawingml/2006/picture">
+                <pic:pic xmlns:pic="http://schemas.openxmlformats.org/drawingml/2006/picture">
+                  <pic:nvPicPr>
+                    <pic:cNvPr id="420968511" name=""/>
+                    <pic:cNvPicPr/>
+                  </pic:nvPicPr>
+                  <pic:blipFill>
+                    <a:blip r:embed="rId34"/>
+                    <a:stretch>
+                      <a:fillRect/>
+                    </a:stretch>
+                  </pic:blipFill>
+                  <pic:spPr>
+                    <a:xfrm>
+                      <a:off x="0" y="0"/>
+                      <a:ext cx="5731510" cy="5069840"/>
+                    </a:xfrm>
+                    <a:prstGeom prst="rect">
+                      <a:avLst/>
+                    </a:prstGeom>
+                  </pic:spPr>
+                </pic:pic>
+              </a:graphicData>
+            </a:graphic>
+          </wp:inline>
+        </w:drawing>
+      </w:r>
+    </w:p>
+    <w:p>
+      <w:pPr>
+        <w:ind w:left="-567" w:firstLine="567"/>
+        <w:rPr>
+          <w:lang w:val="en-US"/>
+        </w:rPr>
+      </w:pPr>
+      <w:r>
+        <w:rPr>
+          <w:lang w:val="en-US"/>
+        </w:rPr>
+        <w:lastRenderedPageBreak/>
+        <w:drawing>
+          <wp:inline distT="0" distB="0" distL="0" distR="0" wp14:anchorId="008D1A63" wp14:editId="01D97ADF">
+            <wp:extent cx="5731510" cy="4961255"/>
+            <wp:effectExtent l="0" t="0" r="0" b="4445"/>
+            <wp:docPr id="457448607" name="Picture 1"/>
+            <wp:cNvGraphicFramePr>
+              <a:graphicFrameLocks xmlns:a="http://schemas.openxmlformats.org/drawingml/2006/main" noChangeAspect="1"/>
+            </wp:cNvGraphicFramePr>
+            <a:graphic xmlns:a="http://schemas.openxmlformats.org/drawingml/2006/main">
+              <a:graphicData uri="http://schemas.openxmlformats.org/drawingml/2006/picture">
+                <pic:pic xmlns:pic="http://schemas.openxmlformats.org/drawingml/2006/picture">
+                  <pic:nvPicPr>
+                    <pic:cNvPr id="457448607" name=""/>
+                    <pic:cNvPicPr/>
+                  </pic:nvPicPr>
+                  <pic:blipFill>
+                    <a:blip r:embed="rId35"/>
+                    <a:stretch>
+                      <a:fillRect/>
+                    </a:stretch>
+                  </pic:blipFill>
+                  <pic:spPr>
+                    <a:xfrm>
+                      <a:off x="0" y="0"/>
+                      <a:ext cx="5731510" cy="4961255"/>
+                    </a:xfrm>
+                    <a:prstGeom prst="rect">
+                      <a:avLst/>
+                    </a:prstGeom>
+                  </pic:spPr>
+                </pic:pic>
+              </a:graphicData>
+            </a:graphic>
+          </wp:inline>
+        </w:drawing>
+      </w:r>
+    </w:p>
+    <w:p>
+      <w:pPr>
         <w:ind w:left="-567" w:firstLine="567"/>
         <w:rPr>
           <w:lang w:val="en-US"/>
@@ -15668,7 +15840,7 @@
                     <pic:cNvPicPr/>
                   </pic:nvPicPr>
                   <pic:blipFill>
-                    <a:blip r:embed="rId34"/>
+                    <a:blip r:embed="rId36"/>
                     <a:stretch>
                       <a:fillRect/>
                     </a:stretch>
@@ -15783,7 +15955,7 @@
                     <pic:cNvPicPr/>
                   </pic:nvPicPr>
                   <pic:blipFill>
-                    <a:blip r:embed="rId35"/>
+                    <a:blip r:embed="rId37"/>
                     <a:stretch>
                       <a:fillRect/>
                     </a:stretch>
@@ -15853,7 +16025,7 @@
                     <pic:cNvPicPr/>
                   </pic:nvPicPr>
                   <pic:blipFill>
-                    <a:blip r:embed="rId36">
+                    <a:blip r:embed="rId38">
                       <a:extLst>
                         <a:ext uri="{28A0092B-C50C-407E-A947-70E740481C1C}">
                           <a14:useLocalDpi xmlns:a14="http://schemas.microsoft.com/office/drawing/2010/main" val="0"/>
@@ -15906,7 +16078,7 @@
                     <pic:cNvPicPr/>
                   </pic:nvPicPr>
                   <pic:blipFill>
-                    <a:blip r:embed="rId37">
+                    <a:blip r:embed="rId39">
                       <a:extLst>
                         <a:ext uri="{28A0092B-C50C-407E-A947-70E740481C1C}">
                           <a14:useLocalDpi xmlns:a14="http://schemas.microsoft.com/office/drawing/2010/main" val="0"/>

</xml_diff>

<commit_message>
JS - Inheritance super keyword
</commit_message>
<xml_diff>
--- a/Java Scripts.docx
+++ b/Java Scripts.docx
@@ -15719,7 +15719,7 @@
         </w:rPr>
         <w:lastRenderedPageBreak/>
         <w:drawing>
-          <wp:inline distT="0" distB="0" distL="0" distR="0" wp14:anchorId="20E16A97" wp14:editId="59FC92A2">
+          <wp:inline distT="0" distB="0" distL="0" distR="0" wp14:anchorId="20E16A97" wp14:editId="6DDD6F6E">
             <wp:extent cx="5731510" cy="5069840"/>
             <wp:effectExtent l="0" t="0" r="0" b="0"/>
             <wp:docPr id="420968511" name="Picture 1"/>
@@ -15768,7 +15768,7 @@
         </w:rPr>
         <w:lastRenderedPageBreak/>
         <w:drawing>
-          <wp:inline distT="0" distB="0" distL="0" distR="0" wp14:anchorId="008D1A63" wp14:editId="01D97ADF">
+          <wp:inline distT="0" distB="0" distL="0" distR="0" wp14:anchorId="008D1A63" wp14:editId="7AB2D4BD">
             <wp:extent cx="5731510" cy="4961255"/>
             <wp:effectExtent l="0" t="0" r="0" b="4445"/>
             <wp:docPr id="457448607" name="Picture 1"/>
@@ -15811,6 +15811,47 @@
           <w:lang w:val="en-US"/>
         </w:rPr>
       </w:pPr>
+      <w:r>
+        <w:rPr>
+          <w:lang w:val="en-US"/>
+        </w:rPr>
+        <w:lastRenderedPageBreak/>
+        <w:drawing>
+          <wp:inline distT="0" distB="0" distL="0" distR="0" wp14:anchorId="26C767A6" wp14:editId="72CC8AAF">
+            <wp:extent cx="5731510" cy="6910705"/>
+            <wp:effectExtent l="0" t="0" r="0" b="0"/>
+            <wp:docPr id="175246506" name="Picture 1"/>
+            <wp:cNvGraphicFramePr>
+              <a:graphicFrameLocks xmlns:a="http://schemas.openxmlformats.org/drawingml/2006/main" noChangeAspect="1"/>
+            </wp:cNvGraphicFramePr>
+            <a:graphic xmlns:a="http://schemas.openxmlformats.org/drawingml/2006/main">
+              <a:graphicData uri="http://schemas.openxmlformats.org/drawingml/2006/picture">
+                <pic:pic xmlns:pic="http://schemas.openxmlformats.org/drawingml/2006/picture">
+                  <pic:nvPicPr>
+                    <pic:cNvPr id="175246506" name=""/>
+                    <pic:cNvPicPr/>
+                  </pic:nvPicPr>
+                  <pic:blipFill>
+                    <a:blip r:embed="rId36"/>
+                    <a:stretch>
+                      <a:fillRect/>
+                    </a:stretch>
+                  </pic:blipFill>
+                  <pic:spPr>
+                    <a:xfrm>
+                      <a:off x="0" y="0"/>
+                      <a:ext cx="5731510" cy="6910705"/>
+                    </a:xfrm>
+                    <a:prstGeom prst="rect">
+                      <a:avLst/>
+                    </a:prstGeom>
+                  </pic:spPr>
+                </pic:pic>
+              </a:graphicData>
+            </a:graphic>
+          </wp:inline>
+        </w:drawing>
+      </w:r>
     </w:p>
     <w:p>
       <w:pPr>
@@ -15821,9 +15862,64 @@
       </w:pPr>
       <w:r>
         <w:rPr>
+          <w:noProof/>
           <w:lang w:val="en-US"/>
         </w:rPr>
         <w:lastRenderedPageBreak/>
+        <w:drawing>
+          <wp:inline distT="0" distB="0" distL="0" distR="0" wp14:anchorId="256418E7" wp14:editId="3E1EA6DA">
+            <wp:extent cx="5731510" cy="3249295"/>
+            <wp:effectExtent l="0" t="0" r="0" b="1905"/>
+            <wp:docPr id="606778753" name="Picture 5"/>
+            <wp:cNvGraphicFramePr>
+              <a:graphicFrameLocks xmlns:a="http://schemas.openxmlformats.org/drawingml/2006/main" noChangeAspect="1"/>
+            </wp:cNvGraphicFramePr>
+            <a:graphic xmlns:a="http://schemas.openxmlformats.org/drawingml/2006/main">
+              <a:graphicData uri="http://schemas.openxmlformats.org/drawingml/2006/picture">
+                <pic:pic xmlns:pic="http://schemas.openxmlformats.org/drawingml/2006/picture">
+                  <pic:nvPicPr>
+                    <pic:cNvPr id="606778753" name="Picture 606778753"/>
+                    <pic:cNvPicPr/>
+                  </pic:nvPicPr>
+                  <pic:blipFill>
+                    <a:blip r:embed="rId37">
+                      <a:extLst>
+                        <a:ext uri="{28A0092B-C50C-407E-A947-70E740481C1C}">
+                          <a14:useLocalDpi xmlns:a14="http://schemas.microsoft.com/office/drawing/2010/main" val="0"/>
+                        </a:ext>
+                      </a:extLst>
+                    </a:blip>
+                    <a:stretch>
+                      <a:fillRect/>
+                    </a:stretch>
+                  </pic:blipFill>
+                  <pic:spPr>
+                    <a:xfrm>
+                      <a:off x="0" y="0"/>
+                      <a:ext cx="5731510" cy="3249295"/>
+                    </a:xfrm>
+                    <a:prstGeom prst="rect">
+                      <a:avLst/>
+                    </a:prstGeom>
+                  </pic:spPr>
+                </pic:pic>
+              </a:graphicData>
+            </a:graphic>
+          </wp:inline>
+        </w:drawing>
+      </w:r>
+    </w:p>
+    <w:p>
+      <w:pPr>
+        <w:ind w:left="-567" w:firstLine="567"/>
+        <w:rPr>
+          <w:lang w:val="en-US"/>
+        </w:rPr>
+      </w:pPr>
+      <w:r>
+        <w:rPr>
+          <w:lang w:val="en-US"/>
+        </w:rPr>
         <w:drawing>
           <wp:inline distT="0" distB="0" distL="0" distR="0" wp14:anchorId="16FB78B2" wp14:editId="63E0688F">
             <wp:extent cx="5731510" cy="5461635"/>
@@ -15840,7 +15936,7 @@
                     <pic:cNvPicPr/>
                   </pic:nvPicPr>
                   <pic:blipFill>
-                    <a:blip r:embed="rId36"/>
+                    <a:blip r:embed="rId38"/>
                     <a:stretch>
                       <a:fillRect/>
                     </a:stretch>
@@ -15938,9 +16034,8 @@
         <w:rPr>
           <w:lang w:val="en-US"/>
         </w:rPr>
-        <w:lastRenderedPageBreak/>
         <w:drawing>
-          <wp:inline distT="0" distB="0" distL="0" distR="0" wp14:anchorId="5DB105FD" wp14:editId="3D6878A8">
+          <wp:inline distT="0" distB="0" distL="0" distR="0" wp14:anchorId="5DB105FD" wp14:editId="55214FAB">
             <wp:extent cx="5731510" cy="4013835"/>
             <wp:effectExtent l="0" t="0" r="0" b="0"/>
             <wp:docPr id="77221366" name="Picture 1"/>
@@ -15955,7 +16050,7 @@
                     <pic:cNvPicPr/>
                   </pic:nvPicPr>
                   <pic:blipFill>
-                    <a:blip r:embed="rId37"/>
+                    <a:blip r:embed="rId39"/>
                     <a:stretch>
                       <a:fillRect/>
                     </a:stretch>
@@ -16021,11 +16116,11 @@
               <a:graphicData uri="http://schemas.openxmlformats.org/drawingml/2006/picture">
                 <pic:pic xmlns:pic="http://schemas.openxmlformats.org/drawingml/2006/picture">
                   <pic:nvPicPr>
-                    <pic:cNvPr id="1632802534" name="Picture 1632802534"/>
+                    <pic:cNvPr id="1632802534" name="Picture 2"/>
                     <pic:cNvPicPr/>
                   </pic:nvPicPr>
                   <pic:blipFill>
-                    <a:blip r:embed="rId38">
+                    <a:blip r:embed="rId40">
                       <a:extLst>
                         <a:ext uri="{28A0092B-C50C-407E-A947-70E740481C1C}">
                           <a14:useLocalDpi xmlns:a14="http://schemas.microsoft.com/office/drawing/2010/main" val="0"/>
@@ -16074,11 +16169,11 @@
               <a:graphicData uri="http://schemas.openxmlformats.org/drawingml/2006/picture">
                 <pic:pic xmlns:pic="http://schemas.openxmlformats.org/drawingml/2006/picture">
                   <pic:nvPicPr>
-                    <pic:cNvPr id="193494060" name="Picture 193494060"/>
+                    <pic:cNvPr id="193494060" name="Picture 3"/>
                     <pic:cNvPicPr/>
                   </pic:nvPicPr>
                   <pic:blipFill>
-                    <a:blip r:embed="rId39">
+                    <a:blip r:embed="rId41">
                       <a:extLst>
                         <a:ext uri="{28A0092B-C50C-407E-A947-70E740481C1C}">
                           <a14:useLocalDpi xmlns:a14="http://schemas.microsoft.com/office/drawing/2010/main" val="0"/>

</xml_diff>

<commit_message>
JS : Class, Inheritance Problems solving
</commit_message>
<xml_diff>
--- a/Java Scripts.docx
+++ b/Java Scripts.docx
@@ -16188,6 +16188,63 @@
                     <a:xfrm>
                       <a:off x="0" y="0"/>
                       <a:ext cx="5731510" cy="3335655"/>
+                    </a:xfrm>
+                    <a:prstGeom prst="rect">
+                      <a:avLst/>
+                    </a:prstGeom>
+                  </pic:spPr>
+                </pic:pic>
+              </a:graphicData>
+            </a:graphic>
+          </wp:inline>
+        </w:drawing>
+      </w:r>
+    </w:p>
+    <w:p>
+      <w:pPr>
+        <w:ind w:left="-567" w:firstLine="567"/>
+        <w:rPr>
+          <w:lang w:val="en-US"/>
+        </w:rPr>
+      </w:pPr>
+    </w:p>
+    <w:p>
+      <w:pPr>
+        <w:ind w:left="-567" w:firstLine="567"/>
+        <w:rPr>
+          <w:lang w:val="en-US"/>
+        </w:rPr>
+      </w:pPr>
+      <w:r>
+        <w:rPr>
+          <w:lang w:val="en-US"/>
+        </w:rPr>
+        <w:lastRenderedPageBreak/>
+        <w:drawing>
+          <wp:inline distT="0" distB="0" distL="0" distR="0" wp14:anchorId="439C4C74" wp14:editId="4930213D">
+            <wp:extent cx="5731510" cy="7007860"/>
+            <wp:effectExtent l="0" t="0" r="0" b="2540"/>
+            <wp:docPr id="966728251" name="Picture 1"/>
+            <wp:cNvGraphicFramePr>
+              <a:graphicFrameLocks xmlns:a="http://schemas.openxmlformats.org/drawingml/2006/main" noChangeAspect="1"/>
+            </wp:cNvGraphicFramePr>
+            <a:graphic xmlns:a="http://schemas.openxmlformats.org/drawingml/2006/main">
+              <a:graphicData uri="http://schemas.openxmlformats.org/drawingml/2006/picture">
+                <pic:pic xmlns:pic="http://schemas.openxmlformats.org/drawingml/2006/picture">
+                  <pic:nvPicPr>
+                    <pic:cNvPr id="966728251" name=""/>
+                    <pic:cNvPicPr/>
+                  </pic:nvPicPr>
+                  <pic:blipFill>
+                    <a:blip r:embed="rId42"/>
+                    <a:stretch>
+                      <a:fillRect/>
+                    </a:stretch>
+                  </pic:blipFill>
+                  <pic:spPr>
+                    <a:xfrm>
+                      <a:off x="0" y="0"/>
+                      <a:ext cx="5731510" cy="7007860"/>
                     </a:xfrm>
                     <a:prstGeom prst="rect">
                       <a:avLst/>

</xml_diff>